<commit_message>
adjust spousal support logic (no need for USSO in Answer)
</commit_message>
<xml_diff>
--- a/docassemble/MLHDivorceAndCustody/data/templates/proof_of_service.docx
+++ b/docassemble/MLHDivorceAndCustody/data/templates/proof_of_service.docx
@@ -54,16 +54,7 @@
           <w:sz w:val="22"/>
           <w:szCs w:val="22"/>
         </w:rPr>
-        <w:t xml:space="preserve">{{ </w:t>
-      </w:r>
-      <w:proofErr w:type="spellStart"/>
-      <w:r>
-        <w:rPr>
-          <w:rFonts w:ascii="Times New Roman" w:hAnsi="Times New Roman" w:cs="Times New Roman"/>
-          <w:sz w:val="22"/>
-          <w:szCs w:val="22"/>
-        </w:rPr>
-        <w:t>the</w:t>
+        <w:t>{{ the</w:t>
       </w:r>
       <w:proofErr w:type="gramEnd"/>
       <w:r>
@@ -83,7 +74,6 @@
         </w:rPr>
         <w:t>court.number</w:t>
       </w:r>
-      <w:proofErr w:type="spellEnd"/>
       <w:proofErr w:type="gramEnd"/>
       <w:r>
         <w:rPr>
@@ -127,34 +117,16 @@
           <w:sz w:val="22"/>
           <w:szCs w:val="22"/>
         </w:rPr>
-        <w:t xml:space="preserve">{{ </w:t>
-      </w:r>
-      <w:proofErr w:type="spellStart"/>
-      <w:r>
-        <w:rPr>
-          <w:rFonts w:ascii="Times New Roman" w:hAnsi="Times New Roman" w:cs="Times New Roman"/>
-          <w:sz w:val="22"/>
-          <w:szCs w:val="22"/>
-        </w:rPr>
-        <w:t>county</w:t>
-      </w:r>
-      <w:proofErr w:type="gramEnd"/>
-      <w:r>
-        <w:rPr>
-          <w:rFonts w:ascii="Times New Roman" w:hAnsi="Times New Roman" w:cs="Times New Roman"/>
-          <w:sz w:val="22"/>
-          <w:szCs w:val="22"/>
-        </w:rPr>
-        <w:t>_choice</w:t>
-      </w:r>
-      <w:proofErr w:type="spellEnd"/>
-      <w:r>
-        <w:rPr>
-          <w:rFonts w:ascii="Times New Roman" w:hAnsi="Times New Roman" w:cs="Times New Roman"/>
-          <w:sz w:val="22"/>
-          <w:szCs w:val="22"/>
-        </w:rPr>
-        <w:t xml:space="preserve"> | </w:t>
+        <w:t>{{ county</w:t>
+      </w:r>
+      <w:proofErr w:type="gramEnd"/>
+      <w:r>
+        <w:rPr>
+          <w:rFonts w:ascii="Times New Roman" w:hAnsi="Times New Roman" w:cs="Times New Roman"/>
+          <w:sz w:val="22"/>
+          <w:szCs w:val="22"/>
+        </w:rPr>
+        <w:t xml:space="preserve">_choice | </w:t>
       </w:r>
       <w:proofErr w:type="gramStart"/>
       <w:r>
@@ -245,16 +217,7 @@
                 <w:sz w:val="22"/>
                 <w:szCs w:val="22"/>
               </w:rPr>
-              <w:t>[0].</w:t>
-            </w:r>
-            <w:proofErr w:type="spellStart"/>
-            <w:r>
-              <w:rPr>
-                <w:rFonts w:ascii="Times New Roman" w:hAnsi="Times New Roman" w:cs="Times New Roman"/>
-                <w:sz w:val="22"/>
-                <w:szCs w:val="22"/>
-              </w:rPr>
-              <w:t>name_</w:t>
+              <w:t>[0].name_</w:t>
             </w:r>
             <w:proofErr w:type="gramStart"/>
             <w:r>
@@ -263,16 +226,7 @@
                 <w:sz w:val="22"/>
                 <w:szCs w:val="22"/>
               </w:rPr>
-              <w:t>full</w:t>
-            </w:r>
-            <w:proofErr w:type="spellEnd"/>
-            <w:r>
-              <w:rPr>
-                <w:rFonts w:ascii="Times New Roman" w:hAnsi="Times New Roman" w:cs="Times New Roman"/>
-                <w:sz w:val="22"/>
-                <w:szCs w:val="22"/>
-              </w:rPr>
-              <w:t>()</w:t>
+              <w:t>full()</w:t>
             </w:r>
             <w:r>
               <w:rPr>
@@ -381,16 +335,7 @@
                 <w:sz w:val="22"/>
                 <w:szCs w:val="22"/>
               </w:rPr>
-              <w:t>[0].</w:t>
-            </w:r>
-            <w:proofErr w:type="spellStart"/>
-            <w:r>
-              <w:rPr>
-                <w:rFonts w:ascii="Times New Roman" w:hAnsi="Times New Roman" w:cs="Times New Roman"/>
-                <w:sz w:val="22"/>
-                <w:szCs w:val="22"/>
-              </w:rPr>
-              <w:t>name_</w:t>
+              <w:t>[0].name_</w:t>
             </w:r>
             <w:proofErr w:type="gramStart"/>
             <w:r>
@@ -399,16 +344,7 @@
                 <w:sz w:val="22"/>
                 <w:szCs w:val="22"/>
               </w:rPr>
-              <w:t>full</w:t>
-            </w:r>
-            <w:proofErr w:type="spellEnd"/>
-            <w:r>
-              <w:rPr>
-                <w:rFonts w:ascii="Times New Roman" w:hAnsi="Times New Roman" w:cs="Times New Roman"/>
-                <w:sz w:val="22"/>
-                <w:szCs w:val="22"/>
-              </w:rPr>
-              <w:t>() }</w:t>
+              <w:t>full() }</w:t>
             </w:r>
             <w:proofErr w:type="gramEnd"/>
             <w:r>
@@ -524,17 +460,7 @@
                 <w:szCs w:val="22"/>
                 <w:u w:val="single"/>
               </w:rPr>
-              <w:t xml:space="preserve">{{ </w:t>
-            </w:r>
-            <w:proofErr w:type="spellStart"/>
-            <w:r>
-              <w:rPr>
-                <w:rFonts w:ascii="Times New Roman" w:hAnsi="Times New Roman" w:cs="Times New Roman"/>
-                <w:sz w:val="22"/>
-                <w:szCs w:val="22"/>
-                <w:u w:val="single"/>
-              </w:rPr>
-              <w:t>docket</w:t>
+              <w:t>{{ docket</w:t>
             </w:r>
             <w:proofErr w:type="gramEnd"/>
             <w:r>
@@ -554,17 +480,7 @@
                 <w:szCs w:val="22"/>
                 <w:u w:val="single"/>
               </w:rPr>
-              <w:t>number</w:t>
-            </w:r>
-            <w:proofErr w:type="spellEnd"/>
-            <w:r>
-              <w:rPr>
-                <w:rFonts w:ascii="Times New Roman" w:hAnsi="Times New Roman" w:cs="Times New Roman"/>
-                <w:sz w:val="22"/>
-                <w:szCs w:val="22"/>
-                <w:u w:val="single"/>
-              </w:rPr>
-              <w:t xml:space="preserve"> }</w:t>
+              <w:t>number }</w:t>
             </w:r>
             <w:proofErr w:type="gramEnd"/>
             <w:r>
@@ -690,41 +606,21 @@
         </w:rPr>
         <w:t xml:space="preserve">{%p if </w:t>
       </w:r>
-      <w:proofErr w:type="spellStart"/>
-      <w:r>
-        <w:rPr>
-          <w:rFonts w:ascii="Times New Roman" w:hAnsi="Times New Roman" w:cs="Times New Roman"/>
-          <w:sz w:val="21"/>
-          <w:szCs w:val="21"/>
-        </w:rPr>
-        <w:t>user_ask_role</w:t>
-      </w:r>
-      <w:proofErr w:type="spellEnd"/>
-      <w:r>
-        <w:rPr>
-          <w:rFonts w:ascii="Times New Roman" w:hAnsi="Times New Roman" w:cs="Times New Roman"/>
-          <w:sz w:val="21"/>
-          <w:szCs w:val="21"/>
-        </w:rPr>
-        <w:t xml:space="preserve"> == “plaintiff” and </w:t>
-      </w:r>
-      <w:proofErr w:type="spellStart"/>
-      <w:r>
-        <w:rPr>
-          <w:rFonts w:ascii="Times New Roman" w:hAnsi="Times New Roman" w:cs="Times New Roman"/>
-          <w:sz w:val="21"/>
-          <w:szCs w:val="21"/>
-        </w:rPr>
-        <w:t>confidential_contact_info_yn</w:t>
-      </w:r>
-      <w:proofErr w:type="spellEnd"/>
-      <w:r>
-        <w:rPr>
-          <w:rFonts w:ascii="Times New Roman" w:hAnsi="Times New Roman" w:cs="Times New Roman"/>
-          <w:sz w:val="21"/>
-          <w:szCs w:val="21"/>
-        </w:rPr>
-        <w:t xml:space="preserve"> </w:t>
+      <w:r>
+        <w:rPr>
+          <w:rFonts w:ascii="Times New Roman" w:hAnsi="Times New Roman" w:cs="Times New Roman"/>
+          <w:sz w:val="21"/>
+          <w:szCs w:val="21"/>
+        </w:rPr>
+        <w:t xml:space="preserve">user_ask_role == “plaintiff” and </w:t>
+      </w:r>
+      <w:r>
+        <w:rPr>
+          <w:rFonts w:ascii="Times New Roman" w:hAnsi="Times New Roman" w:cs="Times New Roman"/>
+          <w:sz w:val="21"/>
+          <w:szCs w:val="21"/>
+        </w:rPr>
+        <w:t xml:space="preserve">confidential_contact_info_yn </w:t>
       </w:r>
       <w:r>
         <w:rPr>
@@ -816,16 +712,7 @@
           <w:sz w:val="21"/>
           <w:szCs w:val="21"/>
         </w:rPr>
-        <w:t>].</w:t>
-      </w:r>
-      <w:proofErr w:type="spellStart"/>
-      <w:r>
-        <w:rPr>
-          <w:rFonts w:ascii="Times New Roman" w:hAnsi="Times New Roman" w:cs="Times New Roman"/>
-          <w:sz w:val="21"/>
-          <w:szCs w:val="21"/>
-        </w:rPr>
-        <w:t>address</w:t>
+        <w:t>].address</w:t>
       </w:r>
       <w:proofErr w:type="gramEnd"/>
       <w:r>
@@ -843,16 +730,7 @@
           <w:sz w:val="21"/>
           <w:szCs w:val="21"/>
         </w:rPr>
-        <w:t>one</w:t>
-      </w:r>
-      <w:proofErr w:type="spellEnd"/>
-      <w:r>
-        <w:rPr>
-          <w:rFonts w:ascii="Times New Roman" w:hAnsi="Times New Roman" w:cs="Times New Roman"/>
-          <w:sz w:val="21"/>
-          <w:szCs w:val="21"/>
-        </w:rPr>
-        <w:t>() }</w:t>
+        <w:t>one() }</w:t>
       </w:r>
       <w:proofErr w:type="gramEnd"/>
       <w:r>
@@ -899,16 +777,7 @@
           <w:sz w:val="21"/>
           <w:szCs w:val="21"/>
         </w:rPr>
-        <w:t>].</w:t>
-      </w:r>
-      <w:proofErr w:type="spellStart"/>
-      <w:r>
-        <w:rPr>
-          <w:rFonts w:ascii="Times New Roman" w:hAnsi="Times New Roman" w:cs="Times New Roman"/>
-          <w:sz w:val="21"/>
-          <w:szCs w:val="21"/>
-        </w:rPr>
-        <w:t>address</w:t>
+        <w:t>].address</w:t>
       </w:r>
       <w:proofErr w:type="gramEnd"/>
       <w:r>
@@ -926,16 +795,7 @@
           <w:sz w:val="21"/>
           <w:szCs w:val="21"/>
         </w:rPr>
-        <w:t>two</w:t>
-      </w:r>
-      <w:proofErr w:type="spellEnd"/>
-      <w:r>
-        <w:rPr>
-          <w:rFonts w:ascii="Times New Roman" w:hAnsi="Times New Roman" w:cs="Times New Roman"/>
-          <w:sz w:val="21"/>
-          <w:szCs w:val="21"/>
-        </w:rPr>
-        <w:t>() }</w:t>
+        <w:t>two() }</w:t>
       </w:r>
       <w:proofErr w:type="gramEnd"/>
       <w:r>
@@ -981,18 +841,8 @@
           <w:sz w:val="21"/>
           <w:szCs w:val="21"/>
         </w:rPr>
-        <w:t>0].</w:t>
-      </w:r>
-      <w:proofErr w:type="spellStart"/>
-      <w:r>
-        <w:rPr>
-          <w:rFonts w:ascii="Times New Roman" w:hAnsi="Times New Roman" w:cs="Times New Roman"/>
-          <w:sz w:val="21"/>
-          <w:szCs w:val="21"/>
-        </w:rPr>
-        <w:t>no_phone_number</w:t>
-      </w:r>
-      <w:proofErr w:type="spellEnd"/>
+        <w:t>0].no_phone_number</w:t>
+      </w:r>
       <w:r>
         <w:rPr>
           <w:rFonts w:ascii="Times New Roman" w:hAnsi="Times New Roman" w:cs="Times New Roman"/>
@@ -1025,25 +875,7 @@
           <w:sz w:val="21"/>
           <w:szCs w:val="21"/>
         </w:rPr>
-        <w:t xml:space="preserve">% if </w:t>
-      </w:r>
-      <w:proofErr w:type="spellStart"/>
-      <w:r>
-        <w:rPr>
-          <w:rFonts w:ascii="Times New Roman" w:hAnsi="Times New Roman" w:cs="Times New Roman"/>
-          <w:sz w:val="21"/>
-          <w:szCs w:val="21"/>
-        </w:rPr>
-        <w:t>user_ask_role</w:t>
-      </w:r>
-      <w:proofErr w:type="spellEnd"/>
-      <w:r>
-        <w:rPr>
-          <w:rFonts w:ascii="Times New Roman" w:hAnsi="Times New Roman" w:cs="Times New Roman"/>
-          <w:sz w:val="21"/>
-          <w:szCs w:val="21"/>
-        </w:rPr>
-        <w:t xml:space="preserve"> == “plaintiff” </w:t>
+        <w:t xml:space="preserve">% if user_ask_role == “plaintiff” </w:t>
       </w:r>
       <w:proofErr w:type="gramStart"/>
       <w:r>
@@ -1168,7 +1000,6 @@
         </w:rPr>
         <w:t xml:space="preserve">{{ </w:t>
       </w:r>
-      <w:proofErr w:type="spellStart"/>
       <w:r>
         <w:rPr>
           <w:rFonts w:ascii="Times New Roman" w:hAnsi="Times New Roman" w:cs="Times New Roman"/>
@@ -1184,16 +1015,7 @@
           <w:sz w:val="21"/>
           <w:szCs w:val="21"/>
         </w:rPr>
-        <w:t>_number_formatted</w:t>
-      </w:r>
-      <w:proofErr w:type="spellEnd"/>
-      <w:r>
-        <w:rPr>
-          <w:rFonts w:ascii="Times New Roman" w:hAnsi="Times New Roman" w:cs="Times New Roman"/>
-          <w:sz w:val="21"/>
-          <w:szCs w:val="21"/>
-        </w:rPr>
-        <w:t>(</w:t>
+        <w:t>_number_formatted(</w:t>
       </w:r>
       <w:r>
         <w:rPr>
@@ -1218,16 +1040,7 @@
           <w:sz w:val="21"/>
           <w:szCs w:val="21"/>
         </w:rPr>
-        <w:t>].</w:t>
-      </w:r>
-      <w:proofErr w:type="spellStart"/>
-      <w:r>
-        <w:rPr>
-          <w:rFonts w:ascii="Times New Roman" w:hAnsi="Times New Roman" w:cs="Times New Roman"/>
-          <w:sz w:val="21"/>
-          <w:szCs w:val="21"/>
-        </w:rPr>
-        <w:t>phone</w:t>
+        <w:t>].phone</w:t>
       </w:r>
       <w:proofErr w:type="gramEnd"/>
       <w:r>
@@ -1238,7 +1051,6 @@
         </w:rPr>
         <w:t>_number</w:t>
       </w:r>
-      <w:proofErr w:type="spellEnd"/>
       <w:proofErr w:type="gramStart"/>
       <w:r>
         <w:rPr>
@@ -1327,41 +1139,21 @@
         </w:rPr>
         <w:t xml:space="preserve">{%p if </w:t>
       </w:r>
-      <w:proofErr w:type="spellStart"/>
-      <w:r>
-        <w:rPr>
-          <w:rFonts w:ascii="Times New Roman" w:hAnsi="Times New Roman" w:cs="Times New Roman"/>
-          <w:sz w:val="21"/>
-          <w:szCs w:val="21"/>
-        </w:rPr>
-        <w:t>user_ask_role</w:t>
-      </w:r>
-      <w:proofErr w:type="spellEnd"/>
-      <w:r>
-        <w:rPr>
-          <w:rFonts w:ascii="Times New Roman" w:hAnsi="Times New Roman" w:cs="Times New Roman"/>
-          <w:sz w:val="21"/>
-          <w:szCs w:val="21"/>
-        </w:rPr>
-        <w:t xml:space="preserve"> == “defendant” and </w:t>
-      </w:r>
-      <w:proofErr w:type="spellStart"/>
-      <w:r>
-        <w:rPr>
-          <w:rFonts w:ascii="Times New Roman" w:hAnsi="Times New Roman" w:cs="Times New Roman"/>
-          <w:sz w:val="21"/>
-          <w:szCs w:val="21"/>
-        </w:rPr>
-        <w:t>confidential_contact_info_yn</w:t>
-      </w:r>
-      <w:proofErr w:type="spellEnd"/>
-      <w:r>
-        <w:rPr>
-          <w:rFonts w:ascii="Times New Roman" w:hAnsi="Times New Roman" w:cs="Times New Roman"/>
-          <w:sz w:val="21"/>
-          <w:szCs w:val="21"/>
-        </w:rPr>
-        <w:t xml:space="preserve"> %}</w:t>
+      <w:r>
+        <w:rPr>
+          <w:rFonts w:ascii="Times New Roman" w:hAnsi="Times New Roman" w:cs="Times New Roman"/>
+          <w:sz w:val="21"/>
+          <w:szCs w:val="21"/>
+        </w:rPr>
+        <w:t xml:space="preserve">user_ask_role == “defendant” and </w:t>
+      </w:r>
+      <w:r>
+        <w:rPr>
+          <w:rFonts w:ascii="Times New Roman" w:hAnsi="Times New Roman" w:cs="Times New Roman"/>
+          <w:sz w:val="21"/>
+          <w:szCs w:val="21"/>
+        </w:rPr>
+        <w:t>confidential_contact_info_yn %}</w:t>
       </w:r>
     </w:p>
     <w:p>
@@ -1445,16 +1237,7 @@
           <w:sz w:val="21"/>
           <w:szCs w:val="21"/>
         </w:rPr>
-        <w:t>].</w:t>
-      </w:r>
-      <w:proofErr w:type="spellStart"/>
-      <w:r>
-        <w:rPr>
-          <w:rFonts w:ascii="Times New Roman" w:hAnsi="Times New Roman" w:cs="Times New Roman"/>
-          <w:sz w:val="21"/>
-          <w:szCs w:val="21"/>
-        </w:rPr>
-        <w:t>address</w:t>
+        <w:t>].address</w:t>
       </w:r>
       <w:proofErr w:type="gramEnd"/>
       <w:r>
@@ -1472,16 +1255,7 @@
           <w:sz w:val="21"/>
           <w:szCs w:val="21"/>
         </w:rPr>
-        <w:t>one</w:t>
-      </w:r>
-      <w:proofErr w:type="spellEnd"/>
-      <w:r>
-        <w:rPr>
-          <w:rFonts w:ascii="Times New Roman" w:hAnsi="Times New Roman" w:cs="Times New Roman"/>
-          <w:sz w:val="21"/>
-          <w:szCs w:val="21"/>
-        </w:rPr>
-        <w:t>() }</w:t>
+        <w:t>one() }</w:t>
       </w:r>
       <w:proofErr w:type="gramEnd"/>
       <w:r>
@@ -1528,16 +1302,7 @@
           <w:sz w:val="21"/>
           <w:szCs w:val="21"/>
         </w:rPr>
-        <w:t>].</w:t>
-      </w:r>
-      <w:proofErr w:type="spellStart"/>
-      <w:r>
-        <w:rPr>
-          <w:rFonts w:ascii="Times New Roman" w:hAnsi="Times New Roman" w:cs="Times New Roman"/>
-          <w:sz w:val="21"/>
-          <w:szCs w:val="21"/>
-        </w:rPr>
-        <w:t>address</w:t>
+        <w:t>].address</w:t>
       </w:r>
       <w:proofErr w:type="gramEnd"/>
       <w:r>
@@ -1555,16 +1320,7 @@
           <w:sz w:val="21"/>
           <w:szCs w:val="21"/>
         </w:rPr>
-        <w:t>two</w:t>
-      </w:r>
-      <w:proofErr w:type="spellEnd"/>
-      <w:r>
-        <w:rPr>
-          <w:rFonts w:ascii="Times New Roman" w:hAnsi="Times New Roman" w:cs="Times New Roman"/>
-          <w:sz w:val="21"/>
-          <w:szCs w:val="21"/>
-        </w:rPr>
-        <w:t>() }</w:t>
+        <w:t>two() }</w:t>
       </w:r>
       <w:proofErr w:type="gramEnd"/>
       <w:r>
@@ -1619,18 +1375,8 @@
           <w:sz w:val="21"/>
           <w:szCs w:val="21"/>
         </w:rPr>
-        <w:t>0].</w:t>
-      </w:r>
-      <w:proofErr w:type="spellStart"/>
-      <w:r>
-        <w:rPr>
-          <w:rFonts w:ascii="Times New Roman" w:hAnsi="Times New Roman" w:cs="Times New Roman"/>
-          <w:sz w:val="21"/>
-          <w:szCs w:val="21"/>
-        </w:rPr>
-        <w:t>no_phone_number</w:t>
-      </w:r>
-      <w:proofErr w:type="spellEnd"/>
+        <w:t>0].no_phone_number</w:t>
+      </w:r>
       <w:r>
         <w:rPr>
           <w:rFonts w:ascii="Times New Roman" w:hAnsi="Times New Roman" w:cs="Times New Roman"/>
@@ -1663,25 +1409,7 @@
           <w:sz w:val="21"/>
           <w:szCs w:val="21"/>
         </w:rPr>
-        <w:t xml:space="preserve">% if </w:t>
-      </w:r>
-      <w:proofErr w:type="spellStart"/>
-      <w:r>
-        <w:rPr>
-          <w:rFonts w:ascii="Times New Roman" w:hAnsi="Times New Roman" w:cs="Times New Roman"/>
-          <w:sz w:val="21"/>
-          <w:szCs w:val="21"/>
-        </w:rPr>
-        <w:t>user_ask_role</w:t>
-      </w:r>
-      <w:proofErr w:type="spellEnd"/>
-      <w:r>
-        <w:rPr>
-          <w:rFonts w:ascii="Times New Roman" w:hAnsi="Times New Roman" w:cs="Times New Roman"/>
-          <w:sz w:val="21"/>
-          <w:szCs w:val="21"/>
-        </w:rPr>
-        <w:t xml:space="preserve"> == “defendant” </w:t>
+        <w:t xml:space="preserve">% if user_ask_role == “defendant” </w:t>
       </w:r>
       <w:proofErr w:type="gramStart"/>
       <w:r>
@@ -1798,7 +1526,6 @@
         </w:rPr>
         <w:t xml:space="preserve">{{ </w:t>
       </w:r>
-      <w:proofErr w:type="spellStart"/>
       <w:r>
         <w:rPr>
           <w:rFonts w:ascii="Times New Roman" w:hAnsi="Times New Roman" w:cs="Times New Roman"/>
@@ -1814,16 +1541,7 @@
           <w:sz w:val="21"/>
           <w:szCs w:val="21"/>
         </w:rPr>
-        <w:t>_number_formatted</w:t>
-      </w:r>
-      <w:proofErr w:type="spellEnd"/>
-      <w:r>
-        <w:rPr>
-          <w:rFonts w:ascii="Times New Roman" w:hAnsi="Times New Roman" w:cs="Times New Roman"/>
-          <w:sz w:val="21"/>
-          <w:szCs w:val="21"/>
-        </w:rPr>
-        <w:t>(</w:t>
+        <w:t>_number_formatted(</w:t>
       </w:r>
       <w:r>
         <w:rPr>
@@ -1848,16 +1566,7 @@
           <w:sz w:val="21"/>
           <w:szCs w:val="21"/>
         </w:rPr>
-        <w:t>].</w:t>
-      </w:r>
-      <w:proofErr w:type="spellStart"/>
-      <w:r>
-        <w:rPr>
-          <w:rFonts w:ascii="Times New Roman" w:hAnsi="Times New Roman" w:cs="Times New Roman"/>
-          <w:sz w:val="21"/>
-          <w:szCs w:val="21"/>
-        </w:rPr>
-        <w:t>phone</w:t>
+        <w:t>].phone</w:t>
       </w:r>
       <w:proofErr w:type="gramEnd"/>
       <w:r>
@@ -1868,7 +1577,6 @@
         </w:rPr>
         <w:t>_number</w:t>
       </w:r>
-      <w:proofErr w:type="spellEnd"/>
       <w:proofErr w:type="gramStart"/>
       <w:r>
         <w:rPr>
@@ -1993,27 +1701,7 @@
           <w:szCs w:val="22"/>
           <w:highlight w:val="yellow"/>
         </w:rPr>
-        <w:t xml:space="preserve">{% if </w:t>
-      </w:r>
-      <w:proofErr w:type="spellStart"/>
-      <w:r>
-        <w:rPr>
-          <w:rFonts w:ascii="Times New Roman" w:hAnsi="Times New Roman" w:cs="Times New Roman"/>
-          <w:sz w:val="22"/>
-          <w:szCs w:val="22"/>
-          <w:highlight w:val="yellow"/>
-        </w:rPr>
-        <w:t>user_ask_role</w:t>
-      </w:r>
-      <w:proofErr w:type="spellEnd"/>
-      <w:r>
-        <w:rPr>
-          <w:rFonts w:ascii="Times New Roman" w:hAnsi="Times New Roman" w:cs="Times New Roman"/>
-          <w:sz w:val="22"/>
-          <w:szCs w:val="22"/>
-          <w:highlight w:val="yellow"/>
-        </w:rPr>
-        <w:t xml:space="preserve"> == “plaintiff” </w:t>
+        <w:t xml:space="preserve">{% if user_ask_role == “plaintiff” </w:t>
       </w:r>
       <w:proofErr w:type="gramStart"/>
       <w:r>
@@ -2364,9 +2052,8 @@
           <w:szCs w:val="22"/>
           <w:highlight w:val="cyan"/>
         </w:rPr>
-        <w:t xml:space="preserve"> if </w:t>
-      </w:r>
-      <w:proofErr w:type="spellStart"/>
+        <w:t xml:space="preserve"> if tool</w:t>
+      </w:r>
       <w:r>
         <w:rPr>
           <w:rFonts w:ascii="Times New Roman" w:hAnsi="Times New Roman" w:cs="Times New Roman"/>
@@ -2374,7 +2061,7 @@
           <w:szCs w:val="22"/>
           <w:highlight w:val="cyan"/>
         </w:rPr>
-        <w:t>tool</w:t>
+        <w:t>_ID</w:t>
       </w:r>
       <w:r>
         <w:rPr>
@@ -2383,9 +2070,8 @@
           <w:szCs w:val="22"/>
           <w:highlight w:val="cyan"/>
         </w:rPr>
-        <w:t>_ID</w:t>
-      </w:r>
-      <w:proofErr w:type="spellEnd"/>
+        <w:t xml:space="preserve"> == </w:t>
+      </w:r>
       <w:r>
         <w:rPr>
           <w:rFonts w:ascii="Times New Roman" w:hAnsi="Times New Roman" w:cs="Times New Roman"/>
@@ -2393,36 +2079,7 @@
           <w:szCs w:val="22"/>
           <w:highlight w:val="cyan"/>
         </w:rPr>
-        <w:t xml:space="preserve"> == </w:t>
-      </w:r>
-      <w:r>
-        <w:rPr>
-          <w:rFonts w:ascii="Times New Roman" w:hAnsi="Times New Roman" w:cs="Times New Roman"/>
-          <w:sz w:val="22"/>
-          <w:szCs w:val="22"/>
-          <w:highlight w:val="cyan"/>
-        </w:rPr>
-        <w:t>“</w:t>
-      </w:r>
-      <w:proofErr w:type="spellStart"/>
-      <w:r>
-        <w:rPr>
-          <w:rFonts w:ascii="Times New Roman" w:hAnsi="Times New Roman" w:cs="Times New Roman"/>
-          <w:sz w:val="22"/>
-          <w:szCs w:val="22"/>
-          <w:highlight w:val="cyan"/>
-        </w:rPr>
-        <w:t>custody_complaint</w:t>
-      </w:r>
-      <w:proofErr w:type="spellEnd"/>
-      <w:r>
-        <w:rPr>
-          <w:rFonts w:ascii="Times New Roman" w:hAnsi="Times New Roman" w:cs="Times New Roman"/>
-          <w:sz w:val="22"/>
-          <w:szCs w:val="22"/>
-          <w:highlight w:val="cyan"/>
-        </w:rPr>
-        <w:t>”</w:t>
+        <w:t>“custody_complaint”</w:t>
       </w:r>
       <w:r>
         <w:rPr>
@@ -2660,7 +2317,6 @@
         </w:rPr>
         <w:t xml:space="preserve"> </w:t>
       </w:r>
-      <w:proofErr w:type="spellStart"/>
       <w:r>
         <w:rPr>
           <w:rFonts w:ascii="Times New Roman" w:hAnsi="Times New Roman" w:cs="Times New Roman"/>
@@ -2679,7 +2335,6 @@
         </w:rPr>
         <w:t>if</w:t>
       </w:r>
-      <w:proofErr w:type="spellEnd"/>
       <w:r>
         <w:rPr>
           <w:rFonts w:ascii="Times New Roman" w:hAnsi="Times New Roman" w:cs="Times New Roman"/>
@@ -2687,39 +2342,8 @@
           <w:szCs w:val="22"/>
           <w:highlight w:val="cyan"/>
         </w:rPr>
-        <w:t xml:space="preserve"> </w:t>
-      </w:r>
-      <w:proofErr w:type="spellStart"/>
-      <w:r>
-        <w:rPr>
-          <w:rFonts w:ascii="Times New Roman" w:hAnsi="Times New Roman" w:cs="Times New Roman"/>
-          <w:sz w:val="22"/>
-          <w:szCs w:val="22"/>
-          <w:highlight w:val="cyan"/>
-        </w:rPr>
-        <w:t>tool_ID</w:t>
-      </w:r>
-      <w:proofErr w:type="spellEnd"/>
-      <w:r>
-        <w:rPr>
-          <w:rFonts w:ascii="Times New Roman" w:hAnsi="Times New Roman" w:cs="Times New Roman"/>
-          <w:sz w:val="22"/>
-          <w:szCs w:val="22"/>
-          <w:highlight w:val="cyan"/>
-        </w:rPr>
-        <w:t xml:space="preserve"> == “</w:t>
-      </w:r>
-      <w:proofErr w:type="spellStart"/>
-      <w:r>
-        <w:rPr>
-          <w:rFonts w:ascii="Times New Roman" w:hAnsi="Times New Roman" w:cs="Times New Roman"/>
-          <w:sz w:val="22"/>
-          <w:szCs w:val="22"/>
-          <w:highlight w:val="cyan"/>
-        </w:rPr>
-        <w:t>custody_answer</w:t>
-      </w:r>
-      <w:proofErr w:type="spellEnd"/>
+        <w:t xml:space="preserve"> tool_ID == “custody_answer</w:t>
+      </w:r>
       <w:r>
         <w:rPr>
           <w:rFonts w:ascii="Times New Roman" w:hAnsi="Times New Roman" w:cs="Times New Roman"/>
@@ -2944,7 +2568,6 @@
         </w:rPr>
         <w:t xml:space="preserve"> </w:t>
       </w:r>
-      <w:proofErr w:type="spellStart"/>
       <w:r>
         <w:rPr>
           <w:rFonts w:ascii="Times New Roman" w:hAnsi="Times New Roman" w:cs="Times New Roman"/>
@@ -2963,7 +2586,6 @@
         </w:rPr>
         <w:t>if</w:t>
       </w:r>
-      <w:proofErr w:type="spellEnd"/>
       <w:r>
         <w:rPr>
           <w:rFonts w:ascii="Times New Roman" w:hAnsi="Times New Roman" w:cs="Times New Roman"/>
@@ -2971,9 +2593,330 @@
           <w:szCs w:val="22"/>
           <w:highlight w:val="cyan"/>
         </w:rPr>
+        <w:t xml:space="preserve"> tool_ID == “divorce_answer</w:t>
+      </w:r>
+      <w:r>
+        <w:rPr>
+          <w:rFonts w:ascii="Times New Roman" w:hAnsi="Times New Roman" w:cs="Times New Roman"/>
+          <w:sz w:val="22"/>
+          <w:szCs w:val="22"/>
+          <w:highlight w:val="cyan"/>
+        </w:rPr>
+        <w:t>”</w:t>
+      </w:r>
+      <w:r>
+        <w:rPr>
+          <w:rFonts w:ascii="Times New Roman" w:hAnsi="Times New Roman" w:cs="Times New Roman"/>
+          <w:sz w:val="22"/>
+          <w:szCs w:val="22"/>
+          <w:highlight w:val="cyan"/>
+        </w:rPr>
+        <w:t xml:space="preserve"> %}</w:t>
+      </w:r>
+    </w:p>
+    <w:p>
+      <w:pPr>
+        <w:spacing w:after="0" w:line="276" w:lineRule="auto"/>
+        <w:rPr>
+          <w:rFonts w:ascii="Times New Roman" w:hAnsi="Times New Roman" w:cs="Times New Roman"/>
+          <w:sz w:val="22"/>
+          <w:szCs w:val="22"/>
+        </w:rPr>
+      </w:pPr>
+      <w:proofErr w:type="gramStart"/>
+      <w:r>
+        <w:rPr>
+          <w:rFonts w:ascii="Times New Roman" w:hAnsi="Times New Roman" w:cs="Times New Roman"/>
+          <w:sz w:val="22"/>
+          <w:szCs w:val="22"/>
+        </w:rPr>
+        <w:t>[ ]</w:t>
+      </w:r>
+      <w:proofErr w:type="gramEnd"/>
+      <w:r>
+        <w:rPr>
+          <w:rFonts w:ascii="Times New Roman" w:hAnsi="Times New Roman" w:cs="Times New Roman"/>
+          <w:sz w:val="22"/>
+          <w:szCs w:val="22"/>
+        </w:rPr>
         <w:t xml:space="preserve"> </w:t>
       </w:r>
-      <w:proofErr w:type="spellStart"/>
+      <w:r>
+        <w:rPr>
+          <w:rFonts w:ascii="Times New Roman" w:hAnsi="Times New Roman" w:cs="Times New Roman"/>
+          <w:sz w:val="22"/>
+          <w:szCs w:val="22"/>
+        </w:rPr>
+        <w:t xml:space="preserve">Answer to Complaint </w:t>
+      </w:r>
+      <w:proofErr w:type="gramStart"/>
+      <w:r>
+        <w:rPr>
+          <w:rFonts w:ascii="Times New Roman" w:hAnsi="Times New Roman" w:cs="Times New Roman"/>
+          <w:sz w:val="22"/>
+          <w:szCs w:val="22"/>
+        </w:rPr>
+        <w:t>for</w:t>
+      </w:r>
+      <w:proofErr w:type="gramEnd"/>
+      <w:r>
+        <w:rPr>
+          <w:rFonts w:ascii="Times New Roman" w:hAnsi="Times New Roman" w:cs="Times New Roman"/>
+          <w:sz w:val="22"/>
+          <w:szCs w:val="22"/>
+        </w:rPr>
+        <w:t xml:space="preserve"> Divorce</w:t>
+      </w:r>
+    </w:p>
+    <w:p>
+      <w:pPr>
+        <w:spacing w:after="0" w:line="276" w:lineRule="auto"/>
+        <w:rPr>
+          <w:rFonts w:ascii="Times New Roman" w:hAnsi="Times New Roman" w:cs="Times New Roman"/>
+          <w:sz w:val="22"/>
+          <w:szCs w:val="22"/>
+        </w:rPr>
+      </w:pPr>
+      <w:proofErr w:type="gramStart"/>
+      <w:r>
+        <w:rPr>
+          <w:rFonts w:ascii="Times New Roman" w:hAnsi="Times New Roman" w:cs="Times New Roman"/>
+          <w:sz w:val="22"/>
+          <w:szCs w:val="22"/>
+        </w:rPr>
+        <w:t>[ ]</w:t>
+      </w:r>
+      <w:proofErr w:type="gramEnd"/>
+      <w:r>
+        <w:rPr>
+          <w:rFonts w:ascii="Times New Roman" w:hAnsi="Times New Roman" w:cs="Times New Roman"/>
+          <w:sz w:val="22"/>
+          <w:szCs w:val="22"/>
+        </w:rPr>
+        <w:t xml:space="preserve"> </w:t>
+      </w:r>
+      <w:r>
+        <w:rPr>
+          <w:rFonts w:ascii="Times New Roman" w:hAnsi="Times New Roman" w:cs="Times New Roman"/>
+          <w:sz w:val="22"/>
+          <w:szCs w:val="22"/>
+        </w:rPr>
+        <w:t>Counterclaim for Divorce</w:t>
+      </w:r>
+    </w:p>
+    <w:p>
+      <w:pPr>
+        <w:spacing w:after="0" w:line="240" w:lineRule="auto"/>
+        <w:rPr>
+          <w:rFonts w:ascii="Times New Roman" w:hAnsi="Times New Roman" w:cs="Times New Roman"/>
+          <w:sz w:val="22"/>
+          <w:szCs w:val="22"/>
+        </w:rPr>
+      </w:pPr>
+      <w:r>
+        <w:rPr>
+          <w:rFonts w:ascii="Times New Roman" w:hAnsi="Times New Roman" w:cs="Times New Roman"/>
+          <w:sz w:val="22"/>
+          <w:szCs w:val="22"/>
+          <w:highlight w:val="yellow"/>
+        </w:rPr>
+        <w:t xml:space="preserve">{%p if </w:t>
+      </w:r>
+      <w:r>
+        <w:rPr>
+          <w:rFonts w:ascii="Times New Roman" w:hAnsi="Times New Roman" w:cs="Times New Roman"/>
+          <w:sz w:val="22"/>
+          <w:szCs w:val="22"/>
+          <w:highlight w:val="yellow"/>
+        </w:rPr>
+        <w:t>complaint_type == “with_children”</w:t>
+      </w:r>
+      <w:r>
+        <w:rPr>
+          <w:rFonts w:ascii="Times New Roman" w:hAnsi="Times New Roman" w:cs="Times New Roman"/>
+          <w:sz w:val="22"/>
+          <w:szCs w:val="22"/>
+          <w:highlight w:val="yellow"/>
+        </w:rPr>
+        <w:t xml:space="preserve"> </w:t>
+      </w:r>
+      <w:r>
+        <w:rPr>
+          <w:rFonts w:ascii="Times New Roman" w:hAnsi="Times New Roman" w:cs="Times New Roman"/>
+          <w:sz w:val="22"/>
+          <w:szCs w:val="22"/>
+          <w:highlight w:val="yellow"/>
+        </w:rPr>
+        <w:t>%}</w:t>
+      </w:r>
+    </w:p>
+    <w:p>
+      <w:pPr>
+        <w:spacing w:after="0" w:line="276" w:lineRule="auto"/>
+        <w:rPr>
+          <w:rFonts w:ascii="Times New Roman" w:hAnsi="Times New Roman" w:cs="Times New Roman"/>
+          <w:sz w:val="22"/>
+          <w:szCs w:val="22"/>
+        </w:rPr>
+      </w:pPr>
+      <w:proofErr w:type="gramStart"/>
+      <w:r>
+        <w:rPr>
+          <w:rFonts w:ascii="Times New Roman" w:hAnsi="Times New Roman" w:cs="Times New Roman"/>
+          <w:sz w:val="22"/>
+          <w:szCs w:val="22"/>
+        </w:rPr>
+        <w:t>[ ]</w:t>
+      </w:r>
+      <w:proofErr w:type="gramEnd"/>
+      <w:r>
+        <w:rPr>
+          <w:rFonts w:ascii="Times New Roman" w:hAnsi="Times New Roman" w:cs="Times New Roman"/>
+          <w:sz w:val="22"/>
+          <w:szCs w:val="22"/>
+        </w:rPr>
+        <w:t xml:space="preserve"> </w:t>
+      </w:r>
+      <w:r>
+        <w:rPr>
+          <w:rFonts w:ascii="Times New Roman" w:hAnsi="Times New Roman" w:cs="Times New Roman"/>
+          <w:sz w:val="22"/>
+          <w:szCs w:val="22"/>
+        </w:rPr>
+        <w:t>Uniform Child Custody Jurisdiction Enforcement Act Affidavit</w:t>
+      </w:r>
+    </w:p>
+    <w:p>
+      <w:pPr>
+        <w:spacing w:after="0" w:line="276" w:lineRule="auto"/>
+        <w:rPr>
+          <w:rFonts w:ascii="Times New Roman" w:hAnsi="Times New Roman" w:cs="Times New Roman"/>
+          <w:sz w:val="22"/>
+          <w:szCs w:val="22"/>
+        </w:rPr>
+      </w:pPr>
+      <w:proofErr w:type="gramStart"/>
+      <w:r>
+        <w:rPr>
+          <w:rFonts w:ascii="Times New Roman" w:hAnsi="Times New Roman" w:cs="Times New Roman"/>
+          <w:sz w:val="22"/>
+          <w:szCs w:val="22"/>
+        </w:rPr>
+        <w:t>[ ]</w:t>
+      </w:r>
+      <w:proofErr w:type="gramEnd"/>
+      <w:r>
+        <w:rPr>
+          <w:rFonts w:ascii="Times New Roman" w:hAnsi="Times New Roman" w:cs="Times New Roman"/>
+          <w:sz w:val="22"/>
+          <w:szCs w:val="22"/>
+        </w:rPr>
+        <w:t xml:space="preserve"> Verified Statement </w:t>
+      </w:r>
+    </w:p>
+    <w:p>
+      <w:pPr>
+        <w:spacing w:after="0" w:line="276" w:lineRule="auto"/>
+        <w:rPr>
+          <w:rFonts w:ascii="Times New Roman" w:hAnsi="Times New Roman" w:cs="Times New Roman"/>
+          <w:sz w:val="22"/>
+          <w:szCs w:val="22"/>
+        </w:rPr>
+      </w:pPr>
+      <w:proofErr w:type="gramStart"/>
+      <w:r>
+        <w:rPr>
+          <w:rFonts w:ascii="Times New Roman" w:hAnsi="Times New Roman" w:cs="Times New Roman"/>
+          <w:sz w:val="22"/>
+          <w:szCs w:val="22"/>
+        </w:rPr>
+        <w:t>[ ]</w:t>
+      </w:r>
+      <w:proofErr w:type="gramEnd"/>
+      <w:r>
+        <w:rPr>
+          <w:rFonts w:ascii="Times New Roman" w:hAnsi="Times New Roman" w:cs="Times New Roman"/>
+          <w:sz w:val="22"/>
+          <w:szCs w:val="22"/>
+        </w:rPr>
+        <w:t xml:space="preserve"> </w:t>
+      </w:r>
+      <w:r>
+        <w:rPr>
+          <w:rFonts w:ascii="Times New Roman" w:hAnsi="Times New Roman" w:cs="Times New Roman"/>
+          <w:sz w:val="22"/>
+          <w:szCs w:val="22"/>
+        </w:rPr>
+        <w:t>Application for IV-D Services</w:t>
+      </w:r>
+    </w:p>
+    <w:p>
+      <w:pPr>
+        <w:spacing w:after="0" w:line="240" w:lineRule="auto"/>
+        <w:rPr>
+          <w:rFonts w:ascii="Times New Roman" w:hAnsi="Times New Roman" w:cs="Times New Roman"/>
+          <w:sz w:val="22"/>
+          <w:szCs w:val="22"/>
+        </w:rPr>
+      </w:pPr>
+      <w:r>
+        <w:rPr>
+          <w:rFonts w:ascii="Times New Roman" w:hAnsi="Times New Roman" w:cs="Times New Roman"/>
+          <w:sz w:val="22"/>
+          <w:szCs w:val="22"/>
+          <w:highlight w:val="yellow"/>
+        </w:rPr>
+        <w:t xml:space="preserve">{%p </w:t>
+      </w:r>
+      <w:proofErr w:type="gramStart"/>
+      <w:r>
+        <w:rPr>
+          <w:rFonts w:ascii="Times New Roman" w:hAnsi="Times New Roman" w:cs="Times New Roman"/>
+          <w:sz w:val="22"/>
+          <w:szCs w:val="22"/>
+          <w:highlight w:val="yellow"/>
+        </w:rPr>
+        <w:t>endif %}</w:t>
+      </w:r>
+      <w:proofErr w:type="gramEnd"/>
+    </w:p>
+    <w:p>
+      <w:pPr>
+        <w:spacing w:after="0" w:line="276" w:lineRule="auto"/>
+        <w:rPr>
+          <w:rFonts w:ascii="Times New Roman" w:hAnsi="Times New Roman" w:cs="Times New Roman"/>
+          <w:sz w:val="22"/>
+          <w:szCs w:val="22"/>
+        </w:rPr>
+      </w:pPr>
+      <w:proofErr w:type="gramStart"/>
+      <w:r>
+        <w:rPr>
+          <w:rFonts w:ascii="Times New Roman" w:hAnsi="Times New Roman" w:cs="Times New Roman"/>
+          <w:sz w:val="22"/>
+          <w:szCs w:val="22"/>
+        </w:rPr>
+        <w:t>[ ]</w:t>
+      </w:r>
+      <w:proofErr w:type="gramEnd"/>
+      <w:r>
+        <w:rPr>
+          <w:rFonts w:ascii="Times New Roman" w:hAnsi="Times New Roman" w:cs="Times New Roman"/>
+          <w:sz w:val="22"/>
+          <w:szCs w:val="22"/>
+        </w:rPr>
+        <w:t xml:space="preserve"> Domestic Relations Verified Financial Information Form</w:t>
+      </w:r>
+    </w:p>
+    <w:p>
+      <w:pPr>
+        <w:spacing w:after="0" w:line="240" w:lineRule="auto"/>
+        <w:rPr>
+          <w:rFonts w:ascii="Times New Roman" w:hAnsi="Times New Roman" w:cs="Times New Roman"/>
+          <w:sz w:val="22"/>
+          <w:szCs w:val="22"/>
+        </w:rPr>
+      </w:pPr>
       <w:r>
         <w:rPr>
           <w:rFonts w:ascii="Times New Roman" w:hAnsi="Times New Roman" w:cs="Times New Roman"/>
@@ -2981,9 +2924,8 @@
           <w:szCs w:val="22"/>
           <w:highlight w:val="cyan"/>
         </w:rPr>
-        <w:t>tool_ID</w:t>
-      </w:r>
-      <w:proofErr w:type="spellEnd"/>
+        <w:t>{%</w:t>
+      </w:r>
       <w:r>
         <w:rPr>
           <w:rFonts w:ascii="Times New Roman" w:hAnsi="Times New Roman" w:cs="Times New Roman"/>
@@ -2991,9 +2933,8 @@
           <w:szCs w:val="22"/>
           <w:highlight w:val="cyan"/>
         </w:rPr>
-        <w:t xml:space="preserve"> == “</w:t>
-      </w:r>
-      <w:proofErr w:type="spellStart"/>
+        <w:t>p</w:t>
+      </w:r>
       <w:r>
         <w:rPr>
           <w:rFonts w:ascii="Times New Roman" w:hAnsi="Times New Roman" w:cs="Times New Roman"/>
@@ -3001,9 +2942,8 @@
           <w:szCs w:val="22"/>
           <w:highlight w:val="cyan"/>
         </w:rPr>
-        <w:t>divorce_answer</w:t>
-      </w:r>
-      <w:proofErr w:type="spellEnd"/>
+        <w:t xml:space="preserve"> </w:t>
+      </w:r>
       <w:r>
         <w:rPr>
           <w:rFonts w:ascii="Times New Roman" w:hAnsi="Times New Roman" w:cs="Times New Roman"/>
@@ -3011,6 +2951,69 @@
           <w:szCs w:val="22"/>
           <w:highlight w:val="cyan"/>
         </w:rPr>
+        <w:t>el</w:t>
+      </w:r>
+      <w:r>
+        <w:rPr>
+          <w:rFonts w:ascii="Times New Roman" w:hAnsi="Times New Roman" w:cs="Times New Roman"/>
+          <w:sz w:val="22"/>
+          <w:szCs w:val="22"/>
+          <w:highlight w:val="cyan"/>
+        </w:rPr>
+        <w:t>if tool</w:t>
+      </w:r>
+      <w:r>
+        <w:rPr>
+          <w:rFonts w:ascii="Times New Roman" w:hAnsi="Times New Roman" w:cs="Times New Roman"/>
+          <w:sz w:val="22"/>
+          <w:szCs w:val="22"/>
+          <w:highlight w:val="cyan"/>
+        </w:rPr>
+        <w:t>_ID</w:t>
+      </w:r>
+      <w:r>
+        <w:rPr>
+          <w:rFonts w:ascii="Times New Roman" w:hAnsi="Times New Roman" w:cs="Times New Roman"/>
+          <w:sz w:val="22"/>
+          <w:szCs w:val="22"/>
+          <w:highlight w:val="cyan"/>
+        </w:rPr>
+        <w:t xml:space="preserve"> == </w:t>
+      </w:r>
+      <w:r>
+        <w:rPr>
+          <w:rFonts w:ascii="Times New Roman" w:hAnsi="Times New Roman" w:cs="Times New Roman"/>
+          <w:sz w:val="22"/>
+          <w:szCs w:val="22"/>
+          <w:highlight w:val="cyan"/>
+        </w:rPr>
+        <w:t>“</w:t>
+      </w:r>
+      <w:r>
+        <w:rPr>
+          <w:rFonts w:ascii="Times New Roman" w:hAnsi="Times New Roman" w:cs="Times New Roman"/>
+          <w:sz w:val="22"/>
+          <w:szCs w:val="22"/>
+          <w:highlight w:val="cyan"/>
+        </w:rPr>
+        <w:t>divorce</w:t>
+      </w:r>
+      <w:r>
+        <w:rPr>
+          <w:rFonts w:ascii="Times New Roman" w:hAnsi="Times New Roman" w:cs="Times New Roman"/>
+          <w:sz w:val="22"/>
+          <w:szCs w:val="22"/>
+          <w:highlight w:val="cyan"/>
+        </w:rPr>
+        <w:t>_complaint</w:t>
+      </w:r>
+      <w:r>
+        <w:rPr>
+          <w:rFonts w:ascii="Times New Roman" w:hAnsi="Times New Roman" w:cs="Times New Roman"/>
+          <w:sz w:val="22"/>
+          <w:szCs w:val="22"/>
+          <w:highlight w:val="cyan"/>
+        </w:rPr>
         <w:t>”</w:t>
       </w:r>
       <w:r>
@@ -3056,25 +3059,7 @@
           <w:sz w:val="22"/>
           <w:szCs w:val="22"/>
         </w:rPr>
-        <w:t xml:space="preserve">Answer to Complaint </w:t>
-      </w:r>
-      <w:proofErr w:type="gramStart"/>
-      <w:r>
-        <w:rPr>
-          <w:rFonts w:ascii="Times New Roman" w:hAnsi="Times New Roman" w:cs="Times New Roman"/>
-          <w:sz w:val="22"/>
-          <w:szCs w:val="22"/>
-        </w:rPr>
-        <w:t>for</w:t>
-      </w:r>
-      <w:proofErr w:type="gramEnd"/>
-      <w:r>
-        <w:rPr>
-          <w:rFonts w:ascii="Times New Roman" w:hAnsi="Times New Roman" w:cs="Times New Roman"/>
-          <w:sz w:val="22"/>
-          <w:szCs w:val="22"/>
-        </w:rPr>
-        <w:t xml:space="preserve"> Divorce</w:t>
+        <w:t>Default Request and Entry</w:t>
       </w:r>
     </w:p>
     <w:p>
@@ -3102,6 +3087,137 @@
           <w:sz w:val="22"/>
           <w:szCs w:val="22"/>
         </w:rPr>
+        <w:t xml:space="preserve"> Notice of Hearing</w:t>
+      </w:r>
+    </w:p>
+    <w:p>
+      <w:pPr>
+        <w:spacing w:after="0" w:line="276" w:lineRule="auto"/>
+        <w:rPr>
+          <w:rFonts w:ascii="Times New Roman" w:hAnsi="Times New Roman" w:cs="Times New Roman"/>
+          <w:sz w:val="22"/>
+          <w:szCs w:val="22"/>
+        </w:rPr>
+      </w:pPr>
+      <w:proofErr w:type="gramStart"/>
+      <w:r>
+        <w:rPr>
+          <w:rFonts w:ascii="Times New Roman" w:hAnsi="Times New Roman" w:cs="Times New Roman"/>
+          <w:sz w:val="22"/>
+          <w:szCs w:val="22"/>
+        </w:rPr>
+        <w:t>[ ]</w:t>
+      </w:r>
+      <w:proofErr w:type="gramEnd"/>
+      <w:r>
+        <w:rPr>
+          <w:rFonts w:ascii="Times New Roman" w:hAnsi="Times New Roman" w:cs="Times New Roman"/>
+          <w:sz w:val="22"/>
+          <w:szCs w:val="22"/>
+        </w:rPr>
+        <w:t xml:space="preserve"> Notice of Hearing and Motion for Entry of Consent Judgment of Divorce</w:t>
+      </w:r>
+    </w:p>
+    <w:p>
+      <w:pPr>
+        <w:spacing w:after="0" w:line="276" w:lineRule="auto"/>
+        <w:rPr>
+          <w:rFonts w:ascii="Times New Roman" w:hAnsi="Times New Roman" w:cs="Times New Roman"/>
+          <w:sz w:val="22"/>
+          <w:szCs w:val="22"/>
+        </w:rPr>
+      </w:pPr>
+      <w:proofErr w:type="gramStart"/>
+      <w:r>
+        <w:rPr>
+          <w:rFonts w:ascii="Times New Roman" w:hAnsi="Times New Roman" w:cs="Times New Roman"/>
+          <w:sz w:val="22"/>
+          <w:szCs w:val="22"/>
+        </w:rPr>
+        <w:t>[ ]</w:t>
+      </w:r>
+      <w:proofErr w:type="gramEnd"/>
+      <w:r>
+        <w:rPr>
+          <w:rFonts w:ascii="Times New Roman" w:hAnsi="Times New Roman" w:cs="Times New Roman"/>
+          <w:sz w:val="22"/>
+          <w:szCs w:val="22"/>
+        </w:rPr>
+        <w:t xml:space="preserve"> Notice of Hearing and Motion for Entry of Default Judgment of Divorce</w:t>
+      </w:r>
+    </w:p>
+    <w:p>
+      <w:pPr>
+        <w:spacing w:after="0" w:line="276" w:lineRule="auto"/>
+        <w:rPr>
+          <w:rFonts w:ascii="Times New Roman" w:hAnsi="Times New Roman" w:cs="Times New Roman"/>
+          <w:sz w:val="22"/>
+          <w:szCs w:val="22"/>
+        </w:rPr>
+      </w:pPr>
+      <w:proofErr w:type="gramStart"/>
+      <w:r>
+        <w:rPr>
+          <w:rFonts w:ascii="Times New Roman" w:hAnsi="Times New Roman" w:cs="Times New Roman"/>
+          <w:sz w:val="22"/>
+          <w:szCs w:val="22"/>
+        </w:rPr>
+        <w:t>[ ]</w:t>
+      </w:r>
+      <w:proofErr w:type="gramEnd"/>
+      <w:r>
+        <w:rPr>
+          <w:rFonts w:ascii="Times New Roman" w:hAnsi="Times New Roman" w:cs="Times New Roman"/>
+          <w:sz w:val="22"/>
+          <w:szCs w:val="22"/>
+        </w:rPr>
+        <w:t xml:space="preserve"> Proposed Judgment of Divorce</w:t>
+      </w:r>
+    </w:p>
+    <w:p>
+      <w:pPr>
+        <w:spacing w:after="0" w:line="240" w:lineRule="auto"/>
+        <w:rPr>
+          <w:rFonts w:ascii="Times New Roman" w:hAnsi="Times New Roman" w:cs="Times New Roman"/>
+          <w:sz w:val="22"/>
+          <w:szCs w:val="22"/>
+        </w:rPr>
+      </w:pPr>
+      <w:r>
+        <w:rPr>
+          <w:rFonts w:ascii="Times New Roman" w:hAnsi="Times New Roman" w:cs="Times New Roman"/>
+          <w:sz w:val="22"/>
+          <w:szCs w:val="22"/>
+          <w:highlight w:val="yellow"/>
+        </w:rPr>
+        <w:t xml:space="preserve">{%p if </w:t>
+      </w:r>
+      <w:r>
+        <w:rPr>
+          <w:rFonts w:ascii="Times New Roman" w:hAnsi="Times New Roman" w:cs="Times New Roman"/>
+          <w:sz w:val="22"/>
+          <w:szCs w:val="22"/>
+          <w:highlight w:val="yellow"/>
+        </w:rPr>
+        <w:t>there_are_marital_</w:t>
+      </w:r>
+      <w:proofErr w:type="gramStart"/>
+      <w:r>
+        <w:rPr>
+          <w:rFonts w:ascii="Times New Roman" w:hAnsi="Times New Roman" w:cs="Times New Roman"/>
+          <w:sz w:val="22"/>
+          <w:szCs w:val="22"/>
+          <w:highlight w:val="yellow"/>
+        </w:rPr>
+        <w:t>children</w:t>
+      </w:r>
+      <w:r>
+        <w:rPr>
+          <w:rFonts w:ascii="Times New Roman" w:hAnsi="Times New Roman" w:cs="Times New Roman"/>
+          <w:sz w:val="22"/>
+          <w:szCs w:val="22"/>
+          <w:highlight w:val="yellow"/>
+        </w:rPr>
         <w:t xml:space="preserve"> </w:t>
       </w:r>
       <w:r>
@@ -3109,8 +3225,38 @@
           <w:rFonts w:ascii="Times New Roman" w:hAnsi="Times New Roman" w:cs="Times New Roman"/>
           <w:sz w:val="22"/>
           <w:szCs w:val="22"/>
-        </w:rPr>
-        <w:t>Counterclaim for Divorce</w:t>
+          <w:highlight w:val="yellow"/>
+        </w:rPr>
+        <w:t>%}</w:t>
+      </w:r>
+      <w:proofErr w:type="gramEnd"/>
+    </w:p>
+    <w:p>
+      <w:pPr>
+        <w:spacing w:after="0" w:line="276" w:lineRule="auto"/>
+        <w:rPr>
+          <w:rFonts w:ascii="Times New Roman" w:hAnsi="Times New Roman" w:cs="Times New Roman"/>
+          <w:sz w:val="22"/>
+          <w:szCs w:val="22"/>
+        </w:rPr>
+      </w:pPr>
+      <w:proofErr w:type="gramStart"/>
+      <w:r>
+        <w:rPr>
+          <w:rFonts w:ascii="Times New Roman" w:hAnsi="Times New Roman" w:cs="Times New Roman"/>
+          <w:sz w:val="22"/>
+          <w:szCs w:val="22"/>
+        </w:rPr>
+        <w:t>[ ]</w:t>
+      </w:r>
+      <w:proofErr w:type="gramEnd"/>
+      <w:r>
+        <w:rPr>
+          <w:rFonts w:ascii="Times New Roman" w:hAnsi="Times New Roman" w:cs="Times New Roman"/>
+          <w:sz w:val="22"/>
+          <w:szCs w:val="22"/>
+        </w:rPr>
+        <w:t xml:space="preserve"> Proposed Uniform Child Support Order</w:t>
       </w:r>
     </w:p>
     <w:p>
@@ -3129,47 +3275,56 @@
           <w:szCs w:val="22"/>
           <w:highlight w:val="yellow"/>
         </w:rPr>
+        <w:t xml:space="preserve">{%p </w:t>
+      </w:r>
+      <w:proofErr w:type="gramStart"/>
+      <w:r>
+        <w:rPr>
+          <w:rFonts w:ascii="Times New Roman" w:hAnsi="Times New Roman" w:cs="Times New Roman"/>
+          <w:sz w:val="22"/>
+          <w:szCs w:val="22"/>
+          <w:highlight w:val="yellow"/>
+        </w:rPr>
+        <w:t>endif %}</w:t>
+      </w:r>
+      <w:proofErr w:type="gramEnd"/>
+    </w:p>
+    <w:p>
+      <w:pPr>
+        <w:spacing w:after="0" w:line="240" w:lineRule="auto"/>
+        <w:rPr>
+          <w:rFonts w:ascii="Times New Roman" w:hAnsi="Times New Roman" w:cs="Times New Roman"/>
+          <w:sz w:val="22"/>
+          <w:szCs w:val="22"/>
+        </w:rPr>
+      </w:pPr>
+      <w:r>
+        <w:rPr>
+          <w:rFonts w:ascii="Times New Roman" w:hAnsi="Times New Roman" w:cs="Times New Roman"/>
+          <w:sz w:val="22"/>
+          <w:szCs w:val="22"/>
+          <w:highlight w:val="yellow"/>
+        </w:rPr>
         <w:t xml:space="preserve">{%p if </w:t>
       </w:r>
-      <w:proofErr w:type="spellStart"/>
-      <w:r>
-        <w:rPr>
-          <w:rFonts w:ascii="Times New Roman" w:hAnsi="Times New Roman" w:cs="Times New Roman"/>
-          <w:sz w:val="22"/>
-          <w:szCs w:val="22"/>
-          <w:highlight w:val="yellow"/>
-        </w:rPr>
-        <w:t>complaint_type</w:t>
-      </w:r>
-      <w:proofErr w:type="spellEnd"/>
-      <w:r>
-        <w:rPr>
-          <w:rFonts w:ascii="Times New Roman" w:hAnsi="Times New Roman" w:cs="Times New Roman"/>
-          <w:sz w:val="22"/>
-          <w:szCs w:val="22"/>
-          <w:highlight w:val="yellow"/>
-        </w:rPr>
-        <w:t xml:space="preserve"> == “</w:t>
-      </w:r>
-      <w:proofErr w:type="spellStart"/>
-      <w:r>
-        <w:rPr>
-          <w:rFonts w:ascii="Times New Roman" w:hAnsi="Times New Roman" w:cs="Times New Roman"/>
-          <w:sz w:val="22"/>
-          <w:szCs w:val="22"/>
-          <w:highlight w:val="yellow"/>
-        </w:rPr>
-        <w:t>with_children</w:t>
-      </w:r>
-      <w:proofErr w:type="spellEnd"/>
-      <w:r>
-        <w:rPr>
-          <w:rFonts w:ascii="Times New Roman" w:hAnsi="Times New Roman" w:cs="Times New Roman"/>
-          <w:sz w:val="22"/>
-          <w:szCs w:val="22"/>
-          <w:highlight w:val="yellow"/>
-        </w:rPr>
-        <w:t>”</w:t>
+      <w:r>
+        <w:rPr>
+          <w:rFonts w:ascii="Times New Roman" w:hAnsi="Times New Roman" w:cs="Times New Roman"/>
+          <w:sz w:val="22"/>
+          <w:szCs w:val="22"/>
+          <w:highlight w:val="yellow"/>
+        </w:rPr>
+        <w:t>user_wants_post_divorce_support or spousal_support_provisions == "user_agrees_to_pay_spousal_support</w:t>
+      </w:r>
+      <w:proofErr w:type="gramStart"/>
+      <w:r>
+        <w:rPr>
+          <w:rFonts w:ascii="Times New Roman" w:hAnsi="Times New Roman" w:cs="Times New Roman"/>
+          <w:sz w:val="22"/>
+          <w:szCs w:val="22"/>
+          <w:highlight w:val="yellow"/>
+        </w:rPr>
+        <w:t>"</w:t>
       </w:r>
       <w:r>
         <w:rPr>
@@ -3189,6 +3344,7 @@
         </w:rPr>
         <w:t>%}</w:t>
       </w:r>
+      <w:proofErr w:type="gramEnd"/>
     </w:p>
     <w:p>
       <w:pPr>
@@ -3215,6 +3371,111 @@
           <w:sz w:val="22"/>
           <w:szCs w:val="22"/>
         </w:rPr>
+        <w:t xml:space="preserve"> Proposed Uniform Spousal Support Order</w:t>
+      </w:r>
+    </w:p>
+    <w:p>
+      <w:pPr>
+        <w:spacing w:after="0" w:line="240" w:lineRule="auto"/>
+        <w:rPr>
+          <w:rFonts w:ascii="Times New Roman" w:hAnsi="Times New Roman" w:cs="Times New Roman"/>
+          <w:sz w:val="22"/>
+          <w:szCs w:val="22"/>
+        </w:rPr>
+      </w:pPr>
+      <w:r>
+        <w:rPr>
+          <w:rFonts w:ascii="Times New Roman" w:hAnsi="Times New Roman" w:cs="Times New Roman"/>
+          <w:sz w:val="22"/>
+          <w:szCs w:val="22"/>
+          <w:highlight w:val="yellow"/>
+        </w:rPr>
+        <w:t xml:space="preserve">{%p </w:t>
+      </w:r>
+      <w:proofErr w:type="gramStart"/>
+      <w:r>
+        <w:rPr>
+          <w:rFonts w:ascii="Times New Roman" w:hAnsi="Times New Roman" w:cs="Times New Roman"/>
+          <w:sz w:val="22"/>
+          <w:szCs w:val="22"/>
+          <w:highlight w:val="yellow"/>
+        </w:rPr>
+        <w:t>endif %}</w:t>
+      </w:r>
+      <w:proofErr w:type="gramEnd"/>
+    </w:p>
+    <w:p>
+      <w:pPr>
+        <w:spacing w:after="0" w:line="276" w:lineRule="auto"/>
+        <w:rPr>
+          <w:rFonts w:ascii="Times New Roman" w:hAnsi="Times New Roman" w:cs="Times New Roman"/>
+          <w:sz w:val="22"/>
+          <w:szCs w:val="22"/>
+        </w:rPr>
+      </w:pPr>
+      <w:proofErr w:type="gramStart"/>
+      <w:r>
+        <w:rPr>
+          <w:rFonts w:ascii="Times New Roman" w:hAnsi="Times New Roman" w:cs="Times New Roman"/>
+          <w:sz w:val="22"/>
+          <w:szCs w:val="22"/>
+        </w:rPr>
+        <w:t>[ ]</w:t>
+      </w:r>
+      <w:proofErr w:type="gramEnd"/>
+      <w:r>
+        <w:rPr>
+          <w:rFonts w:ascii="Times New Roman" w:hAnsi="Times New Roman" w:cs="Times New Roman"/>
+          <w:sz w:val="22"/>
+          <w:szCs w:val="22"/>
+        </w:rPr>
+        <w:t xml:space="preserve"> Judgment of Divorce</w:t>
+      </w:r>
+    </w:p>
+    <w:p>
+      <w:pPr>
+        <w:spacing w:after="0" w:line="240" w:lineRule="auto"/>
+        <w:rPr>
+          <w:rFonts w:ascii="Times New Roman" w:hAnsi="Times New Roman" w:cs="Times New Roman"/>
+          <w:sz w:val="22"/>
+          <w:szCs w:val="22"/>
+        </w:rPr>
+      </w:pPr>
+      <w:r>
+        <w:rPr>
+          <w:rFonts w:ascii="Times New Roman" w:hAnsi="Times New Roman" w:cs="Times New Roman"/>
+          <w:sz w:val="22"/>
+          <w:szCs w:val="22"/>
+          <w:highlight w:val="yellow"/>
+        </w:rPr>
+        <w:t xml:space="preserve">{%p if </w:t>
+      </w:r>
+      <w:r>
+        <w:rPr>
+          <w:rFonts w:ascii="Times New Roman" w:hAnsi="Times New Roman" w:cs="Times New Roman"/>
+          <w:sz w:val="22"/>
+          <w:szCs w:val="22"/>
+          <w:highlight w:val="yellow"/>
+        </w:rPr>
+        <w:t>there_are_marital_</w:t>
+      </w:r>
+      <w:proofErr w:type="gramStart"/>
+      <w:r>
+        <w:rPr>
+          <w:rFonts w:ascii="Times New Roman" w:hAnsi="Times New Roman" w:cs="Times New Roman"/>
+          <w:sz w:val="22"/>
+          <w:szCs w:val="22"/>
+          <w:highlight w:val="yellow"/>
+        </w:rPr>
+        <w:t>children</w:t>
+      </w:r>
+      <w:r>
+        <w:rPr>
+          <w:rFonts w:ascii="Times New Roman" w:hAnsi="Times New Roman" w:cs="Times New Roman"/>
+          <w:sz w:val="22"/>
+          <w:szCs w:val="22"/>
+          <w:highlight w:val="yellow"/>
+        </w:rPr>
         <w:t xml:space="preserve"> </w:t>
       </w:r>
       <w:r>
@@ -3222,9 +3483,11 @@
           <w:rFonts w:ascii="Times New Roman" w:hAnsi="Times New Roman" w:cs="Times New Roman"/>
           <w:sz w:val="22"/>
           <w:szCs w:val="22"/>
-        </w:rPr>
-        <w:t>Uniform Child Custody Jurisdiction Enforcement Act Affidavit</w:t>
-      </w:r>
+          <w:highlight w:val="yellow"/>
+        </w:rPr>
+        <w:t>%}</w:t>
+      </w:r>
+      <w:proofErr w:type="gramEnd"/>
     </w:p>
     <w:p>
       <w:pPr>
@@ -3251,8 +3514,95 @@
           <w:sz w:val="22"/>
           <w:szCs w:val="22"/>
         </w:rPr>
-        <w:t xml:space="preserve"> Verified Statement </w:t>
-      </w:r>
+        <w:t xml:space="preserve"> Uniform Child Support Order</w:t>
+      </w:r>
+    </w:p>
+    <w:p>
+      <w:pPr>
+        <w:spacing w:after="0" w:line="240" w:lineRule="auto"/>
+        <w:rPr>
+          <w:rFonts w:ascii="Times New Roman" w:hAnsi="Times New Roman" w:cs="Times New Roman"/>
+          <w:sz w:val="22"/>
+          <w:szCs w:val="22"/>
+        </w:rPr>
+      </w:pPr>
+      <w:r>
+        <w:rPr>
+          <w:rFonts w:ascii="Times New Roman" w:hAnsi="Times New Roman" w:cs="Times New Roman"/>
+          <w:sz w:val="22"/>
+          <w:szCs w:val="22"/>
+          <w:highlight w:val="yellow"/>
+        </w:rPr>
+        <w:t xml:space="preserve">{%p </w:t>
+      </w:r>
+      <w:proofErr w:type="gramStart"/>
+      <w:r>
+        <w:rPr>
+          <w:rFonts w:ascii="Times New Roman" w:hAnsi="Times New Roman" w:cs="Times New Roman"/>
+          <w:sz w:val="22"/>
+          <w:szCs w:val="22"/>
+          <w:highlight w:val="yellow"/>
+        </w:rPr>
+        <w:t>endif %}</w:t>
+      </w:r>
+      <w:proofErr w:type="gramEnd"/>
+    </w:p>
+    <w:p>
+      <w:pPr>
+        <w:spacing w:after="0" w:line="240" w:lineRule="auto"/>
+        <w:rPr>
+          <w:rFonts w:ascii="Times New Roman" w:hAnsi="Times New Roman" w:cs="Times New Roman"/>
+          <w:sz w:val="22"/>
+          <w:szCs w:val="22"/>
+        </w:rPr>
+      </w:pPr>
+      <w:r>
+        <w:rPr>
+          <w:rFonts w:ascii="Times New Roman" w:hAnsi="Times New Roman" w:cs="Times New Roman"/>
+          <w:sz w:val="22"/>
+          <w:szCs w:val="22"/>
+          <w:highlight w:val="yellow"/>
+        </w:rPr>
+        <w:t xml:space="preserve">{%p if </w:t>
+      </w:r>
+      <w:r>
+        <w:rPr>
+          <w:rFonts w:ascii="Times New Roman" w:hAnsi="Times New Roman" w:cs="Times New Roman"/>
+          <w:sz w:val="22"/>
+          <w:szCs w:val="22"/>
+          <w:highlight w:val="yellow"/>
+        </w:rPr>
+        <w:t>user_wants_post_divorce_support or spousal_support_provisions == "user_agrees_to_pay_spousal_support</w:t>
+      </w:r>
+      <w:proofErr w:type="gramStart"/>
+      <w:r>
+        <w:rPr>
+          <w:rFonts w:ascii="Times New Roman" w:hAnsi="Times New Roman" w:cs="Times New Roman"/>
+          <w:sz w:val="22"/>
+          <w:szCs w:val="22"/>
+          <w:highlight w:val="yellow"/>
+        </w:rPr>
+        <w:t>"</w:t>
+      </w:r>
+      <w:r>
+        <w:rPr>
+          <w:rFonts w:ascii="Times New Roman" w:hAnsi="Times New Roman" w:cs="Times New Roman"/>
+          <w:sz w:val="22"/>
+          <w:szCs w:val="22"/>
+          <w:highlight w:val="yellow"/>
+        </w:rPr>
+        <w:t xml:space="preserve"> </w:t>
+      </w:r>
+      <w:r>
+        <w:rPr>
+          <w:rFonts w:ascii="Times New Roman" w:hAnsi="Times New Roman" w:cs="Times New Roman"/>
+          <w:sz w:val="22"/>
+          <w:szCs w:val="22"/>
+          <w:highlight w:val="yellow"/>
+        </w:rPr>
+        <w:t>%}</w:t>
+      </w:r>
+      <w:proofErr w:type="gramEnd"/>
     </w:p>
     <w:p>
       <w:pPr>
@@ -3279,6 +3629,84 @@
           <w:sz w:val="22"/>
           <w:szCs w:val="22"/>
         </w:rPr>
+        <w:t xml:space="preserve"> Uniform Spousal Support Order</w:t>
+      </w:r>
+    </w:p>
+    <w:p>
+      <w:pPr>
+        <w:spacing w:after="0" w:line="240" w:lineRule="auto"/>
+        <w:rPr>
+          <w:rFonts w:ascii="Times New Roman" w:hAnsi="Times New Roman" w:cs="Times New Roman"/>
+          <w:sz w:val="22"/>
+          <w:szCs w:val="22"/>
+        </w:rPr>
+      </w:pPr>
+      <w:r>
+        <w:rPr>
+          <w:rFonts w:ascii="Times New Roman" w:hAnsi="Times New Roman" w:cs="Times New Roman"/>
+          <w:sz w:val="22"/>
+          <w:szCs w:val="22"/>
+          <w:highlight w:val="yellow"/>
+        </w:rPr>
+        <w:t xml:space="preserve">{%p </w:t>
+      </w:r>
+      <w:proofErr w:type="gramStart"/>
+      <w:r>
+        <w:rPr>
+          <w:rFonts w:ascii="Times New Roman" w:hAnsi="Times New Roman" w:cs="Times New Roman"/>
+          <w:sz w:val="22"/>
+          <w:szCs w:val="22"/>
+          <w:highlight w:val="yellow"/>
+        </w:rPr>
+        <w:t>endif %}</w:t>
+      </w:r>
+      <w:proofErr w:type="gramEnd"/>
+    </w:p>
+    <w:p>
+      <w:pPr>
+        <w:spacing w:after="0" w:line="240" w:lineRule="auto"/>
+        <w:rPr>
+          <w:rFonts w:ascii="Times New Roman" w:hAnsi="Times New Roman" w:cs="Times New Roman"/>
+          <w:sz w:val="22"/>
+          <w:szCs w:val="22"/>
+        </w:rPr>
+      </w:pPr>
+      <w:r>
+        <w:rPr>
+          <w:rFonts w:ascii="Times New Roman" w:hAnsi="Times New Roman" w:cs="Times New Roman"/>
+          <w:sz w:val="22"/>
+          <w:szCs w:val="22"/>
+          <w:highlight w:val="yellow"/>
+        </w:rPr>
+        <w:t xml:space="preserve">{%p </w:t>
+      </w:r>
+      <w:r>
+        <w:rPr>
+          <w:rFonts w:ascii="Times New Roman" w:hAnsi="Times New Roman" w:cs="Times New Roman"/>
+          <w:sz w:val="22"/>
+          <w:szCs w:val="22"/>
+          <w:highlight w:val="yellow"/>
+        </w:rPr>
+        <w:t>if foc_100_</w:t>
+      </w:r>
+      <w:proofErr w:type="gramStart"/>
+      <w:r>
+        <w:rPr>
+          <w:rFonts w:ascii="Times New Roman" w:hAnsi="Times New Roman" w:cs="Times New Roman"/>
+          <w:sz w:val="22"/>
+          <w:szCs w:val="22"/>
+          <w:highlight w:val="yellow"/>
+        </w:rPr>
+        <w:t>full.enabled</w:t>
+      </w:r>
+      <w:proofErr w:type="gramEnd"/>
+      <w:r>
+        <w:rPr>
+          <w:rFonts w:ascii="Times New Roman" w:hAnsi="Times New Roman" w:cs="Times New Roman"/>
+          <w:sz w:val="22"/>
+          <w:szCs w:val="22"/>
+          <w:highlight w:val="yellow"/>
+        </w:rPr>
         <w:t xml:space="preserve"> </w:t>
       </w:r>
       <w:r>
@@ -3286,8 +3714,46 @@
           <w:rFonts w:ascii="Times New Roman" w:hAnsi="Times New Roman" w:cs="Times New Roman"/>
           <w:sz w:val="22"/>
           <w:szCs w:val="22"/>
-        </w:rPr>
-        <w:t>Application for IV-D Services</w:t>
+          <w:highlight w:val="yellow"/>
+        </w:rPr>
+        <w:t>%</w:t>
+      </w:r>
+      <w:r>
+        <w:rPr>
+          <w:rFonts w:ascii="Times New Roman" w:hAnsi="Times New Roman" w:cs="Times New Roman"/>
+          <w:sz w:val="22"/>
+          <w:szCs w:val="22"/>
+          <w:highlight w:val="yellow"/>
+        </w:rPr>
+        <w:t>}</w:t>
+      </w:r>
+    </w:p>
+    <w:p>
+      <w:pPr>
+        <w:spacing w:after="0" w:line="276" w:lineRule="auto"/>
+        <w:rPr>
+          <w:rFonts w:ascii="Times New Roman" w:hAnsi="Times New Roman" w:cs="Times New Roman"/>
+          <w:sz w:val="22"/>
+          <w:szCs w:val="22"/>
+        </w:rPr>
+      </w:pPr>
+      <w:proofErr w:type="gramStart"/>
+      <w:r>
+        <w:rPr>
+          <w:rFonts w:ascii="Times New Roman" w:hAnsi="Times New Roman" w:cs="Times New Roman"/>
+          <w:sz w:val="22"/>
+          <w:szCs w:val="22"/>
+        </w:rPr>
+        <w:t>[ ]</w:t>
+      </w:r>
+      <w:proofErr w:type="gramEnd"/>
+      <w:r>
+        <w:rPr>
+          <w:rFonts w:ascii="Times New Roman" w:hAnsi="Times New Roman" w:cs="Times New Roman"/>
+          <w:sz w:val="22"/>
+          <w:szCs w:val="22"/>
+        </w:rPr>
+        <w:t xml:space="preserve"> Domestic Relations Judgment Information Form</w:t>
       </w:r>
     </w:p>
     <w:p>
@@ -3322,6 +3788,34 @@
     </w:p>
     <w:p>
       <w:pPr>
+        <w:spacing w:after="0" w:line="276" w:lineRule="auto"/>
+        <w:rPr>
+          <w:rFonts w:ascii="Times New Roman" w:hAnsi="Times New Roman" w:cs="Times New Roman"/>
+          <w:sz w:val="22"/>
+          <w:szCs w:val="22"/>
+        </w:rPr>
+      </w:pPr>
+      <w:proofErr w:type="gramStart"/>
+      <w:r>
+        <w:rPr>
+          <w:rFonts w:ascii="Times New Roman" w:hAnsi="Times New Roman" w:cs="Times New Roman"/>
+          <w:sz w:val="22"/>
+          <w:szCs w:val="22"/>
+        </w:rPr>
+        <w:t>[ ]</w:t>
+      </w:r>
+      <w:proofErr w:type="gramEnd"/>
+      <w:r>
+        <w:rPr>
+          <w:rFonts w:ascii="Times New Roman" w:hAnsi="Times New Roman" w:cs="Times New Roman"/>
+          <w:sz w:val="22"/>
+          <w:szCs w:val="22"/>
+        </w:rPr>
+        <w:t xml:space="preserve"> Domestic Relations Verified Financial Information Form</w:t>
+      </w:r>
+    </w:p>
+    <w:p>
+      <w:pPr>
         <w:spacing w:after="0" w:line="240" w:lineRule="auto"/>
         <w:rPr>
           <w:rFonts w:ascii="Times New Roman" w:hAnsi="Times New Roman" w:cs="Times New Roman"/>
@@ -3334,61 +3828,319 @@
           <w:rFonts w:ascii="Times New Roman" w:hAnsi="Times New Roman" w:cs="Times New Roman"/>
           <w:sz w:val="22"/>
           <w:szCs w:val="22"/>
+          <w:highlight w:val="cyan"/>
+        </w:rPr>
+        <w:t xml:space="preserve">{%p </w:t>
+      </w:r>
+      <w:r>
+        <w:rPr>
+          <w:rFonts w:ascii="Times New Roman" w:hAnsi="Times New Roman" w:cs="Times New Roman"/>
+          <w:sz w:val="22"/>
+          <w:szCs w:val="22"/>
+          <w:highlight w:val="cyan"/>
+        </w:rPr>
+        <w:t>el</w:t>
+      </w:r>
+      <w:r>
+        <w:rPr>
+          <w:rFonts w:ascii="Times New Roman" w:hAnsi="Times New Roman" w:cs="Times New Roman"/>
+          <w:sz w:val="22"/>
+          <w:szCs w:val="22"/>
+          <w:highlight w:val="cyan"/>
+        </w:rPr>
+        <w:t>if tool</w:t>
+      </w:r>
+      <w:r>
+        <w:rPr>
+          <w:rFonts w:ascii="Times New Roman" w:hAnsi="Times New Roman" w:cs="Times New Roman"/>
+          <w:sz w:val="22"/>
+          <w:szCs w:val="22"/>
+          <w:highlight w:val="cyan"/>
+        </w:rPr>
+        <w:t>_ID</w:t>
+      </w:r>
+      <w:r>
+        <w:rPr>
+          <w:rFonts w:ascii="Times New Roman" w:hAnsi="Times New Roman" w:cs="Times New Roman"/>
+          <w:sz w:val="22"/>
+          <w:szCs w:val="22"/>
+          <w:highlight w:val="cyan"/>
+        </w:rPr>
+        <w:t xml:space="preserve"> == </w:t>
+      </w:r>
+      <w:r>
+        <w:rPr>
+          <w:rFonts w:ascii="Times New Roman" w:hAnsi="Times New Roman" w:cs="Times New Roman"/>
+          <w:sz w:val="22"/>
+          <w:szCs w:val="22"/>
+          <w:highlight w:val="cyan"/>
+        </w:rPr>
+        <w:t>“JOD_only”</w:t>
+      </w:r>
+      <w:r>
+        <w:rPr>
+          <w:rFonts w:ascii="Times New Roman" w:hAnsi="Times New Roman" w:cs="Times New Roman"/>
+          <w:sz w:val="22"/>
+          <w:szCs w:val="22"/>
+          <w:highlight w:val="cyan"/>
+        </w:rPr>
+        <w:t xml:space="preserve"> %}</w:t>
+      </w:r>
+    </w:p>
+    <w:p>
+      <w:pPr>
+        <w:spacing w:after="0" w:line="276" w:lineRule="auto"/>
+        <w:rPr>
+          <w:rFonts w:ascii="Times New Roman" w:hAnsi="Times New Roman" w:cs="Times New Roman"/>
+          <w:sz w:val="22"/>
+          <w:szCs w:val="22"/>
+        </w:rPr>
+      </w:pPr>
+      <w:proofErr w:type="gramStart"/>
+      <w:r>
+        <w:rPr>
+          <w:rFonts w:ascii="Times New Roman" w:hAnsi="Times New Roman" w:cs="Times New Roman"/>
+          <w:sz w:val="22"/>
+          <w:szCs w:val="22"/>
+        </w:rPr>
+        <w:t>[ ]</w:t>
+      </w:r>
+      <w:proofErr w:type="gramEnd"/>
+      <w:r>
+        <w:rPr>
+          <w:rFonts w:ascii="Times New Roman" w:hAnsi="Times New Roman" w:cs="Times New Roman"/>
+          <w:sz w:val="22"/>
+          <w:szCs w:val="22"/>
+        </w:rPr>
+        <w:t xml:space="preserve"> Notice of Hearing</w:t>
+      </w:r>
+    </w:p>
+    <w:p>
+      <w:pPr>
+        <w:spacing w:after="0" w:line="276" w:lineRule="auto"/>
+        <w:rPr>
+          <w:rFonts w:ascii="Times New Roman" w:hAnsi="Times New Roman" w:cs="Times New Roman"/>
+          <w:sz w:val="22"/>
+          <w:szCs w:val="22"/>
+        </w:rPr>
+      </w:pPr>
+      <w:proofErr w:type="gramStart"/>
+      <w:r>
+        <w:rPr>
+          <w:rFonts w:ascii="Times New Roman" w:hAnsi="Times New Roman" w:cs="Times New Roman"/>
+          <w:sz w:val="22"/>
+          <w:szCs w:val="22"/>
+        </w:rPr>
+        <w:t>[ ]</w:t>
+      </w:r>
+      <w:proofErr w:type="gramEnd"/>
+      <w:r>
+        <w:rPr>
+          <w:rFonts w:ascii="Times New Roman" w:hAnsi="Times New Roman" w:cs="Times New Roman"/>
+          <w:sz w:val="22"/>
+          <w:szCs w:val="22"/>
+        </w:rPr>
+        <w:t xml:space="preserve"> Notice of Hearing and Motion for Entry of Consent Judgment of Divorce</w:t>
+      </w:r>
+    </w:p>
+    <w:p>
+      <w:pPr>
+        <w:spacing w:after="0" w:line="276" w:lineRule="auto"/>
+        <w:rPr>
+          <w:rFonts w:ascii="Times New Roman" w:hAnsi="Times New Roman" w:cs="Times New Roman"/>
+          <w:sz w:val="22"/>
+          <w:szCs w:val="22"/>
+        </w:rPr>
+      </w:pPr>
+      <w:proofErr w:type="gramStart"/>
+      <w:r>
+        <w:rPr>
+          <w:rFonts w:ascii="Times New Roman" w:hAnsi="Times New Roman" w:cs="Times New Roman"/>
+          <w:sz w:val="22"/>
+          <w:szCs w:val="22"/>
+        </w:rPr>
+        <w:t>[ ]</w:t>
+      </w:r>
+      <w:proofErr w:type="gramEnd"/>
+      <w:r>
+        <w:rPr>
+          <w:rFonts w:ascii="Times New Roman" w:hAnsi="Times New Roman" w:cs="Times New Roman"/>
+          <w:sz w:val="22"/>
+          <w:szCs w:val="22"/>
+        </w:rPr>
+        <w:t xml:space="preserve"> Notice of Hearing and Motion for Entry of Default Judgment of Divorce</w:t>
+      </w:r>
+    </w:p>
+    <w:p>
+      <w:pPr>
+        <w:spacing w:after="0" w:line="276" w:lineRule="auto"/>
+        <w:rPr>
+          <w:rFonts w:ascii="Times New Roman" w:hAnsi="Times New Roman" w:cs="Times New Roman"/>
+          <w:sz w:val="22"/>
+          <w:szCs w:val="22"/>
+        </w:rPr>
+      </w:pPr>
+      <w:proofErr w:type="gramStart"/>
+      <w:r>
+        <w:rPr>
+          <w:rFonts w:ascii="Times New Roman" w:hAnsi="Times New Roman" w:cs="Times New Roman"/>
+          <w:sz w:val="22"/>
+          <w:szCs w:val="22"/>
+        </w:rPr>
+        <w:t>[ ]</w:t>
+      </w:r>
+      <w:proofErr w:type="gramEnd"/>
+      <w:r>
+        <w:rPr>
+          <w:rFonts w:ascii="Times New Roman" w:hAnsi="Times New Roman" w:cs="Times New Roman"/>
+          <w:sz w:val="22"/>
+          <w:szCs w:val="22"/>
+        </w:rPr>
+        <w:t xml:space="preserve"> Proposed Judgment of Divorce</w:t>
+      </w:r>
+    </w:p>
+    <w:p>
+      <w:pPr>
+        <w:spacing w:after="0" w:line="240" w:lineRule="auto"/>
+        <w:rPr>
+          <w:rFonts w:ascii="Times New Roman" w:hAnsi="Times New Roman" w:cs="Times New Roman"/>
+          <w:sz w:val="22"/>
+          <w:szCs w:val="22"/>
+        </w:rPr>
+      </w:pPr>
+      <w:r>
+        <w:rPr>
+          <w:rFonts w:ascii="Times New Roman" w:hAnsi="Times New Roman" w:cs="Times New Roman"/>
+          <w:sz w:val="22"/>
+          <w:szCs w:val="22"/>
           <w:highlight w:val="yellow"/>
         </w:rPr>
         <w:t xml:space="preserve">{%p if </w:t>
       </w:r>
-      <w:proofErr w:type="spellStart"/>
-      <w:r>
-        <w:rPr>
-          <w:rFonts w:ascii="Times New Roman" w:hAnsi="Times New Roman" w:cs="Times New Roman"/>
-          <w:sz w:val="22"/>
-          <w:szCs w:val="22"/>
-          <w:highlight w:val="yellow"/>
-        </w:rPr>
-        <w:t>user_wants_post_divorce_support</w:t>
-      </w:r>
-      <w:proofErr w:type="spellEnd"/>
-      <w:r>
-        <w:rPr>
-          <w:rFonts w:ascii="Times New Roman" w:hAnsi="Times New Roman" w:cs="Times New Roman"/>
-          <w:sz w:val="22"/>
-          <w:szCs w:val="22"/>
-          <w:highlight w:val="yellow"/>
-        </w:rPr>
-        <w:t xml:space="preserve"> or </w:t>
-      </w:r>
-      <w:proofErr w:type="spellStart"/>
-      <w:r>
-        <w:rPr>
-          <w:rFonts w:ascii="Times New Roman" w:hAnsi="Times New Roman" w:cs="Times New Roman"/>
-          <w:sz w:val="22"/>
-          <w:szCs w:val="22"/>
-          <w:highlight w:val="yellow"/>
-        </w:rPr>
-        <w:t>spousal_support_provisions</w:t>
-      </w:r>
-      <w:proofErr w:type="spellEnd"/>
-      <w:r>
-        <w:rPr>
-          <w:rFonts w:ascii="Times New Roman" w:hAnsi="Times New Roman" w:cs="Times New Roman"/>
-          <w:sz w:val="22"/>
-          <w:szCs w:val="22"/>
-          <w:highlight w:val="yellow"/>
-        </w:rPr>
-        <w:t xml:space="preserve"> == "</w:t>
-      </w:r>
-      <w:proofErr w:type="spellStart"/>
-      <w:r>
-        <w:rPr>
-          <w:rFonts w:ascii="Times New Roman" w:hAnsi="Times New Roman" w:cs="Times New Roman"/>
-          <w:sz w:val="22"/>
-          <w:szCs w:val="22"/>
-          <w:highlight w:val="yellow"/>
-        </w:rPr>
-        <w:t>user_agrees_to_pay_spousal_support</w:t>
-      </w:r>
-      <w:proofErr w:type="spellEnd"/>
+      <w:r>
+        <w:rPr>
+          <w:rFonts w:ascii="Times New Roman" w:hAnsi="Times New Roman" w:cs="Times New Roman"/>
+          <w:sz w:val="22"/>
+          <w:szCs w:val="22"/>
+          <w:highlight w:val="yellow"/>
+        </w:rPr>
+        <w:t>there_are_marital_</w:t>
+      </w:r>
+      <w:proofErr w:type="gramStart"/>
+      <w:r>
+        <w:rPr>
+          <w:rFonts w:ascii="Times New Roman" w:hAnsi="Times New Roman" w:cs="Times New Roman"/>
+          <w:sz w:val="22"/>
+          <w:szCs w:val="22"/>
+          <w:highlight w:val="yellow"/>
+        </w:rPr>
+        <w:t>children</w:t>
+      </w:r>
+      <w:r>
+        <w:rPr>
+          <w:rFonts w:ascii="Times New Roman" w:hAnsi="Times New Roman" w:cs="Times New Roman"/>
+          <w:sz w:val="22"/>
+          <w:szCs w:val="22"/>
+          <w:highlight w:val="yellow"/>
+        </w:rPr>
+        <w:t xml:space="preserve"> </w:t>
+      </w:r>
+      <w:r>
+        <w:rPr>
+          <w:rFonts w:ascii="Times New Roman" w:hAnsi="Times New Roman" w:cs="Times New Roman"/>
+          <w:sz w:val="22"/>
+          <w:szCs w:val="22"/>
+          <w:highlight w:val="yellow"/>
+        </w:rPr>
+        <w:t>%}</w:t>
+      </w:r>
+      <w:proofErr w:type="gramEnd"/>
+    </w:p>
+    <w:p>
+      <w:pPr>
+        <w:spacing w:after="0" w:line="276" w:lineRule="auto"/>
+        <w:rPr>
+          <w:rFonts w:ascii="Times New Roman" w:hAnsi="Times New Roman" w:cs="Times New Roman"/>
+          <w:sz w:val="22"/>
+          <w:szCs w:val="22"/>
+        </w:rPr>
+      </w:pPr>
+      <w:proofErr w:type="gramStart"/>
+      <w:r>
+        <w:rPr>
+          <w:rFonts w:ascii="Times New Roman" w:hAnsi="Times New Roman" w:cs="Times New Roman"/>
+          <w:sz w:val="22"/>
+          <w:szCs w:val="22"/>
+        </w:rPr>
+        <w:t>[ ]</w:t>
+      </w:r>
+      <w:proofErr w:type="gramEnd"/>
+      <w:r>
+        <w:rPr>
+          <w:rFonts w:ascii="Times New Roman" w:hAnsi="Times New Roman" w:cs="Times New Roman"/>
+          <w:sz w:val="22"/>
+          <w:szCs w:val="22"/>
+        </w:rPr>
+        <w:t xml:space="preserve"> Proposed Uniform Child Support Order</w:t>
+      </w:r>
+    </w:p>
+    <w:p>
+      <w:pPr>
+        <w:spacing w:after="0" w:line="240" w:lineRule="auto"/>
+        <w:rPr>
+          <w:rFonts w:ascii="Times New Roman" w:hAnsi="Times New Roman" w:cs="Times New Roman"/>
+          <w:sz w:val="22"/>
+          <w:szCs w:val="22"/>
+        </w:rPr>
+      </w:pPr>
+      <w:r>
+        <w:rPr>
+          <w:rFonts w:ascii="Times New Roman" w:hAnsi="Times New Roman" w:cs="Times New Roman"/>
+          <w:sz w:val="22"/>
+          <w:szCs w:val="22"/>
+          <w:highlight w:val="yellow"/>
+        </w:rPr>
+        <w:t xml:space="preserve">{%p </w:t>
+      </w:r>
+      <w:proofErr w:type="gramStart"/>
+      <w:r>
+        <w:rPr>
+          <w:rFonts w:ascii="Times New Roman" w:hAnsi="Times New Roman" w:cs="Times New Roman"/>
+          <w:sz w:val="22"/>
+          <w:szCs w:val="22"/>
+          <w:highlight w:val="yellow"/>
+        </w:rPr>
+        <w:t>endif %}</w:t>
+      </w:r>
+      <w:proofErr w:type="gramEnd"/>
+    </w:p>
+    <w:p>
+      <w:pPr>
+        <w:spacing w:after="0" w:line="240" w:lineRule="auto"/>
+        <w:rPr>
+          <w:rFonts w:ascii="Times New Roman" w:hAnsi="Times New Roman" w:cs="Times New Roman"/>
+          <w:sz w:val="22"/>
+          <w:szCs w:val="22"/>
+        </w:rPr>
+      </w:pPr>
+      <w:r>
+        <w:rPr>
+          <w:rFonts w:ascii="Times New Roman" w:hAnsi="Times New Roman" w:cs="Times New Roman"/>
+          <w:sz w:val="22"/>
+          <w:szCs w:val="22"/>
+          <w:highlight w:val="yellow"/>
+        </w:rPr>
+        <w:t xml:space="preserve">{%p if </w:t>
+      </w:r>
+      <w:r>
+        <w:rPr>
+          <w:rFonts w:ascii="Times New Roman" w:hAnsi="Times New Roman" w:cs="Times New Roman"/>
+          <w:sz w:val="22"/>
+          <w:szCs w:val="22"/>
+          <w:highlight w:val="yellow"/>
+        </w:rPr>
+        <w:t>user_wants_post_divorce_support or spousal_support_provisions == "user_agrees_to_pay_spousal_support</w:t>
+      </w:r>
       <w:proofErr w:type="gramStart"/>
       <w:r>
         <w:rPr>
@@ -3502,1370 +4254,8 @@
           <w:sz w:val="22"/>
           <w:szCs w:val="22"/>
         </w:rPr>
-        <w:t xml:space="preserve"> Domestic Relations Verified Financial Information Form</w:t>
-      </w:r>
-    </w:p>
-    <w:p>
-      <w:pPr>
-        <w:spacing w:after="0" w:line="240" w:lineRule="auto"/>
-        <w:rPr>
-          <w:rFonts w:ascii="Times New Roman" w:hAnsi="Times New Roman" w:cs="Times New Roman"/>
-          <w:sz w:val="22"/>
-          <w:szCs w:val="22"/>
-        </w:rPr>
-      </w:pPr>
-      <w:r>
-        <w:rPr>
-          <w:rFonts w:ascii="Times New Roman" w:hAnsi="Times New Roman" w:cs="Times New Roman"/>
-          <w:sz w:val="22"/>
-          <w:szCs w:val="22"/>
-          <w:highlight w:val="cyan"/>
-        </w:rPr>
-        <w:t>{%</w:t>
-      </w:r>
-      <w:r>
-        <w:rPr>
-          <w:rFonts w:ascii="Times New Roman" w:hAnsi="Times New Roman" w:cs="Times New Roman"/>
-          <w:sz w:val="22"/>
-          <w:szCs w:val="22"/>
-          <w:highlight w:val="cyan"/>
-        </w:rPr>
-        <w:t>p</w:t>
-      </w:r>
-      <w:r>
-        <w:rPr>
-          <w:rFonts w:ascii="Times New Roman" w:hAnsi="Times New Roman" w:cs="Times New Roman"/>
-          <w:sz w:val="22"/>
-          <w:szCs w:val="22"/>
-          <w:highlight w:val="cyan"/>
-        </w:rPr>
-        <w:t xml:space="preserve"> </w:t>
-      </w:r>
-      <w:proofErr w:type="spellStart"/>
-      <w:r>
-        <w:rPr>
-          <w:rFonts w:ascii="Times New Roman" w:hAnsi="Times New Roman" w:cs="Times New Roman"/>
-          <w:sz w:val="22"/>
-          <w:szCs w:val="22"/>
-          <w:highlight w:val="cyan"/>
-        </w:rPr>
-        <w:t>el</w:t>
-      </w:r>
-      <w:r>
-        <w:rPr>
-          <w:rFonts w:ascii="Times New Roman" w:hAnsi="Times New Roman" w:cs="Times New Roman"/>
-          <w:sz w:val="22"/>
-          <w:szCs w:val="22"/>
-          <w:highlight w:val="cyan"/>
-        </w:rPr>
-        <w:t>if</w:t>
-      </w:r>
-      <w:proofErr w:type="spellEnd"/>
-      <w:r>
-        <w:rPr>
-          <w:rFonts w:ascii="Times New Roman" w:hAnsi="Times New Roman" w:cs="Times New Roman"/>
-          <w:sz w:val="22"/>
-          <w:szCs w:val="22"/>
-          <w:highlight w:val="cyan"/>
-        </w:rPr>
-        <w:t xml:space="preserve"> </w:t>
-      </w:r>
-      <w:proofErr w:type="spellStart"/>
-      <w:r>
-        <w:rPr>
-          <w:rFonts w:ascii="Times New Roman" w:hAnsi="Times New Roman" w:cs="Times New Roman"/>
-          <w:sz w:val="22"/>
-          <w:szCs w:val="22"/>
-          <w:highlight w:val="cyan"/>
-        </w:rPr>
-        <w:t>tool</w:t>
-      </w:r>
-      <w:r>
-        <w:rPr>
-          <w:rFonts w:ascii="Times New Roman" w:hAnsi="Times New Roman" w:cs="Times New Roman"/>
-          <w:sz w:val="22"/>
-          <w:szCs w:val="22"/>
-          <w:highlight w:val="cyan"/>
-        </w:rPr>
-        <w:t>_ID</w:t>
-      </w:r>
-      <w:proofErr w:type="spellEnd"/>
-      <w:r>
-        <w:rPr>
-          <w:rFonts w:ascii="Times New Roman" w:hAnsi="Times New Roman" w:cs="Times New Roman"/>
-          <w:sz w:val="22"/>
-          <w:szCs w:val="22"/>
-          <w:highlight w:val="cyan"/>
-        </w:rPr>
-        <w:t xml:space="preserve"> == </w:t>
-      </w:r>
-      <w:r>
-        <w:rPr>
-          <w:rFonts w:ascii="Times New Roman" w:hAnsi="Times New Roman" w:cs="Times New Roman"/>
-          <w:sz w:val="22"/>
-          <w:szCs w:val="22"/>
-          <w:highlight w:val="cyan"/>
-        </w:rPr>
-        <w:t>“</w:t>
-      </w:r>
-      <w:proofErr w:type="spellStart"/>
-      <w:r>
-        <w:rPr>
-          <w:rFonts w:ascii="Times New Roman" w:hAnsi="Times New Roman" w:cs="Times New Roman"/>
-          <w:sz w:val="22"/>
-          <w:szCs w:val="22"/>
-          <w:highlight w:val="cyan"/>
-        </w:rPr>
-        <w:t>divorce</w:t>
-      </w:r>
-      <w:r>
-        <w:rPr>
-          <w:rFonts w:ascii="Times New Roman" w:hAnsi="Times New Roman" w:cs="Times New Roman"/>
-          <w:sz w:val="22"/>
-          <w:szCs w:val="22"/>
-          <w:highlight w:val="cyan"/>
-        </w:rPr>
-        <w:t>_complaint</w:t>
-      </w:r>
-      <w:proofErr w:type="spellEnd"/>
-      <w:r>
-        <w:rPr>
-          <w:rFonts w:ascii="Times New Roman" w:hAnsi="Times New Roman" w:cs="Times New Roman"/>
-          <w:sz w:val="22"/>
-          <w:szCs w:val="22"/>
-          <w:highlight w:val="cyan"/>
-        </w:rPr>
-        <w:t>”</w:t>
-      </w:r>
-      <w:r>
-        <w:rPr>
-          <w:rFonts w:ascii="Times New Roman" w:hAnsi="Times New Roman" w:cs="Times New Roman"/>
-          <w:sz w:val="22"/>
-          <w:szCs w:val="22"/>
-          <w:highlight w:val="cyan"/>
-        </w:rPr>
-        <w:t xml:space="preserve"> %}</w:t>
-      </w:r>
-    </w:p>
-    <w:p>
-      <w:pPr>
-        <w:spacing w:after="0" w:line="276" w:lineRule="auto"/>
-        <w:rPr>
-          <w:rFonts w:ascii="Times New Roman" w:hAnsi="Times New Roman" w:cs="Times New Roman"/>
-          <w:sz w:val="22"/>
-          <w:szCs w:val="22"/>
-        </w:rPr>
-      </w:pPr>
-      <w:proofErr w:type="gramStart"/>
-      <w:r>
-        <w:rPr>
-          <w:rFonts w:ascii="Times New Roman" w:hAnsi="Times New Roman" w:cs="Times New Roman"/>
-          <w:sz w:val="22"/>
-          <w:szCs w:val="22"/>
-        </w:rPr>
-        <w:t>[ ]</w:t>
-      </w:r>
-      <w:proofErr w:type="gramEnd"/>
-      <w:r>
-        <w:rPr>
-          <w:rFonts w:ascii="Times New Roman" w:hAnsi="Times New Roman" w:cs="Times New Roman"/>
-          <w:sz w:val="22"/>
-          <w:szCs w:val="22"/>
-        </w:rPr>
-        <w:t xml:space="preserve"> </w:t>
-      </w:r>
-      <w:r>
-        <w:rPr>
-          <w:rFonts w:ascii="Times New Roman" w:hAnsi="Times New Roman" w:cs="Times New Roman"/>
-          <w:sz w:val="22"/>
-          <w:szCs w:val="22"/>
-        </w:rPr>
-        <w:t>Default Request and Entry</w:t>
-      </w:r>
-    </w:p>
-    <w:p>
-      <w:pPr>
-        <w:spacing w:after="0" w:line="276" w:lineRule="auto"/>
-        <w:rPr>
-          <w:rFonts w:ascii="Times New Roman" w:hAnsi="Times New Roman" w:cs="Times New Roman"/>
-          <w:sz w:val="22"/>
-          <w:szCs w:val="22"/>
-        </w:rPr>
-      </w:pPr>
-      <w:proofErr w:type="gramStart"/>
-      <w:r>
-        <w:rPr>
-          <w:rFonts w:ascii="Times New Roman" w:hAnsi="Times New Roman" w:cs="Times New Roman"/>
-          <w:sz w:val="22"/>
-          <w:szCs w:val="22"/>
-        </w:rPr>
-        <w:t>[ ]</w:t>
-      </w:r>
-      <w:proofErr w:type="gramEnd"/>
-      <w:r>
-        <w:rPr>
-          <w:rFonts w:ascii="Times New Roman" w:hAnsi="Times New Roman" w:cs="Times New Roman"/>
-          <w:sz w:val="22"/>
-          <w:szCs w:val="22"/>
-        </w:rPr>
-        <w:t xml:space="preserve"> Notice of Hearing</w:t>
-      </w:r>
-    </w:p>
-    <w:p>
-      <w:pPr>
-        <w:spacing w:after="0" w:line="276" w:lineRule="auto"/>
-        <w:rPr>
-          <w:rFonts w:ascii="Times New Roman" w:hAnsi="Times New Roman" w:cs="Times New Roman"/>
-          <w:sz w:val="22"/>
-          <w:szCs w:val="22"/>
-        </w:rPr>
-      </w:pPr>
-      <w:proofErr w:type="gramStart"/>
-      <w:r>
-        <w:rPr>
-          <w:rFonts w:ascii="Times New Roman" w:hAnsi="Times New Roman" w:cs="Times New Roman"/>
-          <w:sz w:val="22"/>
-          <w:szCs w:val="22"/>
-        </w:rPr>
-        <w:t>[ ]</w:t>
-      </w:r>
-      <w:proofErr w:type="gramEnd"/>
-      <w:r>
-        <w:rPr>
-          <w:rFonts w:ascii="Times New Roman" w:hAnsi="Times New Roman" w:cs="Times New Roman"/>
-          <w:sz w:val="22"/>
-          <w:szCs w:val="22"/>
-        </w:rPr>
-        <w:t xml:space="preserve"> Notice of Hearing and Motion for Entry of Consent Judgment of Divorce</w:t>
-      </w:r>
-    </w:p>
-    <w:p>
-      <w:pPr>
-        <w:spacing w:after="0" w:line="276" w:lineRule="auto"/>
-        <w:rPr>
-          <w:rFonts w:ascii="Times New Roman" w:hAnsi="Times New Roman" w:cs="Times New Roman"/>
-          <w:sz w:val="22"/>
-          <w:szCs w:val="22"/>
-        </w:rPr>
-      </w:pPr>
-      <w:proofErr w:type="gramStart"/>
-      <w:r>
-        <w:rPr>
-          <w:rFonts w:ascii="Times New Roman" w:hAnsi="Times New Roman" w:cs="Times New Roman"/>
-          <w:sz w:val="22"/>
-          <w:szCs w:val="22"/>
-        </w:rPr>
-        <w:t>[ ]</w:t>
-      </w:r>
-      <w:proofErr w:type="gramEnd"/>
-      <w:r>
-        <w:rPr>
-          <w:rFonts w:ascii="Times New Roman" w:hAnsi="Times New Roman" w:cs="Times New Roman"/>
-          <w:sz w:val="22"/>
-          <w:szCs w:val="22"/>
-        </w:rPr>
-        <w:t xml:space="preserve"> Notice of Hearing and Motion for Entry of Default Judgment of Divorce</w:t>
-      </w:r>
-    </w:p>
-    <w:p>
-      <w:pPr>
-        <w:spacing w:after="0" w:line="276" w:lineRule="auto"/>
-        <w:rPr>
-          <w:rFonts w:ascii="Times New Roman" w:hAnsi="Times New Roman" w:cs="Times New Roman"/>
-          <w:sz w:val="22"/>
-          <w:szCs w:val="22"/>
-        </w:rPr>
-      </w:pPr>
-      <w:proofErr w:type="gramStart"/>
-      <w:r>
-        <w:rPr>
-          <w:rFonts w:ascii="Times New Roman" w:hAnsi="Times New Roman" w:cs="Times New Roman"/>
-          <w:sz w:val="22"/>
-          <w:szCs w:val="22"/>
-        </w:rPr>
-        <w:t>[ ]</w:t>
-      </w:r>
-      <w:proofErr w:type="gramEnd"/>
-      <w:r>
-        <w:rPr>
-          <w:rFonts w:ascii="Times New Roman" w:hAnsi="Times New Roman" w:cs="Times New Roman"/>
-          <w:sz w:val="22"/>
-          <w:szCs w:val="22"/>
-        </w:rPr>
-        <w:t xml:space="preserve"> Proposed Judgment of Divorce</w:t>
-      </w:r>
-    </w:p>
-    <w:p>
-      <w:pPr>
-        <w:spacing w:after="0" w:line="240" w:lineRule="auto"/>
-        <w:rPr>
-          <w:rFonts w:ascii="Times New Roman" w:hAnsi="Times New Roman" w:cs="Times New Roman"/>
-          <w:sz w:val="22"/>
-          <w:szCs w:val="22"/>
-        </w:rPr>
-      </w:pPr>
-      <w:r>
-        <w:rPr>
-          <w:rFonts w:ascii="Times New Roman" w:hAnsi="Times New Roman" w:cs="Times New Roman"/>
-          <w:sz w:val="22"/>
-          <w:szCs w:val="22"/>
-          <w:highlight w:val="yellow"/>
-        </w:rPr>
-        <w:t xml:space="preserve">{%p if </w:t>
-      </w:r>
-      <w:proofErr w:type="spellStart"/>
-      <w:r>
-        <w:rPr>
-          <w:rFonts w:ascii="Times New Roman" w:hAnsi="Times New Roman" w:cs="Times New Roman"/>
-          <w:sz w:val="22"/>
-          <w:szCs w:val="22"/>
-          <w:highlight w:val="yellow"/>
-        </w:rPr>
-        <w:t>there_are_marital_</w:t>
-      </w:r>
-      <w:proofErr w:type="gramStart"/>
-      <w:r>
-        <w:rPr>
-          <w:rFonts w:ascii="Times New Roman" w:hAnsi="Times New Roman" w:cs="Times New Roman"/>
-          <w:sz w:val="22"/>
-          <w:szCs w:val="22"/>
-          <w:highlight w:val="yellow"/>
-        </w:rPr>
-        <w:t>children</w:t>
-      </w:r>
-      <w:proofErr w:type="spellEnd"/>
-      <w:r>
-        <w:rPr>
-          <w:rFonts w:ascii="Times New Roman" w:hAnsi="Times New Roman" w:cs="Times New Roman"/>
-          <w:sz w:val="22"/>
-          <w:szCs w:val="22"/>
-          <w:highlight w:val="yellow"/>
-        </w:rPr>
-        <w:t xml:space="preserve"> </w:t>
-      </w:r>
-      <w:r>
-        <w:rPr>
-          <w:rFonts w:ascii="Times New Roman" w:hAnsi="Times New Roman" w:cs="Times New Roman"/>
-          <w:sz w:val="22"/>
-          <w:szCs w:val="22"/>
-          <w:highlight w:val="yellow"/>
-        </w:rPr>
-        <w:t>%}</w:t>
-      </w:r>
-      <w:proofErr w:type="gramEnd"/>
-    </w:p>
-    <w:p>
-      <w:pPr>
-        <w:spacing w:after="0" w:line="276" w:lineRule="auto"/>
-        <w:rPr>
-          <w:rFonts w:ascii="Times New Roman" w:hAnsi="Times New Roman" w:cs="Times New Roman"/>
-          <w:sz w:val="22"/>
-          <w:szCs w:val="22"/>
-        </w:rPr>
-      </w:pPr>
-      <w:proofErr w:type="gramStart"/>
-      <w:r>
-        <w:rPr>
-          <w:rFonts w:ascii="Times New Roman" w:hAnsi="Times New Roman" w:cs="Times New Roman"/>
-          <w:sz w:val="22"/>
-          <w:szCs w:val="22"/>
-        </w:rPr>
-        <w:t>[ ]</w:t>
-      </w:r>
-      <w:proofErr w:type="gramEnd"/>
-      <w:r>
-        <w:rPr>
-          <w:rFonts w:ascii="Times New Roman" w:hAnsi="Times New Roman" w:cs="Times New Roman"/>
-          <w:sz w:val="22"/>
-          <w:szCs w:val="22"/>
-        </w:rPr>
-        <w:t xml:space="preserve"> Proposed Uniform Child Support Order</w:t>
-      </w:r>
-    </w:p>
-    <w:p>
-      <w:pPr>
-        <w:spacing w:after="0" w:line="240" w:lineRule="auto"/>
-        <w:rPr>
-          <w:rFonts w:ascii="Times New Roman" w:hAnsi="Times New Roman" w:cs="Times New Roman"/>
-          <w:sz w:val="22"/>
-          <w:szCs w:val="22"/>
-        </w:rPr>
-      </w:pPr>
-      <w:r>
-        <w:rPr>
-          <w:rFonts w:ascii="Times New Roman" w:hAnsi="Times New Roman" w:cs="Times New Roman"/>
-          <w:sz w:val="22"/>
-          <w:szCs w:val="22"/>
-          <w:highlight w:val="yellow"/>
-        </w:rPr>
-        <w:t xml:space="preserve">{%p </w:t>
-      </w:r>
-      <w:proofErr w:type="gramStart"/>
-      <w:r>
-        <w:rPr>
-          <w:rFonts w:ascii="Times New Roman" w:hAnsi="Times New Roman" w:cs="Times New Roman"/>
-          <w:sz w:val="22"/>
-          <w:szCs w:val="22"/>
-          <w:highlight w:val="yellow"/>
-        </w:rPr>
-        <w:t>endif %}</w:t>
-      </w:r>
-      <w:proofErr w:type="gramEnd"/>
-    </w:p>
-    <w:p>
-      <w:pPr>
-        <w:spacing w:after="0" w:line="240" w:lineRule="auto"/>
-        <w:rPr>
-          <w:rFonts w:ascii="Times New Roman" w:hAnsi="Times New Roman" w:cs="Times New Roman"/>
-          <w:sz w:val="22"/>
-          <w:szCs w:val="22"/>
-        </w:rPr>
-      </w:pPr>
-      <w:r>
-        <w:rPr>
-          <w:rFonts w:ascii="Times New Roman" w:hAnsi="Times New Roman" w:cs="Times New Roman"/>
-          <w:sz w:val="22"/>
-          <w:szCs w:val="22"/>
-          <w:highlight w:val="yellow"/>
-        </w:rPr>
-        <w:t xml:space="preserve">{%p if </w:t>
-      </w:r>
-      <w:proofErr w:type="spellStart"/>
-      <w:r>
-        <w:rPr>
-          <w:rFonts w:ascii="Times New Roman" w:hAnsi="Times New Roman" w:cs="Times New Roman"/>
-          <w:sz w:val="22"/>
-          <w:szCs w:val="22"/>
-          <w:highlight w:val="yellow"/>
-        </w:rPr>
-        <w:t>user_wants_post_divorce_support</w:t>
-      </w:r>
-      <w:proofErr w:type="spellEnd"/>
-      <w:r>
-        <w:rPr>
-          <w:rFonts w:ascii="Times New Roman" w:hAnsi="Times New Roman" w:cs="Times New Roman"/>
-          <w:sz w:val="22"/>
-          <w:szCs w:val="22"/>
-          <w:highlight w:val="yellow"/>
-        </w:rPr>
-        <w:t xml:space="preserve"> or </w:t>
-      </w:r>
-      <w:proofErr w:type="spellStart"/>
-      <w:r>
-        <w:rPr>
-          <w:rFonts w:ascii="Times New Roman" w:hAnsi="Times New Roman" w:cs="Times New Roman"/>
-          <w:sz w:val="22"/>
-          <w:szCs w:val="22"/>
-          <w:highlight w:val="yellow"/>
-        </w:rPr>
-        <w:t>spousal_support_provisions</w:t>
-      </w:r>
-      <w:proofErr w:type="spellEnd"/>
-      <w:r>
-        <w:rPr>
-          <w:rFonts w:ascii="Times New Roman" w:hAnsi="Times New Roman" w:cs="Times New Roman"/>
-          <w:sz w:val="22"/>
-          <w:szCs w:val="22"/>
-          <w:highlight w:val="yellow"/>
-        </w:rPr>
-        <w:t xml:space="preserve"> == "</w:t>
-      </w:r>
-      <w:proofErr w:type="spellStart"/>
-      <w:r>
-        <w:rPr>
-          <w:rFonts w:ascii="Times New Roman" w:hAnsi="Times New Roman" w:cs="Times New Roman"/>
-          <w:sz w:val="22"/>
-          <w:szCs w:val="22"/>
-          <w:highlight w:val="yellow"/>
-        </w:rPr>
-        <w:t>user_agrees_to_pay_spousal_support</w:t>
-      </w:r>
-      <w:proofErr w:type="spellEnd"/>
-      <w:proofErr w:type="gramStart"/>
-      <w:r>
-        <w:rPr>
-          <w:rFonts w:ascii="Times New Roman" w:hAnsi="Times New Roman" w:cs="Times New Roman"/>
-          <w:sz w:val="22"/>
-          <w:szCs w:val="22"/>
-          <w:highlight w:val="yellow"/>
-        </w:rPr>
-        <w:t>"</w:t>
-      </w:r>
-      <w:r>
-        <w:rPr>
-          <w:rFonts w:ascii="Times New Roman" w:hAnsi="Times New Roman" w:cs="Times New Roman"/>
-          <w:sz w:val="22"/>
-          <w:szCs w:val="22"/>
-          <w:highlight w:val="yellow"/>
-        </w:rPr>
-        <w:t xml:space="preserve"> </w:t>
-      </w:r>
-      <w:r>
-        <w:rPr>
-          <w:rFonts w:ascii="Times New Roman" w:hAnsi="Times New Roman" w:cs="Times New Roman"/>
-          <w:sz w:val="22"/>
-          <w:szCs w:val="22"/>
-          <w:highlight w:val="yellow"/>
-        </w:rPr>
-        <w:t>%}</w:t>
-      </w:r>
-      <w:proofErr w:type="gramEnd"/>
-    </w:p>
-    <w:p>
-      <w:pPr>
-        <w:spacing w:after="0" w:line="276" w:lineRule="auto"/>
-        <w:rPr>
-          <w:rFonts w:ascii="Times New Roman" w:hAnsi="Times New Roman" w:cs="Times New Roman"/>
-          <w:sz w:val="22"/>
-          <w:szCs w:val="22"/>
-        </w:rPr>
-      </w:pPr>
-      <w:proofErr w:type="gramStart"/>
-      <w:r>
-        <w:rPr>
-          <w:rFonts w:ascii="Times New Roman" w:hAnsi="Times New Roman" w:cs="Times New Roman"/>
-          <w:sz w:val="22"/>
-          <w:szCs w:val="22"/>
-        </w:rPr>
-        <w:t>[ ]</w:t>
-      </w:r>
-      <w:proofErr w:type="gramEnd"/>
-      <w:r>
-        <w:rPr>
-          <w:rFonts w:ascii="Times New Roman" w:hAnsi="Times New Roman" w:cs="Times New Roman"/>
-          <w:sz w:val="22"/>
-          <w:szCs w:val="22"/>
-        </w:rPr>
-        <w:t xml:space="preserve"> Proposed Uniform Spousal Support Order</w:t>
-      </w:r>
-    </w:p>
-    <w:p>
-      <w:pPr>
-        <w:spacing w:after="0" w:line="240" w:lineRule="auto"/>
-        <w:rPr>
-          <w:rFonts w:ascii="Times New Roman" w:hAnsi="Times New Roman" w:cs="Times New Roman"/>
-          <w:sz w:val="22"/>
-          <w:szCs w:val="22"/>
-        </w:rPr>
-      </w:pPr>
-      <w:r>
-        <w:rPr>
-          <w:rFonts w:ascii="Times New Roman" w:hAnsi="Times New Roman" w:cs="Times New Roman"/>
-          <w:sz w:val="22"/>
-          <w:szCs w:val="22"/>
-          <w:highlight w:val="yellow"/>
-        </w:rPr>
-        <w:t xml:space="preserve">{%p </w:t>
-      </w:r>
-      <w:proofErr w:type="gramStart"/>
-      <w:r>
-        <w:rPr>
-          <w:rFonts w:ascii="Times New Roman" w:hAnsi="Times New Roman" w:cs="Times New Roman"/>
-          <w:sz w:val="22"/>
-          <w:szCs w:val="22"/>
-          <w:highlight w:val="yellow"/>
-        </w:rPr>
-        <w:t>endif %}</w:t>
-      </w:r>
-      <w:proofErr w:type="gramEnd"/>
-    </w:p>
-    <w:p>
-      <w:pPr>
-        <w:spacing w:after="0" w:line="276" w:lineRule="auto"/>
-        <w:rPr>
-          <w:rFonts w:ascii="Times New Roman" w:hAnsi="Times New Roman" w:cs="Times New Roman"/>
-          <w:sz w:val="22"/>
-          <w:szCs w:val="22"/>
-        </w:rPr>
-      </w:pPr>
-      <w:proofErr w:type="gramStart"/>
-      <w:r>
-        <w:rPr>
-          <w:rFonts w:ascii="Times New Roman" w:hAnsi="Times New Roman" w:cs="Times New Roman"/>
-          <w:sz w:val="22"/>
-          <w:szCs w:val="22"/>
-        </w:rPr>
-        <w:t>[ ]</w:t>
-      </w:r>
-      <w:proofErr w:type="gramEnd"/>
-      <w:r>
-        <w:rPr>
-          <w:rFonts w:ascii="Times New Roman" w:hAnsi="Times New Roman" w:cs="Times New Roman"/>
-          <w:sz w:val="22"/>
-          <w:szCs w:val="22"/>
-        </w:rPr>
         <w:t xml:space="preserve"> Judgment of Divorce</w:t>
       </w:r>
-    </w:p>
-    <w:p>
-      <w:pPr>
-        <w:spacing w:after="0" w:line="240" w:lineRule="auto"/>
-        <w:rPr>
-          <w:rFonts w:ascii="Times New Roman" w:hAnsi="Times New Roman" w:cs="Times New Roman"/>
-          <w:sz w:val="22"/>
-          <w:szCs w:val="22"/>
-        </w:rPr>
-      </w:pPr>
-      <w:r>
-        <w:rPr>
-          <w:rFonts w:ascii="Times New Roman" w:hAnsi="Times New Roman" w:cs="Times New Roman"/>
-          <w:sz w:val="22"/>
-          <w:szCs w:val="22"/>
-          <w:highlight w:val="yellow"/>
-        </w:rPr>
-        <w:t xml:space="preserve">{%p if </w:t>
-      </w:r>
-      <w:proofErr w:type="spellStart"/>
-      <w:r>
-        <w:rPr>
-          <w:rFonts w:ascii="Times New Roman" w:hAnsi="Times New Roman" w:cs="Times New Roman"/>
-          <w:sz w:val="22"/>
-          <w:szCs w:val="22"/>
-          <w:highlight w:val="yellow"/>
-        </w:rPr>
-        <w:t>there_are_marital_</w:t>
-      </w:r>
-      <w:proofErr w:type="gramStart"/>
-      <w:r>
-        <w:rPr>
-          <w:rFonts w:ascii="Times New Roman" w:hAnsi="Times New Roman" w:cs="Times New Roman"/>
-          <w:sz w:val="22"/>
-          <w:szCs w:val="22"/>
-          <w:highlight w:val="yellow"/>
-        </w:rPr>
-        <w:t>children</w:t>
-      </w:r>
-      <w:proofErr w:type="spellEnd"/>
-      <w:r>
-        <w:rPr>
-          <w:rFonts w:ascii="Times New Roman" w:hAnsi="Times New Roman" w:cs="Times New Roman"/>
-          <w:sz w:val="22"/>
-          <w:szCs w:val="22"/>
-          <w:highlight w:val="yellow"/>
-        </w:rPr>
-        <w:t xml:space="preserve"> </w:t>
-      </w:r>
-      <w:r>
-        <w:rPr>
-          <w:rFonts w:ascii="Times New Roman" w:hAnsi="Times New Roman" w:cs="Times New Roman"/>
-          <w:sz w:val="22"/>
-          <w:szCs w:val="22"/>
-          <w:highlight w:val="yellow"/>
-        </w:rPr>
-        <w:t>%}</w:t>
-      </w:r>
-      <w:proofErr w:type="gramEnd"/>
-    </w:p>
-    <w:p>
-      <w:pPr>
-        <w:spacing w:after="0" w:line="276" w:lineRule="auto"/>
-        <w:rPr>
-          <w:rFonts w:ascii="Times New Roman" w:hAnsi="Times New Roman" w:cs="Times New Roman"/>
-          <w:sz w:val="22"/>
-          <w:szCs w:val="22"/>
-        </w:rPr>
-      </w:pPr>
-      <w:proofErr w:type="gramStart"/>
-      <w:r>
-        <w:rPr>
-          <w:rFonts w:ascii="Times New Roman" w:hAnsi="Times New Roman" w:cs="Times New Roman"/>
-          <w:sz w:val="22"/>
-          <w:szCs w:val="22"/>
-        </w:rPr>
-        <w:t>[ ]</w:t>
-      </w:r>
-      <w:proofErr w:type="gramEnd"/>
-      <w:r>
-        <w:rPr>
-          <w:rFonts w:ascii="Times New Roman" w:hAnsi="Times New Roman" w:cs="Times New Roman"/>
-          <w:sz w:val="22"/>
-          <w:szCs w:val="22"/>
-        </w:rPr>
-        <w:t xml:space="preserve"> Uniform Child Support Order</w:t>
-      </w:r>
-    </w:p>
-    <w:p>
-      <w:pPr>
-        <w:spacing w:after="0" w:line="240" w:lineRule="auto"/>
-        <w:rPr>
-          <w:rFonts w:ascii="Times New Roman" w:hAnsi="Times New Roman" w:cs="Times New Roman"/>
-          <w:sz w:val="22"/>
-          <w:szCs w:val="22"/>
-        </w:rPr>
-      </w:pPr>
-      <w:r>
-        <w:rPr>
-          <w:rFonts w:ascii="Times New Roman" w:hAnsi="Times New Roman" w:cs="Times New Roman"/>
-          <w:sz w:val="22"/>
-          <w:szCs w:val="22"/>
-          <w:highlight w:val="yellow"/>
-        </w:rPr>
-        <w:t xml:space="preserve">{%p </w:t>
-      </w:r>
-      <w:proofErr w:type="gramStart"/>
-      <w:r>
-        <w:rPr>
-          <w:rFonts w:ascii="Times New Roman" w:hAnsi="Times New Roman" w:cs="Times New Roman"/>
-          <w:sz w:val="22"/>
-          <w:szCs w:val="22"/>
-          <w:highlight w:val="yellow"/>
-        </w:rPr>
-        <w:t>endif %}</w:t>
-      </w:r>
-      <w:proofErr w:type="gramEnd"/>
-    </w:p>
-    <w:p>
-      <w:pPr>
-        <w:spacing w:after="0" w:line="240" w:lineRule="auto"/>
-        <w:rPr>
-          <w:rFonts w:ascii="Times New Roman" w:hAnsi="Times New Roman" w:cs="Times New Roman"/>
-          <w:sz w:val="22"/>
-          <w:szCs w:val="22"/>
-        </w:rPr>
-      </w:pPr>
-      <w:r>
-        <w:rPr>
-          <w:rFonts w:ascii="Times New Roman" w:hAnsi="Times New Roman" w:cs="Times New Roman"/>
-          <w:sz w:val="22"/>
-          <w:szCs w:val="22"/>
-          <w:highlight w:val="yellow"/>
-        </w:rPr>
-        <w:t xml:space="preserve">{%p if </w:t>
-      </w:r>
-      <w:proofErr w:type="spellStart"/>
-      <w:r>
-        <w:rPr>
-          <w:rFonts w:ascii="Times New Roman" w:hAnsi="Times New Roman" w:cs="Times New Roman"/>
-          <w:sz w:val="22"/>
-          <w:szCs w:val="22"/>
-          <w:highlight w:val="yellow"/>
-        </w:rPr>
-        <w:t>user_wants_post_divorce_support</w:t>
-      </w:r>
-      <w:proofErr w:type="spellEnd"/>
-      <w:r>
-        <w:rPr>
-          <w:rFonts w:ascii="Times New Roman" w:hAnsi="Times New Roman" w:cs="Times New Roman"/>
-          <w:sz w:val="22"/>
-          <w:szCs w:val="22"/>
-          <w:highlight w:val="yellow"/>
-        </w:rPr>
-        <w:t xml:space="preserve"> or </w:t>
-      </w:r>
-      <w:proofErr w:type="spellStart"/>
-      <w:r>
-        <w:rPr>
-          <w:rFonts w:ascii="Times New Roman" w:hAnsi="Times New Roman" w:cs="Times New Roman"/>
-          <w:sz w:val="22"/>
-          <w:szCs w:val="22"/>
-          <w:highlight w:val="yellow"/>
-        </w:rPr>
-        <w:t>spousal_support_provisions</w:t>
-      </w:r>
-      <w:proofErr w:type="spellEnd"/>
-      <w:r>
-        <w:rPr>
-          <w:rFonts w:ascii="Times New Roman" w:hAnsi="Times New Roman" w:cs="Times New Roman"/>
-          <w:sz w:val="22"/>
-          <w:szCs w:val="22"/>
-          <w:highlight w:val="yellow"/>
-        </w:rPr>
-        <w:t xml:space="preserve"> == "</w:t>
-      </w:r>
-      <w:proofErr w:type="spellStart"/>
-      <w:r>
-        <w:rPr>
-          <w:rFonts w:ascii="Times New Roman" w:hAnsi="Times New Roman" w:cs="Times New Roman"/>
-          <w:sz w:val="22"/>
-          <w:szCs w:val="22"/>
-          <w:highlight w:val="yellow"/>
-        </w:rPr>
-        <w:t>user_agrees_to_pay_spousal_support</w:t>
-      </w:r>
-      <w:proofErr w:type="spellEnd"/>
-      <w:proofErr w:type="gramStart"/>
-      <w:r>
-        <w:rPr>
-          <w:rFonts w:ascii="Times New Roman" w:hAnsi="Times New Roman" w:cs="Times New Roman"/>
-          <w:sz w:val="22"/>
-          <w:szCs w:val="22"/>
-          <w:highlight w:val="yellow"/>
-        </w:rPr>
-        <w:t>"</w:t>
-      </w:r>
-      <w:r>
-        <w:rPr>
-          <w:rFonts w:ascii="Times New Roman" w:hAnsi="Times New Roman" w:cs="Times New Roman"/>
-          <w:sz w:val="22"/>
-          <w:szCs w:val="22"/>
-          <w:highlight w:val="yellow"/>
-        </w:rPr>
-        <w:t xml:space="preserve"> </w:t>
-      </w:r>
-      <w:r>
-        <w:rPr>
-          <w:rFonts w:ascii="Times New Roman" w:hAnsi="Times New Roman" w:cs="Times New Roman"/>
-          <w:sz w:val="22"/>
-          <w:szCs w:val="22"/>
-          <w:highlight w:val="yellow"/>
-        </w:rPr>
-        <w:t>%}</w:t>
-      </w:r>
-      <w:proofErr w:type="gramEnd"/>
-    </w:p>
-    <w:p>
-      <w:pPr>
-        <w:spacing w:after="0" w:line="276" w:lineRule="auto"/>
-        <w:rPr>
-          <w:rFonts w:ascii="Times New Roman" w:hAnsi="Times New Roman" w:cs="Times New Roman"/>
-          <w:sz w:val="22"/>
-          <w:szCs w:val="22"/>
-        </w:rPr>
-      </w:pPr>
-      <w:proofErr w:type="gramStart"/>
-      <w:r>
-        <w:rPr>
-          <w:rFonts w:ascii="Times New Roman" w:hAnsi="Times New Roman" w:cs="Times New Roman"/>
-          <w:sz w:val="22"/>
-          <w:szCs w:val="22"/>
-        </w:rPr>
-        <w:t>[ ]</w:t>
-      </w:r>
-      <w:proofErr w:type="gramEnd"/>
-      <w:r>
-        <w:rPr>
-          <w:rFonts w:ascii="Times New Roman" w:hAnsi="Times New Roman" w:cs="Times New Roman"/>
-          <w:sz w:val="22"/>
-          <w:szCs w:val="22"/>
-        </w:rPr>
-        <w:t xml:space="preserve"> Uniform Spousal Support Order</w:t>
-      </w:r>
-    </w:p>
-    <w:p>
-      <w:pPr>
-        <w:spacing w:after="0" w:line="240" w:lineRule="auto"/>
-        <w:rPr>
-          <w:rFonts w:ascii="Times New Roman" w:hAnsi="Times New Roman" w:cs="Times New Roman"/>
-          <w:sz w:val="22"/>
-          <w:szCs w:val="22"/>
-        </w:rPr>
-      </w:pPr>
-      <w:r>
-        <w:rPr>
-          <w:rFonts w:ascii="Times New Roman" w:hAnsi="Times New Roman" w:cs="Times New Roman"/>
-          <w:sz w:val="22"/>
-          <w:szCs w:val="22"/>
-          <w:highlight w:val="yellow"/>
-        </w:rPr>
-        <w:t xml:space="preserve">{%p </w:t>
-      </w:r>
-      <w:proofErr w:type="gramStart"/>
-      <w:r>
-        <w:rPr>
-          <w:rFonts w:ascii="Times New Roman" w:hAnsi="Times New Roman" w:cs="Times New Roman"/>
-          <w:sz w:val="22"/>
-          <w:szCs w:val="22"/>
-          <w:highlight w:val="yellow"/>
-        </w:rPr>
-        <w:t>endif %}</w:t>
-      </w:r>
-      <w:proofErr w:type="gramEnd"/>
-    </w:p>
-    <w:p>
-      <w:pPr>
-        <w:spacing w:after="0" w:line="240" w:lineRule="auto"/>
-        <w:rPr>
-          <w:rFonts w:ascii="Times New Roman" w:hAnsi="Times New Roman" w:cs="Times New Roman"/>
-          <w:sz w:val="22"/>
-          <w:szCs w:val="22"/>
-        </w:rPr>
-      </w:pPr>
-      <w:r>
-        <w:rPr>
-          <w:rFonts w:ascii="Times New Roman" w:hAnsi="Times New Roman" w:cs="Times New Roman"/>
-          <w:sz w:val="22"/>
-          <w:szCs w:val="22"/>
-          <w:highlight w:val="yellow"/>
-        </w:rPr>
-        <w:t xml:space="preserve">{%p </w:t>
-      </w:r>
-      <w:r>
-        <w:rPr>
-          <w:rFonts w:ascii="Times New Roman" w:hAnsi="Times New Roman" w:cs="Times New Roman"/>
-          <w:sz w:val="22"/>
-          <w:szCs w:val="22"/>
-          <w:highlight w:val="yellow"/>
-        </w:rPr>
-        <w:t>if foc_100_</w:t>
-      </w:r>
-      <w:proofErr w:type="gramStart"/>
-      <w:r>
-        <w:rPr>
-          <w:rFonts w:ascii="Times New Roman" w:hAnsi="Times New Roman" w:cs="Times New Roman"/>
-          <w:sz w:val="22"/>
-          <w:szCs w:val="22"/>
-          <w:highlight w:val="yellow"/>
-        </w:rPr>
-        <w:t>full.enabled</w:t>
-      </w:r>
-      <w:proofErr w:type="gramEnd"/>
-      <w:r>
-        <w:rPr>
-          <w:rFonts w:ascii="Times New Roman" w:hAnsi="Times New Roman" w:cs="Times New Roman"/>
-          <w:sz w:val="22"/>
-          <w:szCs w:val="22"/>
-          <w:highlight w:val="yellow"/>
-        </w:rPr>
-        <w:t xml:space="preserve"> </w:t>
-      </w:r>
-      <w:r>
-        <w:rPr>
-          <w:rFonts w:ascii="Times New Roman" w:hAnsi="Times New Roman" w:cs="Times New Roman"/>
-          <w:sz w:val="22"/>
-          <w:szCs w:val="22"/>
-          <w:highlight w:val="yellow"/>
-        </w:rPr>
-        <w:t>%</w:t>
-      </w:r>
-      <w:r>
-        <w:rPr>
-          <w:rFonts w:ascii="Times New Roman" w:hAnsi="Times New Roman" w:cs="Times New Roman"/>
-          <w:sz w:val="22"/>
-          <w:szCs w:val="22"/>
-          <w:highlight w:val="yellow"/>
-        </w:rPr>
-        <w:t>}</w:t>
-      </w:r>
-    </w:p>
-    <w:p>
-      <w:pPr>
-        <w:spacing w:after="0" w:line="276" w:lineRule="auto"/>
-        <w:rPr>
-          <w:rFonts w:ascii="Times New Roman" w:hAnsi="Times New Roman" w:cs="Times New Roman"/>
-          <w:sz w:val="22"/>
-          <w:szCs w:val="22"/>
-        </w:rPr>
-      </w:pPr>
-      <w:proofErr w:type="gramStart"/>
-      <w:r>
-        <w:rPr>
-          <w:rFonts w:ascii="Times New Roman" w:hAnsi="Times New Roman" w:cs="Times New Roman"/>
-          <w:sz w:val="22"/>
-          <w:szCs w:val="22"/>
-        </w:rPr>
-        <w:t>[ ]</w:t>
-      </w:r>
-      <w:proofErr w:type="gramEnd"/>
-      <w:r>
-        <w:rPr>
-          <w:rFonts w:ascii="Times New Roman" w:hAnsi="Times New Roman" w:cs="Times New Roman"/>
-          <w:sz w:val="22"/>
-          <w:szCs w:val="22"/>
-        </w:rPr>
-        <w:t xml:space="preserve"> Domestic Relations Judgment Information Form</w:t>
-      </w:r>
-    </w:p>
-    <w:p>
-      <w:pPr>
-        <w:spacing w:after="0" w:line="240" w:lineRule="auto"/>
-        <w:rPr>
-          <w:rFonts w:ascii="Times New Roman" w:hAnsi="Times New Roman" w:cs="Times New Roman"/>
-          <w:sz w:val="22"/>
-          <w:szCs w:val="22"/>
-        </w:rPr>
-      </w:pPr>
-      <w:r>
-        <w:rPr>
-          <w:rFonts w:ascii="Times New Roman" w:hAnsi="Times New Roman" w:cs="Times New Roman"/>
-          <w:sz w:val="22"/>
-          <w:szCs w:val="22"/>
-          <w:highlight w:val="yellow"/>
-        </w:rPr>
-        <w:t xml:space="preserve">{%p </w:t>
-      </w:r>
-      <w:proofErr w:type="gramStart"/>
-      <w:r>
-        <w:rPr>
-          <w:rFonts w:ascii="Times New Roman" w:hAnsi="Times New Roman" w:cs="Times New Roman"/>
-          <w:sz w:val="22"/>
-          <w:szCs w:val="22"/>
-          <w:highlight w:val="yellow"/>
-        </w:rPr>
-        <w:t>endif %}</w:t>
-      </w:r>
-      <w:proofErr w:type="gramEnd"/>
-    </w:p>
-    <w:p>
-      <w:pPr>
-        <w:spacing w:after="0" w:line="276" w:lineRule="auto"/>
-        <w:rPr>
-          <w:rFonts w:ascii="Times New Roman" w:hAnsi="Times New Roman" w:cs="Times New Roman"/>
-          <w:sz w:val="22"/>
-          <w:szCs w:val="22"/>
-        </w:rPr>
-      </w:pPr>
-      <w:proofErr w:type="gramStart"/>
-      <w:r>
-        <w:rPr>
-          <w:rFonts w:ascii="Times New Roman" w:hAnsi="Times New Roman" w:cs="Times New Roman"/>
-          <w:sz w:val="22"/>
-          <w:szCs w:val="22"/>
-        </w:rPr>
-        <w:t>[ ]</w:t>
-      </w:r>
-      <w:proofErr w:type="gramEnd"/>
-      <w:r>
-        <w:rPr>
-          <w:rFonts w:ascii="Times New Roman" w:hAnsi="Times New Roman" w:cs="Times New Roman"/>
-          <w:sz w:val="22"/>
-          <w:szCs w:val="22"/>
-        </w:rPr>
-        <w:t xml:space="preserve"> Domestic Relations Verified Financial Information Form</w:t>
-      </w:r>
-    </w:p>
-    <w:p>
-      <w:pPr>
-        <w:spacing w:after="0" w:line="240" w:lineRule="auto"/>
-        <w:rPr>
-          <w:rFonts w:ascii="Times New Roman" w:hAnsi="Times New Roman" w:cs="Times New Roman"/>
-          <w:sz w:val="22"/>
-          <w:szCs w:val="22"/>
-        </w:rPr>
-      </w:pPr>
-      <w:r>
-        <w:rPr>
-          <w:rFonts w:ascii="Times New Roman" w:hAnsi="Times New Roman" w:cs="Times New Roman"/>
-          <w:sz w:val="22"/>
-          <w:szCs w:val="22"/>
-          <w:highlight w:val="cyan"/>
-        </w:rPr>
-        <w:t xml:space="preserve">{%p </w:t>
-      </w:r>
-      <w:proofErr w:type="spellStart"/>
-      <w:r>
-        <w:rPr>
-          <w:rFonts w:ascii="Times New Roman" w:hAnsi="Times New Roman" w:cs="Times New Roman"/>
-          <w:sz w:val="22"/>
-          <w:szCs w:val="22"/>
-          <w:highlight w:val="cyan"/>
-        </w:rPr>
-        <w:t>el</w:t>
-      </w:r>
-      <w:r>
-        <w:rPr>
-          <w:rFonts w:ascii="Times New Roman" w:hAnsi="Times New Roman" w:cs="Times New Roman"/>
-          <w:sz w:val="22"/>
-          <w:szCs w:val="22"/>
-          <w:highlight w:val="cyan"/>
-        </w:rPr>
-        <w:t>if</w:t>
-      </w:r>
-      <w:proofErr w:type="spellEnd"/>
-      <w:r>
-        <w:rPr>
-          <w:rFonts w:ascii="Times New Roman" w:hAnsi="Times New Roman" w:cs="Times New Roman"/>
-          <w:sz w:val="22"/>
-          <w:szCs w:val="22"/>
-          <w:highlight w:val="cyan"/>
-        </w:rPr>
-        <w:t xml:space="preserve"> </w:t>
-      </w:r>
-      <w:proofErr w:type="spellStart"/>
-      <w:r>
-        <w:rPr>
-          <w:rFonts w:ascii="Times New Roman" w:hAnsi="Times New Roman" w:cs="Times New Roman"/>
-          <w:sz w:val="22"/>
-          <w:szCs w:val="22"/>
-          <w:highlight w:val="cyan"/>
-        </w:rPr>
-        <w:t>tool</w:t>
-      </w:r>
-      <w:r>
-        <w:rPr>
-          <w:rFonts w:ascii="Times New Roman" w:hAnsi="Times New Roman" w:cs="Times New Roman"/>
-          <w:sz w:val="22"/>
-          <w:szCs w:val="22"/>
-          <w:highlight w:val="cyan"/>
-        </w:rPr>
-        <w:t>_ID</w:t>
-      </w:r>
-      <w:proofErr w:type="spellEnd"/>
-      <w:r>
-        <w:rPr>
-          <w:rFonts w:ascii="Times New Roman" w:hAnsi="Times New Roman" w:cs="Times New Roman"/>
-          <w:sz w:val="22"/>
-          <w:szCs w:val="22"/>
-          <w:highlight w:val="cyan"/>
-        </w:rPr>
-        <w:t xml:space="preserve"> == </w:t>
-      </w:r>
-      <w:r>
-        <w:rPr>
-          <w:rFonts w:ascii="Times New Roman" w:hAnsi="Times New Roman" w:cs="Times New Roman"/>
-          <w:sz w:val="22"/>
-          <w:szCs w:val="22"/>
-          <w:highlight w:val="cyan"/>
-        </w:rPr>
-        <w:t>“</w:t>
-      </w:r>
-      <w:proofErr w:type="spellStart"/>
-      <w:r>
-        <w:rPr>
-          <w:rFonts w:ascii="Times New Roman" w:hAnsi="Times New Roman" w:cs="Times New Roman"/>
-          <w:sz w:val="22"/>
-          <w:szCs w:val="22"/>
-          <w:highlight w:val="cyan"/>
-        </w:rPr>
-        <w:t>JOD_only</w:t>
-      </w:r>
-      <w:proofErr w:type="spellEnd"/>
-      <w:r>
-        <w:rPr>
-          <w:rFonts w:ascii="Times New Roman" w:hAnsi="Times New Roman" w:cs="Times New Roman"/>
-          <w:sz w:val="22"/>
-          <w:szCs w:val="22"/>
-          <w:highlight w:val="cyan"/>
-        </w:rPr>
-        <w:t>”</w:t>
-      </w:r>
-      <w:r>
-        <w:rPr>
-          <w:rFonts w:ascii="Times New Roman" w:hAnsi="Times New Roman" w:cs="Times New Roman"/>
-          <w:sz w:val="22"/>
-          <w:szCs w:val="22"/>
-          <w:highlight w:val="cyan"/>
-        </w:rPr>
-        <w:t xml:space="preserve"> %}</w:t>
-      </w:r>
-    </w:p>
-    <w:p>
-      <w:pPr>
-        <w:spacing w:after="0" w:line="276" w:lineRule="auto"/>
-        <w:rPr>
-          <w:rFonts w:ascii="Times New Roman" w:hAnsi="Times New Roman" w:cs="Times New Roman"/>
-          <w:sz w:val="22"/>
-          <w:szCs w:val="22"/>
-        </w:rPr>
-      </w:pPr>
-      <w:proofErr w:type="gramStart"/>
-      <w:r>
-        <w:rPr>
-          <w:rFonts w:ascii="Times New Roman" w:hAnsi="Times New Roman" w:cs="Times New Roman"/>
-          <w:sz w:val="22"/>
-          <w:szCs w:val="22"/>
-        </w:rPr>
-        <w:t>[ ]</w:t>
-      </w:r>
-      <w:proofErr w:type="gramEnd"/>
-      <w:r>
-        <w:rPr>
-          <w:rFonts w:ascii="Times New Roman" w:hAnsi="Times New Roman" w:cs="Times New Roman"/>
-          <w:sz w:val="22"/>
-          <w:szCs w:val="22"/>
-        </w:rPr>
-        <w:t xml:space="preserve"> Notice of Hearing</w:t>
-      </w:r>
-    </w:p>
-    <w:p>
-      <w:pPr>
-        <w:spacing w:after="0" w:line="276" w:lineRule="auto"/>
-        <w:rPr>
-          <w:rFonts w:ascii="Times New Roman" w:hAnsi="Times New Roman" w:cs="Times New Roman"/>
-          <w:sz w:val="22"/>
-          <w:szCs w:val="22"/>
-        </w:rPr>
-      </w:pPr>
-      <w:proofErr w:type="gramStart"/>
-      <w:r>
-        <w:rPr>
-          <w:rFonts w:ascii="Times New Roman" w:hAnsi="Times New Roman" w:cs="Times New Roman"/>
-          <w:sz w:val="22"/>
-          <w:szCs w:val="22"/>
-        </w:rPr>
-        <w:t>[ ]</w:t>
-      </w:r>
-      <w:proofErr w:type="gramEnd"/>
-      <w:r>
-        <w:rPr>
-          <w:rFonts w:ascii="Times New Roman" w:hAnsi="Times New Roman" w:cs="Times New Roman"/>
-          <w:sz w:val="22"/>
-          <w:szCs w:val="22"/>
-        </w:rPr>
-        <w:t xml:space="preserve"> Notice of Hearing and Motion for Entry of Consent Judgment of Divorce</w:t>
-      </w:r>
-    </w:p>
-    <w:p>
-      <w:pPr>
-        <w:spacing w:after="0" w:line="276" w:lineRule="auto"/>
-        <w:rPr>
-          <w:rFonts w:ascii="Times New Roman" w:hAnsi="Times New Roman" w:cs="Times New Roman"/>
-          <w:sz w:val="22"/>
-          <w:szCs w:val="22"/>
-        </w:rPr>
-      </w:pPr>
-      <w:proofErr w:type="gramStart"/>
-      <w:r>
-        <w:rPr>
-          <w:rFonts w:ascii="Times New Roman" w:hAnsi="Times New Roman" w:cs="Times New Roman"/>
-          <w:sz w:val="22"/>
-          <w:szCs w:val="22"/>
-        </w:rPr>
-        <w:t>[ ]</w:t>
-      </w:r>
-      <w:proofErr w:type="gramEnd"/>
-      <w:r>
-        <w:rPr>
-          <w:rFonts w:ascii="Times New Roman" w:hAnsi="Times New Roman" w:cs="Times New Roman"/>
-          <w:sz w:val="22"/>
-          <w:szCs w:val="22"/>
-        </w:rPr>
-        <w:t xml:space="preserve"> Notice of Hearing and Motion for Entry of Default Judgment of Divorce</w:t>
-      </w:r>
-    </w:p>
-    <w:p>
-      <w:pPr>
-        <w:spacing w:after="0" w:line="276" w:lineRule="auto"/>
-        <w:rPr>
-          <w:rFonts w:ascii="Times New Roman" w:hAnsi="Times New Roman" w:cs="Times New Roman"/>
-          <w:sz w:val="22"/>
-          <w:szCs w:val="22"/>
-        </w:rPr>
-      </w:pPr>
-      <w:proofErr w:type="gramStart"/>
-      <w:r>
-        <w:rPr>
-          <w:rFonts w:ascii="Times New Roman" w:hAnsi="Times New Roman" w:cs="Times New Roman"/>
-          <w:sz w:val="22"/>
-          <w:szCs w:val="22"/>
-        </w:rPr>
-        <w:t>[ ]</w:t>
-      </w:r>
-      <w:proofErr w:type="gramEnd"/>
-      <w:r>
-        <w:rPr>
-          <w:rFonts w:ascii="Times New Roman" w:hAnsi="Times New Roman" w:cs="Times New Roman"/>
-          <w:sz w:val="22"/>
-          <w:szCs w:val="22"/>
-        </w:rPr>
-        <w:t xml:space="preserve"> Proposed Judgment of Divorce</w:t>
-      </w:r>
-    </w:p>
-    <w:p>
-      <w:pPr>
-        <w:spacing w:after="0" w:line="240" w:lineRule="auto"/>
-        <w:rPr>
-          <w:rFonts w:ascii="Times New Roman" w:hAnsi="Times New Roman" w:cs="Times New Roman"/>
-          <w:sz w:val="22"/>
-          <w:szCs w:val="22"/>
-        </w:rPr>
-      </w:pPr>
-      <w:r>
-        <w:rPr>
-          <w:rFonts w:ascii="Times New Roman" w:hAnsi="Times New Roman" w:cs="Times New Roman"/>
-          <w:sz w:val="22"/>
-          <w:szCs w:val="22"/>
-          <w:highlight w:val="yellow"/>
-        </w:rPr>
-        <w:t xml:space="preserve">{%p if </w:t>
-      </w:r>
-      <w:proofErr w:type="spellStart"/>
-      <w:r>
-        <w:rPr>
-          <w:rFonts w:ascii="Times New Roman" w:hAnsi="Times New Roman" w:cs="Times New Roman"/>
-          <w:sz w:val="22"/>
-          <w:szCs w:val="22"/>
-          <w:highlight w:val="yellow"/>
-        </w:rPr>
-        <w:t>there_are_marital_</w:t>
-      </w:r>
-      <w:proofErr w:type="gramStart"/>
-      <w:r>
-        <w:rPr>
-          <w:rFonts w:ascii="Times New Roman" w:hAnsi="Times New Roman" w:cs="Times New Roman"/>
-          <w:sz w:val="22"/>
-          <w:szCs w:val="22"/>
-          <w:highlight w:val="yellow"/>
-        </w:rPr>
-        <w:t>children</w:t>
-      </w:r>
-      <w:proofErr w:type="spellEnd"/>
-      <w:r>
-        <w:rPr>
-          <w:rFonts w:ascii="Times New Roman" w:hAnsi="Times New Roman" w:cs="Times New Roman"/>
-          <w:sz w:val="22"/>
-          <w:szCs w:val="22"/>
-          <w:highlight w:val="yellow"/>
-        </w:rPr>
-        <w:t xml:space="preserve"> </w:t>
-      </w:r>
-      <w:r>
-        <w:rPr>
-          <w:rFonts w:ascii="Times New Roman" w:hAnsi="Times New Roman" w:cs="Times New Roman"/>
-          <w:sz w:val="22"/>
-          <w:szCs w:val="22"/>
-          <w:highlight w:val="yellow"/>
-        </w:rPr>
-        <w:t>%}</w:t>
-      </w:r>
-      <w:proofErr w:type="gramEnd"/>
-    </w:p>
-    <w:p>
-      <w:pPr>
-        <w:spacing w:after="0" w:line="276" w:lineRule="auto"/>
-        <w:rPr>
-          <w:rFonts w:ascii="Times New Roman" w:hAnsi="Times New Roman" w:cs="Times New Roman"/>
-          <w:sz w:val="22"/>
-          <w:szCs w:val="22"/>
-        </w:rPr>
-      </w:pPr>
-      <w:proofErr w:type="gramStart"/>
-      <w:r>
-        <w:rPr>
-          <w:rFonts w:ascii="Times New Roman" w:hAnsi="Times New Roman" w:cs="Times New Roman"/>
-          <w:sz w:val="22"/>
-          <w:szCs w:val="22"/>
-        </w:rPr>
-        <w:t>[ ]</w:t>
-      </w:r>
-      <w:proofErr w:type="gramEnd"/>
-      <w:r>
-        <w:rPr>
-          <w:rFonts w:ascii="Times New Roman" w:hAnsi="Times New Roman" w:cs="Times New Roman"/>
-          <w:sz w:val="22"/>
-          <w:szCs w:val="22"/>
-        </w:rPr>
-        <w:t xml:space="preserve"> Proposed Uniform Child Support Order</w:t>
-      </w:r>
-    </w:p>
-    <w:p>
-      <w:pPr>
-        <w:spacing w:after="0" w:line="240" w:lineRule="auto"/>
-        <w:rPr>
-          <w:rFonts w:ascii="Times New Roman" w:hAnsi="Times New Roman" w:cs="Times New Roman"/>
-          <w:sz w:val="22"/>
-          <w:szCs w:val="22"/>
-        </w:rPr>
-      </w:pPr>
-      <w:r>
-        <w:rPr>
-          <w:rFonts w:ascii="Times New Roman" w:hAnsi="Times New Roman" w:cs="Times New Roman"/>
-          <w:sz w:val="22"/>
-          <w:szCs w:val="22"/>
-          <w:highlight w:val="yellow"/>
-        </w:rPr>
-        <w:t xml:space="preserve">{%p </w:t>
-      </w:r>
-      <w:proofErr w:type="gramStart"/>
-      <w:r>
-        <w:rPr>
-          <w:rFonts w:ascii="Times New Roman" w:hAnsi="Times New Roman" w:cs="Times New Roman"/>
-          <w:sz w:val="22"/>
-          <w:szCs w:val="22"/>
-          <w:highlight w:val="yellow"/>
-        </w:rPr>
-        <w:t>endif %}</w:t>
-      </w:r>
-      <w:proofErr w:type="gramEnd"/>
     </w:p>
     <w:p>
       <w:pPr>
@@ -4886,66 +4276,24 @@
         <w:lastRenderedPageBreak/>
         <w:t xml:space="preserve">{%p if </w:t>
       </w:r>
-      <w:proofErr w:type="spellStart"/>
-      <w:r>
-        <w:rPr>
-          <w:rFonts w:ascii="Times New Roman" w:hAnsi="Times New Roman" w:cs="Times New Roman"/>
-          <w:sz w:val="22"/>
-          <w:szCs w:val="22"/>
-          <w:highlight w:val="yellow"/>
-        </w:rPr>
-        <w:t>user_wants_post_divorce_support</w:t>
-      </w:r>
-      <w:proofErr w:type="spellEnd"/>
-      <w:r>
-        <w:rPr>
-          <w:rFonts w:ascii="Times New Roman" w:hAnsi="Times New Roman" w:cs="Times New Roman"/>
-          <w:sz w:val="22"/>
-          <w:szCs w:val="22"/>
-          <w:highlight w:val="yellow"/>
-        </w:rPr>
-        <w:t xml:space="preserve"> or </w:t>
-      </w:r>
-      <w:proofErr w:type="spellStart"/>
-      <w:r>
-        <w:rPr>
-          <w:rFonts w:ascii="Times New Roman" w:hAnsi="Times New Roman" w:cs="Times New Roman"/>
-          <w:sz w:val="22"/>
-          <w:szCs w:val="22"/>
-          <w:highlight w:val="yellow"/>
-        </w:rPr>
-        <w:t>spousal_support_provisions</w:t>
-      </w:r>
-      <w:proofErr w:type="spellEnd"/>
-      <w:r>
-        <w:rPr>
-          <w:rFonts w:ascii="Times New Roman" w:hAnsi="Times New Roman" w:cs="Times New Roman"/>
-          <w:sz w:val="22"/>
-          <w:szCs w:val="22"/>
-          <w:highlight w:val="yellow"/>
-        </w:rPr>
-        <w:t xml:space="preserve"> == "</w:t>
-      </w:r>
-      <w:proofErr w:type="spellStart"/>
-      <w:r>
-        <w:rPr>
-          <w:rFonts w:ascii="Times New Roman" w:hAnsi="Times New Roman" w:cs="Times New Roman"/>
-          <w:sz w:val="22"/>
-          <w:szCs w:val="22"/>
-          <w:highlight w:val="yellow"/>
-        </w:rPr>
-        <w:t>user_agrees_to_pay_spousal_support</w:t>
-      </w:r>
-      <w:proofErr w:type="spellEnd"/>
-      <w:proofErr w:type="gramStart"/>
-      <w:r>
-        <w:rPr>
-          <w:rFonts w:ascii="Times New Roman" w:hAnsi="Times New Roman" w:cs="Times New Roman"/>
-          <w:sz w:val="22"/>
-          <w:szCs w:val="22"/>
-          <w:highlight w:val="yellow"/>
-        </w:rPr>
-        <w:t>"</w:t>
+      <w:r>
+        <w:rPr>
+          <w:rFonts w:ascii="Times New Roman" w:hAnsi="Times New Roman" w:cs="Times New Roman"/>
+          <w:sz w:val="22"/>
+          <w:szCs w:val="22"/>
+          <w:highlight w:val="yellow"/>
+        </w:rPr>
+        <w:t>there_are_marital_</w:t>
+      </w:r>
+      <w:proofErr w:type="gramStart"/>
+      <w:r>
+        <w:rPr>
+          <w:rFonts w:ascii="Times New Roman" w:hAnsi="Times New Roman" w:cs="Times New Roman"/>
+          <w:sz w:val="22"/>
+          <w:szCs w:val="22"/>
+          <w:highlight w:val="yellow"/>
+        </w:rPr>
+        <w:t>children</w:t>
       </w:r>
       <w:r>
         <w:rPr>
@@ -4992,7 +4340,7 @@
           <w:sz w:val="22"/>
           <w:szCs w:val="22"/>
         </w:rPr>
-        <w:t xml:space="preserve"> Proposed Uniform Spousal Support Order</w:t>
+        <w:t xml:space="preserve"> Uniform Child Support Order</w:t>
       </w:r>
     </w:p>
     <w:p>
@@ -5027,34 +4375,6 @@
     </w:p>
     <w:p>
       <w:pPr>
-        <w:spacing w:after="0" w:line="276" w:lineRule="auto"/>
-        <w:rPr>
-          <w:rFonts w:ascii="Times New Roman" w:hAnsi="Times New Roman" w:cs="Times New Roman"/>
-          <w:sz w:val="22"/>
-          <w:szCs w:val="22"/>
-        </w:rPr>
-      </w:pPr>
-      <w:proofErr w:type="gramStart"/>
-      <w:r>
-        <w:rPr>
-          <w:rFonts w:ascii="Times New Roman" w:hAnsi="Times New Roman" w:cs="Times New Roman"/>
-          <w:sz w:val="22"/>
-          <w:szCs w:val="22"/>
-        </w:rPr>
-        <w:t>[ ]</w:t>
-      </w:r>
-      <w:proofErr w:type="gramEnd"/>
-      <w:r>
-        <w:rPr>
-          <w:rFonts w:ascii="Times New Roman" w:hAnsi="Times New Roman" w:cs="Times New Roman"/>
-          <w:sz w:val="22"/>
-          <w:szCs w:val="22"/>
-        </w:rPr>
-        <w:t xml:space="preserve"> Judgment of Divorce</w:t>
-      </w:r>
-    </w:p>
-    <w:p>
-      <w:pPr>
         <w:spacing w:after="0" w:line="240" w:lineRule="auto"/>
         <w:rPr>
           <w:rFonts w:ascii="Times New Roman" w:hAnsi="Times New Roman" w:cs="Times New Roman"/>
@@ -5071,174 +4391,15 @@
         </w:rPr>
         <w:t xml:space="preserve">{%p if </w:t>
       </w:r>
-      <w:proofErr w:type="spellStart"/>
-      <w:r>
-        <w:rPr>
-          <w:rFonts w:ascii="Times New Roman" w:hAnsi="Times New Roman" w:cs="Times New Roman"/>
-          <w:sz w:val="22"/>
-          <w:szCs w:val="22"/>
-          <w:highlight w:val="yellow"/>
-        </w:rPr>
-        <w:t>there_are_marital_</w:t>
-      </w:r>
-      <w:proofErr w:type="gramStart"/>
-      <w:r>
-        <w:rPr>
-          <w:rFonts w:ascii="Times New Roman" w:hAnsi="Times New Roman" w:cs="Times New Roman"/>
-          <w:sz w:val="22"/>
-          <w:szCs w:val="22"/>
-          <w:highlight w:val="yellow"/>
-        </w:rPr>
-        <w:t>children</w:t>
-      </w:r>
-      <w:proofErr w:type="spellEnd"/>
-      <w:r>
-        <w:rPr>
-          <w:rFonts w:ascii="Times New Roman" w:hAnsi="Times New Roman" w:cs="Times New Roman"/>
-          <w:sz w:val="22"/>
-          <w:szCs w:val="22"/>
-          <w:highlight w:val="yellow"/>
-        </w:rPr>
-        <w:t xml:space="preserve"> </w:t>
-      </w:r>
-      <w:r>
-        <w:rPr>
-          <w:rFonts w:ascii="Times New Roman" w:hAnsi="Times New Roman" w:cs="Times New Roman"/>
-          <w:sz w:val="22"/>
-          <w:szCs w:val="22"/>
-          <w:highlight w:val="yellow"/>
-        </w:rPr>
-        <w:t>%}</w:t>
-      </w:r>
-      <w:proofErr w:type="gramEnd"/>
-    </w:p>
-    <w:p>
-      <w:pPr>
-        <w:spacing w:after="0" w:line="276" w:lineRule="auto"/>
-        <w:rPr>
-          <w:rFonts w:ascii="Times New Roman" w:hAnsi="Times New Roman" w:cs="Times New Roman"/>
-          <w:sz w:val="22"/>
-          <w:szCs w:val="22"/>
-        </w:rPr>
-      </w:pPr>
-      <w:proofErr w:type="gramStart"/>
-      <w:r>
-        <w:rPr>
-          <w:rFonts w:ascii="Times New Roman" w:hAnsi="Times New Roman" w:cs="Times New Roman"/>
-          <w:sz w:val="22"/>
-          <w:szCs w:val="22"/>
-        </w:rPr>
-        <w:t>[ ]</w:t>
-      </w:r>
-      <w:proofErr w:type="gramEnd"/>
-      <w:r>
-        <w:rPr>
-          <w:rFonts w:ascii="Times New Roman" w:hAnsi="Times New Roman" w:cs="Times New Roman"/>
-          <w:sz w:val="22"/>
-          <w:szCs w:val="22"/>
-        </w:rPr>
-        <w:t xml:space="preserve"> Uniform Child Support Order</w:t>
-      </w:r>
-    </w:p>
-    <w:p>
-      <w:pPr>
-        <w:spacing w:after="0" w:line="240" w:lineRule="auto"/>
-        <w:rPr>
-          <w:rFonts w:ascii="Times New Roman" w:hAnsi="Times New Roman" w:cs="Times New Roman"/>
-          <w:sz w:val="22"/>
-          <w:szCs w:val="22"/>
-        </w:rPr>
-      </w:pPr>
-      <w:r>
-        <w:rPr>
-          <w:rFonts w:ascii="Times New Roman" w:hAnsi="Times New Roman" w:cs="Times New Roman"/>
-          <w:sz w:val="22"/>
-          <w:szCs w:val="22"/>
-          <w:highlight w:val="yellow"/>
-        </w:rPr>
-        <w:t xml:space="preserve">{%p </w:t>
-      </w:r>
-      <w:proofErr w:type="gramStart"/>
-      <w:r>
-        <w:rPr>
-          <w:rFonts w:ascii="Times New Roman" w:hAnsi="Times New Roman" w:cs="Times New Roman"/>
-          <w:sz w:val="22"/>
-          <w:szCs w:val="22"/>
-          <w:highlight w:val="yellow"/>
-        </w:rPr>
-        <w:t>endif %}</w:t>
-      </w:r>
-      <w:proofErr w:type="gramEnd"/>
-    </w:p>
-    <w:p>
-      <w:pPr>
-        <w:spacing w:after="0" w:line="240" w:lineRule="auto"/>
-        <w:rPr>
-          <w:rFonts w:ascii="Times New Roman" w:hAnsi="Times New Roman" w:cs="Times New Roman"/>
-          <w:sz w:val="22"/>
-          <w:szCs w:val="22"/>
-        </w:rPr>
-      </w:pPr>
-      <w:r>
-        <w:rPr>
-          <w:rFonts w:ascii="Times New Roman" w:hAnsi="Times New Roman" w:cs="Times New Roman"/>
-          <w:sz w:val="22"/>
-          <w:szCs w:val="22"/>
-          <w:highlight w:val="yellow"/>
-        </w:rPr>
-        <w:t xml:space="preserve">{%p if </w:t>
-      </w:r>
-      <w:proofErr w:type="spellStart"/>
-      <w:r>
-        <w:rPr>
-          <w:rFonts w:ascii="Times New Roman" w:hAnsi="Times New Roman" w:cs="Times New Roman"/>
-          <w:sz w:val="22"/>
-          <w:szCs w:val="22"/>
-          <w:highlight w:val="yellow"/>
-        </w:rPr>
-        <w:t>user_wants_post_divorce_support</w:t>
-      </w:r>
-      <w:proofErr w:type="spellEnd"/>
-      <w:r>
-        <w:rPr>
-          <w:rFonts w:ascii="Times New Roman" w:hAnsi="Times New Roman" w:cs="Times New Roman"/>
-          <w:sz w:val="22"/>
-          <w:szCs w:val="22"/>
-          <w:highlight w:val="yellow"/>
-        </w:rPr>
-        <w:t xml:space="preserve"> or </w:t>
-      </w:r>
-      <w:proofErr w:type="spellStart"/>
-      <w:r>
-        <w:rPr>
-          <w:rFonts w:ascii="Times New Roman" w:hAnsi="Times New Roman" w:cs="Times New Roman"/>
-          <w:sz w:val="22"/>
-          <w:szCs w:val="22"/>
-          <w:highlight w:val="yellow"/>
-        </w:rPr>
-        <w:t>spousal_support_provisions</w:t>
-      </w:r>
-      <w:proofErr w:type="spellEnd"/>
-      <w:r>
-        <w:rPr>
-          <w:rFonts w:ascii="Times New Roman" w:hAnsi="Times New Roman" w:cs="Times New Roman"/>
-          <w:sz w:val="22"/>
-          <w:szCs w:val="22"/>
-          <w:highlight w:val="yellow"/>
-        </w:rPr>
-        <w:t xml:space="preserve"> == "</w:t>
-      </w:r>
-      <w:proofErr w:type="spellStart"/>
-      <w:r>
-        <w:rPr>
-          <w:rFonts w:ascii="Times New Roman" w:hAnsi="Times New Roman" w:cs="Times New Roman"/>
-          <w:sz w:val="22"/>
-          <w:szCs w:val="22"/>
-          <w:highlight w:val="yellow"/>
-        </w:rPr>
-        <w:t>user_agrees_to_pay_spousal_support</w:t>
-      </w:r>
-      <w:proofErr w:type="spellEnd"/>
+      <w:r>
+        <w:rPr>
+          <w:rFonts w:ascii="Times New Roman" w:hAnsi="Times New Roman" w:cs="Times New Roman"/>
+          <w:sz w:val="22"/>
+          <w:szCs w:val="22"/>
+          <w:highlight w:val="yellow"/>
+        </w:rPr>
+        <w:t>user_wants_post_divorce_support or spousal_support_provisions == "user_agrees_to_pay_spousal_support</w:t>
+      </w:r>
       <w:proofErr w:type="gramStart"/>
       <w:r>
         <w:rPr>
@@ -5717,25 +4878,7 @@
           <w:sz w:val="20"/>
           <w:szCs w:val="20"/>
         </w:rPr>
-        <w:t xml:space="preserve">{% if </w:t>
-      </w:r>
-      <w:proofErr w:type="spellStart"/>
-      <w:r>
-        <w:rPr>
-          <w:rFonts w:ascii="Times New Roman" w:hAnsi="Times New Roman" w:cs="Times New Roman"/>
-          <w:sz w:val="20"/>
-          <w:szCs w:val="20"/>
-        </w:rPr>
-        <w:t>user_ask_role</w:t>
-      </w:r>
-      <w:proofErr w:type="spellEnd"/>
-      <w:r>
-        <w:rPr>
-          <w:rFonts w:ascii="Times New Roman" w:hAnsi="Times New Roman" w:cs="Times New Roman"/>
-          <w:sz w:val="20"/>
-          <w:szCs w:val="20"/>
-        </w:rPr>
-        <w:t xml:space="preserve"> == “plaintiff” </w:t>
+        <w:t xml:space="preserve">{% if user_ask_role == “plaintiff” </w:t>
       </w:r>
       <w:proofErr w:type="gramStart"/>
       <w:r>

</xml_diff>

<commit_message>
work on interview logic
</commit_message>
<xml_diff>
--- a/docassemble/MLHDivorceAndCustody/data/templates/proof_of_service.docx
+++ b/docassemble/MLHDivorceAndCustody/data/templates/proof_of_service.docx
@@ -54,7 +54,16 @@
           <w:sz w:val="22"/>
           <w:szCs w:val="22"/>
         </w:rPr>
-        <w:t>{{ the</w:t>
+        <w:t xml:space="preserve">{{ </w:t>
+      </w:r>
+      <w:proofErr w:type="spellStart"/>
+      <w:r>
+        <w:rPr>
+          <w:rFonts w:ascii="Times New Roman" w:hAnsi="Times New Roman" w:cs="Times New Roman"/>
+          <w:sz w:val="22"/>
+          <w:szCs w:val="22"/>
+        </w:rPr>
+        <w:t>the</w:t>
       </w:r>
       <w:proofErr w:type="gramEnd"/>
       <w:r>
@@ -74,6 +83,7 @@
         </w:rPr>
         <w:t>court.number</w:t>
       </w:r>
+      <w:proofErr w:type="spellEnd"/>
       <w:proofErr w:type="gramEnd"/>
       <w:r>
         <w:rPr>
@@ -117,16 +127,34 @@
           <w:sz w:val="22"/>
           <w:szCs w:val="22"/>
         </w:rPr>
-        <w:t>{{ county</w:t>
-      </w:r>
-      <w:proofErr w:type="gramEnd"/>
-      <w:r>
-        <w:rPr>
-          <w:rFonts w:ascii="Times New Roman" w:hAnsi="Times New Roman" w:cs="Times New Roman"/>
-          <w:sz w:val="22"/>
-          <w:szCs w:val="22"/>
-        </w:rPr>
-        <w:t xml:space="preserve">_choice | </w:t>
+        <w:t xml:space="preserve">{{ </w:t>
+      </w:r>
+      <w:proofErr w:type="spellStart"/>
+      <w:r>
+        <w:rPr>
+          <w:rFonts w:ascii="Times New Roman" w:hAnsi="Times New Roman" w:cs="Times New Roman"/>
+          <w:sz w:val="22"/>
+          <w:szCs w:val="22"/>
+        </w:rPr>
+        <w:t>county</w:t>
+      </w:r>
+      <w:proofErr w:type="gramEnd"/>
+      <w:r>
+        <w:rPr>
+          <w:rFonts w:ascii="Times New Roman" w:hAnsi="Times New Roman" w:cs="Times New Roman"/>
+          <w:sz w:val="22"/>
+          <w:szCs w:val="22"/>
+        </w:rPr>
+        <w:t>_choice</w:t>
+      </w:r>
+      <w:proofErr w:type="spellEnd"/>
+      <w:r>
+        <w:rPr>
+          <w:rFonts w:ascii="Times New Roman" w:hAnsi="Times New Roman" w:cs="Times New Roman"/>
+          <w:sz w:val="22"/>
+          <w:szCs w:val="22"/>
+        </w:rPr>
+        <w:t xml:space="preserve"> | </w:t>
       </w:r>
       <w:proofErr w:type="gramStart"/>
       <w:r>
@@ -217,7 +245,16 @@
                 <w:sz w:val="22"/>
                 <w:szCs w:val="22"/>
               </w:rPr>
-              <w:t>[0].name_</w:t>
+              <w:t>[0].</w:t>
+            </w:r>
+            <w:proofErr w:type="spellStart"/>
+            <w:r>
+              <w:rPr>
+                <w:rFonts w:ascii="Times New Roman" w:hAnsi="Times New Roman" w:cs="Times New Roman"/>
+                <w:sz w:val="22"/>
+                <w:szCs w:val="22"/>
+              </w:rPr>
+              <w:t>name_</w:t>
             </w:r>
             <w:proofErr w:type="gramStart"/>
             <w:r>
@@ -226,7 +263,16 @@
                 <w:sz w:val="22"/>
                 <w:szCs w:val="22"/>
               </w:rPr>
-              <w:t>full()</w:t>
+              <w:t>full</w:t>
+            </w:r>
+            <w:proofErr w:type="spellEnd"/>
+            <w:r>
+              <w:rPr>
+                <w:rFonts w:ascii="Times New Roman" w:hAnsi="Times New Roman" w:cs="Times New Roman"/>
+                <w:sz w:val="22"/>
+                <w:szCs w:val="22"/>
+              </w:rPr>
+              <w:t>()</w:t>
             </w:r>
             <w:r>
               <w:rPr>
@@ -335,7 +381,16 @@
                 <w:sz w:val="22"/>
                 <w:szCs w:val="22"/>
               </w:rPr>
-              <w:t>[0].name_</w:t>
+              <w:t>[0].</w:t>
+            </w:r>
+            <w:proofErr w:type="spellStart"/>
+            <w:r>
+              <w:rPr>
+                <w:rFonts w:ascii="Times New Roman" w:hAnsi="Times New Roman" w:cs="Times New Roman"/>
+                <w:sz w:val="22"/>
+                <w:szCs w:val="22"/>
+              </w:rPr>
+              <w:t>name_</w:t>
             </w:r>
             <w:proofErr w:type="gramStart"/>
             <w:r>
@@ -344,7 +399,16 @@
                 <w:sz w:val="22"/>
                 <w:szCs w:val="22"/>
               </w:rPr>
-              <w:t>full() }</w:t>
+              <w:t>full</w:t>
+            </w:r>
+            <w:proofErr w:type="spellEnd"/>
+            <w:r>
+              <w:rPr>
+                <w:rFonts w:ascii="Times New Roman" w:hAnsi="Times New Roman" w:cs="Times New Roman"/>
+                <w:sz w:val="22"/>
+                <w:szCs w:val="22"/>
+              </w:rPr>
+              <w:t>() }</w:t>
             </w:r>
             <w:proofErr w:type="gramEnd"/>
             <w:r>
@@ -460,7 +524,17 @@
                 <w:szCs w:val="22"/>
                 <w:u w:val="single"/>
               </w:rPr>
-              <w:t>{{ docket</w:t>
+              <w:t xml:space="preserve">{{ </w:t>
+            </w:r>
+            <w:proofErr w:type="spellStart"/>
+            <w:r>
+              <w:rPr>
+                <w:rFonts w:ascii="Times New Roman" w:hAnsi="Times New Roman" w:cs="Times New Roman"/>
+                <w:sz w:val="22"/>
+                <w:szCs w:val="22"/>
+                <w:u w:val="single"/>
+              </w:rPr>
+              <w:t>docket</w:t>
             </w:r>
             <w:proofErr w:type="gramEnd"/>
             <w:r>
@@ -480,7 +554,17 @@
                 <w:szCs w:val="22"/>
                 <w:u w:val="single"/>
               </w:rPr>
-              <w:t>number }</w:t>
+              <w:t>number</w:t>
+            </w:r>
+            <w:proofErr w:type="spellEnd"/>
+            <w:r>
+              <w:rPr>
+                <w:rFonts w:ascii="Times New Roman" w:hAnsi="Times New Roman" w:cs="Times New Roman"/>
+                <w:sz w:val="22"/>
+                <w:szCs w:val="22"/>
+                <w:u w:val="single"/>
+              </w:rPr>
+              <w:t xml:space="preserve"> }</w:t>
             </w:r>
             <w:proofErr w:type="gramEnd"/>
             <w:r>
@@ -606,21 +690,41 @@
         </w:rPr>
         <w:t xml:space="preserve">{%p if </w:t>
       </w:r>
-      <w:r>
-        <w:rPr>
-          <w:rFonts w:ascii="Times New Roman" w:hAnsi="Times New Roman" w:cs="Times New Roman"/>
-          <w:sz w:val="21"/>
-          <w:szCs w:val="21"/>
-        </w:rPr>
-        <w:t xml:space="preserve">user_ask_role == “plaintiff” and </w:t>
-      </w:r>
-      <w:r>
-        <w:rPr>
-          <w:rFonts w:ascii="Times New Roman" w:hAnsi="Times New Roman" w:cs="Times New Roman"/>
-          <w:sz w:val="21"/>
-          <w:szCs w:val="21"/>
-        </w:rPr>
-        <w:t xml:space="preserve">confidential_contact_info_yn </w:t>
+      <w:proofErr w:type="spellStart"/>
+      <w:r>
+        <w:rPr>
+          <w:rFonts w:ascii="Times New Roman" w:hAnsi="Times New Roman" w:cs="Times New Roman"/>
+          <w:sz w:val="21"/>
+          <w:szCs w:val="21"/>
+        </w:rPr>
+        <w:t>user_ask_role</w:t>
+      </w:r>
+      <w:proofErr w:type="spellEnd"/>
+      <w:r>
+        <w:rPr>
+          <w:rFonts w:ascii="Times New Roman" w:hAnsi="Times New Roman" w:cs="Times New Roman"/>
+          <w:sz w:val="21"/>
+          <w:szCs w:val="21"/>
+        </w:rPr>
+        <w:t xml:space="preserve"> == “plaintiff” and </w:t>
+      </w:r>
+      <w:proofErr w:type="spellStart"/>
+      <w:r>
+        <w:rPr>
+          <w:rFonts w:ascii="Times New Roman" w:hAnsi="Times New Roman" w:cs="Times New Roman"/>
+          <w:sz w:val="21"/>
+          <w:szCs w:val="21"/>
+        </w:rPr>
+        <w:t>confidential_contact_info_yn</w:t>
+      </w:r>
+      <w:proofErr w:type="spellEnd"/>
+      <w:r>
+        <w:rPr>
+          <w:rFonts w:ascii="Times New Roman" w:hAnsi="Times New Roman" w:cs="Times New Roman"/>
+          <w:sz w:val="21"/>
+          <w:szCs w:val="21"/>
+        </w:rPr>
+        <w:t xml:space="preserve"> </w:t>
       </w:r>
       <w:r>
         <w:rPr>
@@ -712,7 +816,16 @@
           <w:sz w:val="21"/>
           <w:szCs w:val="21"/>
         </w:rPr>
-        <w:t>].address</w:t>
+        <w:t>].</w:t>
+      </w:r>
+      <w:proofErr w:type="spellStart"/>
+      <w:r>
+        <w:rPr>
+          <w:rFonts w:ascii="Times New Roman" w:hAnsi="Times New Roman" w:cs="Times New Roman"/>
+          <w:sz w:val="21"/>
+          <w:szCs w:val="21"/>
+        </w:rPr>
+        <w:t>address</w:t>
       </w:r>
       <w:proofErr w:type="gramEnd"/>
       <w:r>
@@ -730,7 +843,16 @@
           <w:sz w:val="21"/>
           <w:szCs w:val="21"/>
         </w:rPr>
-        <w:t>one() }</w:t>
+        <w:t>one</w:t>
+      </w:r>
+      <w:proofErr w:type="spellEnd"/>
+      <w:r>
+        <w:rPr>
+          <w:rFonts w:ascii="Times New Roman" w:hAnsi="Times New Roman" w:cs="Times New Roman"/>
+          <w:sz w:val="21"/>
+          <w:szCs w:val="21"/>
+        </w:rPr>
+        <w:t>() }</w:t>
       </w:r>
       <w:proofErr w:type="gramEnd"/>
       <w:r>
@@ -777,7 +899,16 @@
           <w:sz w:val="21"/>
           <w:szCs w:val="21"/>
         </w:rPr>
-        <w:t>].address</w:t>
+        <w:t>].</w:t>
+      </w:r>
+      <w:proofErr w:type="spellStart"/>
+      <w:r>
+        <w:rPr>
+          <w:rFonts w:ascii="Times New Roman" w:hAnsi="Times New Roman" w:cs="Times New Roman"/>
+          <w:sz w:val="21"/>
+          <w:szCs w:val="21"/>
+        </w:rPr>
+        <w:t>address</w:t>
       </w:r>
       <w:proofErr w:type="gramEnd"/>
       <w:r>
@@ -795,7 +926,16 @@
           <w:sz w:val="21"/>
           <w:szCs w:val="21"/>
         </w:rPr>
-        <w:t>two() }</w:t>
+        <w:t>two</w:t>
+      </w:r>
+      <w:proofErr w:type="spellEnd"/>
+      <w:r>
+        <w:rPr>
+          <w:rFonts w:ascii="Times New Roman" w:hAnsi="Times New Roman" w:cs="Times New Roman"/>
+          <w:sz w:val="21"/>
+          <w:szCs w:val="21"/>
+        </w:rPr>
+        <w:t>() }</w:t>
       </w:r>
       <w:proofErr w:type="gramEnd"/>
       <w:r>
@@ -841,8 +981,18 @@
           <w:sz w:val="21"/>
           <w:szCs w:val="21"/>
         </w:rPr>
-        <w:t>0].no_phone_number</w:t>
-      </w:r>
+        <w:t>0].</w:t>
+      </w:r>
+      <w:proofErr w:type="spellStart"/>
+      <w:r>
+        <w:rPr>
+          <w:rFonts w:ascii="Times New Roman" w:hAnsi="Times New Roman" w:cs="Times New Roman"/>
+          <w:sz w:val="21"/>
+          <w:szCs w:val="21"/>
+        </w:rPr>
+        <w:t>no_phone_number</w:t>
+      </w:r>
+      <w:proofErr w:type="spellEnd"/>
       <w:r>
         <w:rPr>
           <w:rFonts w:ascii="Times New Roman" w:hAnsi="Times New Roman" w:cs="Times New Roman"/>
@@ -875,7 +1025,25 @@
           <w:sz w:val="21"/>
           <w:szCs w:val="21"/>
         </w:rPr>
-        <w:t xml:space="preserve">% if user_ask_role == “plaintiff” </w:t>
+        <w:t xml:space="preserve">% if </w:t>
+      </w:r>
+      <w:proofErr w:type="spellStart"/>
+      <w:r>
+        <w:rPr>
+          <w:rFonts w:ascii="Times New Roman" w:hAnsi="Times New Roman" w:cs="Times New Roman"/>
+          <w:sz w:val="21"/>
+          <w:szCs w:val="21"/>
+        </w:rPr>
+        <w:t>user_ask_role</w:t>
+      </w:r>
+      <w:proofErr w:type="spellEnd"/>
+      <w:r>
+        <w:rPr>
+          <w:rFonts w:ascii="Times New Roman" w:hAnsi="Times New Roman" w:cs="Times New Roman"/>
+          <w:sz w:val="21"/>
+          <w:szCs w:val="21"/>
+        </w:rPr>
+        <w:t xml:space="preserve"> == “plaintiff” </w:t>
       </w:r>
       <w:proofErr w:type="gramStart"/>
       <w:r>
@@ -1000,6 +1168,7 @@
         </w:rPr>
         <w:t xml:space="preserve">{{ </w:t>
       </w:r>
+      <w:proofErr w:type="spellStart"/>
       <w:r>
         <w:rPr>
           <w:rFonts w:ascii="Times New Roman" w:hAnsi="Times New Roman" w:cs="Times New Roman"/>
@@ -1015,7 +1184,16 @@
           <w:sz w:val="21"/>
           <w:szCs w:val="21"/>
         </w:rPr>
-        <w:t>_number_formatted(</w:t>
+        <w:t>_number_formatted</w:t>
+      </w:r>
+      <w:proofErr w:type="spellEnd"/>
+      <w:r>
+        <w:rPr>
+          <w:rFonts w:ascii="Times New Roman" w:hAnsi="Times New Roman" w:cs="Times New Roman"/>
+          <w:sz w:val="21"/>
+          <w:szCs w:val="21"/>
+        </w:rPr>
+        <w:t>(</w:t>
       </w:r>
       <w:r>
         <w:rPr>
@@ -1040,7 +1218,16 @@
           <w:sz w:val="21"/>
           <w:szCs w:val="21"/>
         </w:rPr>
-        <w:t>].phone</w:t>
+        <w:t>].</w:t>
+      </w:r>
+      <w:proofErr w:type="spellStart"/>
+      <w:r>
+        <w:rPr>
+          <w:rFonts w:ascii="Times New Roman" w:hAnsi="Times New Roman" w:cs="Times New Roman"/>
+          <w:sz w:val="21"/>
+          <w:szCs w:val="21"/>
+        </w:rPr>
+        <w:t>phone</w:t>
       </w:r>
       <w:proofErr w:type="gramEnd"/>
       <w:r>
@@ -1051,6 +1238,7 @@
         </w:rPr>
         <w:t>_number</w:t>
       </w:r>
+      <w:proofErr w:type="spellEnd"/>
       <w:proofErr w:type="gramStart"/>
       <w:r>
         <w:rPr>
@@ -1139,21 +1327,41 @@
         </w:rPr>
         <w:t xml:space="preserve">{%p if </w:t>
       </w:r>
-      <w:r>
-        <w:rPr>
-          <w:rFonts w:ascii="Times New Roman" w:hAnsi="Times New Roman" w:cs="Times New Roman"/>
-          <w:sz w:val="21"/>
-          <w:szCs w:val="21"/>
-        </w:rPr>
-        <w:t xml:space="preserve">user_ask_role == “defendant” and </w:t>
-      </w:r>
-      <w:r>
-        <w:rPr>
-          <w:rFonts w:ascii="Times New Roman" w:hAnsi="Times New Roman" w:cs="Times New Roman"/>
-          <w:sz w:val="21"/>
-          <w:szCs w:val="21"/>
-        </w:rPr>
-        <w:t>confidential_contact_info_yn %}</w:t>
+      <w:proofErr w:type="spellStart"/>
+      <w:r>
+        <w:rPr>
+          <w:rFonts w:ascii="Times New Roman" w:hAnsi="Times New Roman" w:cs="Times New Roman"/>
+          <w:sz w:val="21"/>
+          <w:szCs w:val="21"/>
+        </w:rPr>
+        <w:t>user_ask_role</w:t>
+      </w:r>
+      <w:proofErr w:type="spellEnd"/>
+      <w:r>
+        <w:rPr>
+          <w:rFonts w:ascii="Times New Roman" w:hAnsi="Times New Roman" w:cs="Times New Roman"/>
+          <w:sz w:val="21"/>
+          <w:szCs w:val="21"/>
+        </w:rPr>
+        <w:t xml:space="preserve"> == “defendant” and </w:t>
+      </w:r>
+      <w:proofErr w:type="spellStart"/>
+      <w:r>
+        <w:rPr>
+          <w:rFonts w:ascii="Times New Roman" w:hAnsi="Times New Roman" w:cs="Times New Roman"/>
+          <w:sz w:val="21"/>
+          <w:szCs w:val="21"/>
+        </w:rPr>
+        <w:t>confidential_contact_info_yn</w:t>
+      </w:r>
+      <w:proofErr w:type="spellEnd"/>
+      <w:r>
+        <w:rPr>
+          <w:rFonts w:ascii="Times New Roman" w:hAnsi="Times New Roman" w:cs="Times New Roman"/>
+          <w:sz w:val="21"/>
+          <w:szCs w:val="21"/>
+        </w:rPr>
+        <w:t xml:space="preserve"> %}</w:t>
       </w:r>
     </w:p>
     <w:p>
@@ -1237,7 +1445,16 @@
           <w:sz w:val="21"/>
           <w:szCs w:val="21"/>
         </w:rPr>
-        <w:t>].address</w:t>
+        <w:t>].</w:t>
+      </w:r>
+      <w:proofErr w:type="spellStart"/>
+      <w:r>
+        <w:rPr>
+          <w:rFonts w:ascii="Times New Roman" w:hAnsi="Times New Roman" w:cs="Times New Roman"/>
+          <w:sz w:val="21"/>
+          <w:szCs w:val="21"/>
+        </w:rPr>
+        <w:t>address</w:t>
       </w:r>
       <w:proofErr w:type="gramEnd"/>
       <w:r>
@@ -1255,7 +1472,16 @@
           <w:sz w:val="21"/>
           <w:szCs w:val="21"/>
         </w:rPr>
-        <w:t>one() }</w:t>
+        <w:t>one</w:t>
+      </w:r>
+      <w:proofErr w:type="spellEnd"/>
+      <w:r>
+        <w:rPr>
+          <w:rFonts w:ascii="Times New Roman" w:hAnsi="Times New Roman" w:cs="Times New Roman"/>
+          <w:sz w:val="21"/>
+          <w:szCs w:val="21"/>
+        </w:rPr>
+        <w:t>() }</w:t>
       </w:r>
       <w:proofErr w:type="gramEnd"/>
       <w:r>
@@ -1302,7 +1528,16 @@
           <w:sz w:val="21"/>
           <w:szCs w:val="21"/>
         </w:rPr>
-        <w:t>].address</w:t>
+        <w:t>].</w:t>
+      </w:r>
+      <w:proofErr w:type="spellStart"/>
+      <w:r>
+        <w:rPr>
+          <w:rFonts w:ascii="Times New Roman" w:hAnsi="Times New Roman" w:cs="Times New Roman"/>
+          <w:sz w:val="21"/>
+          <w:szCs w:val="21"/>
+        </w:rPr>
+        <w:t>address</w:t>
       </w:r>
       <w:proofErr w:type="gramEnd"/>
       <w:r>
@@ -1320,7 +1555,16 @@
           <w:sz w:val="21"/>
           <w:szCs w:val="21"/>
         </w:rPr>
-        <w:t>two() }</w:t>
+        <w:t>two</w:t>
+      </w:r>
+      <w:proofErr w:type="spellEnd"/>
+      <w:r>
+        <w:rPr>
+          <w:rFonts w:ascii="Times New Roman" w:hAnsi="Times New Roman" w:cs="Times New Roman"/>
+          <w:sz w:val="21"/>
+          <w:szCs w:val="21"/>
+        </w:rPr>
+        <w:t>() }</w:t>
       </w:r>
       <w:proofErr w:type="gramEnd"/>
       <w:r>
@@ -1375,8 +1619,18 @@
           <w:sz w:val="21"/>
           <w:szCs w:val="21"/>
         </w:rPr>
-        <w:t>0].no_phone_number</w:t>
-      </w:r>
+        <w:t>0].</w:t>
+      </w:r>
+      <w:proofErr w:type="spellStart"/>
+      <w:r>
+        <w:rPr>
+          <w:rFonts w:ascii="Times New Roman" w:hAnsi="Times New Roman" w:cs="Times New Roman"/>
+          <w:sz w:val="21"/>
+          <w:szCs w:val="21"/>
+        </w:rPr>
+        <w:t>no_phone_number</w:t>
+      </w:r>
+      <w:proofErr w:type="spellEnd"/>
       <w:r>
         <w:rPr>
           <w:rFonts w:ascii="Times New Roman" w:hAnsi="Times New Roman" w:cs="Times New Roman"/>
@@ -1409,7 +1663,25 @@
           <w:sz w:val="21"/>
           <w:szCs w:val="21"/>
         </w:rPr>
-        <w:t xml:space="preserve">% if user_ask_role == “defendant” </w:t>
+        <w:t xml:space="preserve">% if </w:t>
+      </w:r>
+      <w:proofErr w:type="spellStart"/>
+      <w:r>
+        <w:rPr>
+          <w:rFonts w:ascii="Times New Roman" w:hAnsi="Times New Roman" w:cs="Times New Roman"/>
+          <w:sz w:val="21"/>
+          <w:szCs w:val="21"/>
+        </w:rPr>
+        <w:t>user_ask_role</w:t>
+      </w:r>
+      <w:proofErr w:type="spellEnd"/>
+      <w:r>
+        <w:rPr>
+          <w:rFonts w:ascii="Times New Roman" w:hAnsi="Times New Roman" w:cs="Times New Roman"/>
+          <w:sz w:val="21"/>
+          <w:szCs w:val="21"/>
+        </w:rPr>
+        <w:t xml:space="preserve"> == “defendant” </w:t>
       </w:r>
       <w:proofErr w:type="gramStart"/>
       <w:r>
@@ -1526,6 +1798,7 @@
         </w:rPr>
         <w:t xml:space="preserve">{{ </w:t>
       </w:r>
+      <w:proofErr w:type="spellStart"/>
       <w:r>
         <w:rPr>
           <w:rFonts w:ascii="Times New Roman" w:hAnsi="Times New Roman" w:cs="Times New Roman"/>
@@ -1541,7 +1814,16 @@
           <w:sz w:val="21"/>
           <w:szCs w:val="21"/>
         </w:rPr>
-        <w:t>_number_formatted(</w:t>
+        <w:t>_number_formatted</w:t>
+      </w:r>
+      <w:proofErr w:type="spellEnd"/>
+      <w:r>
+        <w:rPr>
+          <w:rFonts w:ascii="Times New Roman" w:hAnsi="Times New Roman" w:cs="Times New Roman"/>
+          <w:sz w:val="21"/>
+          <w:szCs w:val="21"/>
+        </w:rPr>
+        <w:t>(</w:t>
       </w:r>
       <w:r>
         <w:rPr>
@@ -1566,7 +1848,16 @@
           <w:sz w:val="21"/>
           <w:szCs w:val="21"/>
         </w:rPr>
-        <w:t>].phone</w:t>
+        <w:t>].</w:t>
+      </w:r>
+      <w:proofErr w:type="spellStart"/>
+      <w:r>
+        <w:rPr>
+          <w:rFonts w:ascii="Times New Roman" w:hAnsi="Times New Roman" w:cs="Times New Roman"/>
+          <w:sz w:val="21"/>
+          <w:szCs w:val="21"/>
+        </w:rPr>
+        <w:t>phone</w:t>
       </w:r>
       <w:proofErr w:type="gramEnd"/>
       <w:r>
@@ -1577,6 +1868,7 @@
         </w:rPr>
         <w:t>_number</w:t>
       </w:r>
+      <w:proofErr w:type="spellEnd"/>
       <w:proofErr w:type="gramStart"/>
       <w:r>
         <w:rPr>
@@ -1701,7 +1993,27 @@
           <w:szCs w:val="22"/>
           <w:highlight w:val="yellow"/>
         </w:rPr>
-        <w:t xml:space="preserve">{% if user_ask_role == “plaintiff” </w:t>
+        <w:t xml:space="preserve">{% if </w:t>
+      </w:r>
+      <w:proofErr w:type="spellStart"/>
+      <w:r>
+        <w:rPr>
+          <w:rFonts w:ascii="Times New Roman" w:hAnsi="Times New Roman" w:cs="Times New Roman"/>
+          <w:sz w:val="22"/>
+          <w:szCs w:val="22"/>
+          <w:highlight w:val="yellow"/>
+        </w:rPr>
+        <w:t>user_ask_role</w:t>
+      </w:r>
+      <w:proofErr w:type="spellEnd"/>
+      <w:r>
+        <w:rPr>
+          <w:rFonts w:ascii="Times New Roman" w:hAnsi="Times New Roman" w:cs="Times New Roman"/>
+          <w:sz w:val="22"/>
+          <w:szCs w:val="22"/>
+          <w:highlight w:val="yellow"/>
+        </w:rPr>
+        <w:t xml:space="preserve"> == “plaintiff” </w:t>
       </w:r>
       <w:proofErr w:type="gramStart"/>
       <w:r>
@@ -2052,8 +2364,9 @@
           <w:szCs w:val="22"/>
           <w:highlight w:val="cyan"/>
         </w:rPr>
-        <w:t xml:space="preserve"> if tool</w:t>
-      </w:r>
+        <w:t xml:space="preserve"> if </w:t>
+      </w:r>
+      <w:proofErr w:type="spellStart"/>
       <w:r>
         <w:rPr>
           <w:rFonts w:ascii="Times New Roman" w:hAnsi="Times New Roman" w:cs="Times New Roman"/>
@@ -2061,8 +2374,18 @@
           <w:szCs w:val="22"/>
           <w:highlight w:val="cyan"/>
         </w:rPr>
+        <w:t>tool</w:t>
+      </w:r>
+      <w:r>
+        <w:rPr>
+          <w:rFonts w:ascii="Times New Roman" w:hAnsi="Times New Roman" w:cs="Times New Roman"/>
+          <w:sz w:val="22"/>
+          <w:szCs w:val="22"/>
+          <w:highlight w:val="cyan"/>
+        </w:rPr>
         <w:t>_ID</w:t>
       </w:r>
+      <w:proofErr w:type="spellEnd"/>
       <w:r>
         <w:rPr>
           <w:rFonts w:ascii="Times New Roman" w:hAnsi="Times New Roman" w:cs="Times New Roman"/>
@@ -2079,7 +2402,27 @@
           <w:szCs w:val="22"/>
           <w:highlight w:val="cyan"/>
         </w:rPr>
-        <w:t>“custody_complaint”</w:t>
+        <w:t>“</w:t>
+      </w:r>
+      <w:proofErr w:type="spellStart"/>
+      <w:r>
+        <w:rPr>
+          <w:rFonts w:ascii="Times New Roman" w:hAnsi="Times New Roman" w:cs="Times New Roman"/>
+          <w:sz w:val="22"/>
+          <w:szCs w:val="22"/>
+          <w:highlight w:val="cyan"/>
+        </w:rPr>
+        <w:t>custody_complaint</w:t>
+      </w:r>
+      <w:proofErr w:type="spellEnd"/>
+      <w:r>
+        <w:rPr>
+          <w:rFonts w:ascii="Times New Roman" w:hAnsi="Times New Roman" w:cs="Times New Roman"/>
+          <w:sz w:val="22"/>
+          <w:szCs w:val="22"/>
+          <w:highlight w:val="cyan"/>
+        </w:rPr>
+        <w:t>”</w:t>
       </w:r>
       <w:r>
         <w:rPr>
@@ -2317,6 +2660,7 @@
         </w:rPr>
         <w:t xml:space="preserve"> </w:t>
       </w:r>
+      <w:proofErr w:type="spellStart"/>
       <w:r>
         <w:rPr>
           <w:rFonts w:ascii="Times New Roman" w:hAnsi="Times New Roman" w:cs="Times New Roman"/>
@@ -2335,6 +2679,7 @@
         </w:rPr>
         <w:t>if</w:t>
       </w:r>
+      <w:proofErr w:type="spellEnd"/>
       <w:r>
         <w:rPr>
           <w:rFonts w:ascii="Times New Roman" w:hAnsi="Times New Roman" w:cs="Times New Roman"/>
@@ -2342,8 +2687,39 @@
           <w:szCs w:val="22"/>
           <w:highlight w:val="cyan"/>
         </w:rPr>
-        <w:t xml:space="preserve"> tool_ID == “custody_answer</w:t>
-      </w:r>
+        <w:t xml:space="preserve"> </w:t>
+      </w:r>
+      <w:proofErr w:type="spellStart"/>
+      <w:r>
+        <w:rPr>
+          <w:rFonts w:ascii="Times New Roman" w:hAnsi="Times New Roman" w:cs="Times New Roman"/>
+          <w:sz w:val="22"/>
+          <w:szCs w:val="22"/>
+          <w:highlight w:val="cyan"/>
+        </w:rPr>
+        <w:t>tool_ID</w:t>
+      </w:r>
+      <w:proofErr w:type="spellEnd"/>
+      <w:r>
+        <w:rPr>
+          <w:rFonts w:ascii="Times New Roman" w:hAnsi="Times New Roman" w:cs="Times New Roman"/>
+          <w:sz w:val="22"/>
+          <w:szCs w:val="22"/>
+          <w:highlight w:val="cyan"/>
+        </w:rPr>
+        <w:t xml:space="preserve"> == “</w:t>
+      </w:r>
+      <w:proofErr w:type="spellStart"/>
+      <w:r>
+        <w:rPr>
+          <w:rFonts w:ascii="Times New Roman" w:hAnsi="Times New Roman" w:cs="Times New Roman"/>
+          <w:sz w:val="22"/>
+          <w:szCs w:val="22"/>
+          <w:highlight w:val="cyan"/>
+        </w:rPr>
+        <w:t>custody_answer</w:t>
+      </w:r>
+      <w:proofErr w:type="spellEnd"/>
       <w:r>
         <w:rPr>
           <w:rFonts w:ascii="Times New Roman" w:hAnsi="Times New Roman" w:cs="Times New Roman"/>
@@ -2568,6 +2944,7 @@
         </w:rPr>
         <w:t xml:space="preserve"> </w:t>
       </w:r>
+      <w:proofErr w:type="spellStart"/>
       <w:r>
         <w:rPr>
           <w:rFonts w:ascii="Times New Roman" w:hAnsi="Times New Roman" w:cs="Times New Roman"/>
@@ -2586,6 +2963,7 @@
         </w:rPr>
         <w:t>if</w:t>
       </w:r>
+      <w:proofErr w:type="spellEnd"/>
       <w:r>
         <w:rPr>
           <w:rFonts w:ascii="Times New Roman" w:hAnsi="Times New Roman" w:cs="Times New Roman"/>
@@ -2593,8 +2971,9 @@
           <w:szCs w:val="22"/>
           <w:highlight w:val="cyan"/>
         </w:rPr>
-        <w:t xml:space="preserve"> tool_ID == “divorce_answer</w:t>
-      </w:r>
+        <w:t xml:space="preserve"> </w:t>
+      </w:r>
+      <w:proofErr w:type="spellStart"/>
       <w:r>
         <w:rPr>
           <w:rFonts w:ascii="Times New Roman" w:hAnsi="Times New Roman" w:cs="Times New Roman"/>
@@ -2602,6 +2981,36 @@
           <w:szCs w:val="22"/>
           <w:highlight w:val="cyan"/>
         </w:rPr>
+        <w:t>tool_ID</w:t>
+      </w:r>
+      <w:proofErr w:type="spellEnd"/>
+      <w:r>
+        <w:rPr>
+          <w:rFonts w:ascii="Times New Roman" w:hAnsi="Times New Roman" w:cs="Times New Roman"/>
+          <w:sz w:val="22"/>
+          <w:szCs w:val="22"/>
+          <w:highlight w:val="cyan"/>
+        </w:rPr>
+        <w:t xml:space="preserve"> == “</w:t>
+      </w:r>
+      <w:proofErr w:type="spellStart"/>
+      <w:r>
+        <w:rPr>
+          <w:rFonts w:ascii="Times New Roman" w:hAnsi="Times New Roman" w:cs="Times New Roman"/>
+          <w:sz w:val="22"/>
+          <w:szCs w:val="22"/>
+          <w:highlight w:val="cyan"/>
+        </w:rPr>
+        <w:t>divorce_answer</w:t>
+      </w:r>
+      <w:proofErr w:type="spellEnd"/>
+      <w:r>
+        <w:rPr>
+          <w:rFonts w:ascii="Times New Roman" w:hAnsi="Times New Roman" w:cs="Times New Roman"/>
+          <w:sz w:val="22"/>
+          <w:szCs w:val="22"/>
+          <w:highlight w:val="cyan"/>
+        </w:rPr>
         <w:t>”</w:t>
       </w:r>
       <w:r>
@@ -2670,6 +3079,65 @@
     </w:p>
     <w:p>
       <w:pPr>
+        <w:spacing w:after="0" w:line="240" w:lineRule="auto"/>
+        <w:rPr>
+          <w:rFonts w:ascii="Times New Roman" w:hAnsi="Times New Roman" w:cs="Times New Roman"/>
+          <w:sz w:val="22"/>
+          <w:szCs w:val="22"/>
+        </w:rPr>
+      </w:pPr>
+      <w:r>
+        <w:rPr>
+          <w:rFonts w:ascii="Times New Roman" w:hAnsi="Times New Roman" w:cs="Times New Roman"/>
+          <w:sz w:val="22"/>
+          <w:szCs w:val="22"/>
+          <w:highlight w:val="yellow"/>
+        </w:rPr>
+        <w:t xml:space="preserve">{%p if </w:t>
+      </w:r>
+      <w:proofErr w:type="spellStart"/>
+      <w:r>
+        <w:rPr>
+          <w:rFonts w:ascii="Times New Roman" w:hAnsi="Times New Roman" w:cs="Times New Roman"/>
+          <w:sz w:val="22"/>
+          <w:szCs w:val="22"/>
+          <w:highlight w:val="yellow"/>
+        </w:rPr>
+        <w:t>create_</w:t>
+      </w:r>
+      <w:proofErr w:type="gramStart"/>
+      <w:r>
+        <w:rPr>
+          <w:rFonts w:ascii="Times New Roman" w:hAnsi="Times New Roman" w:cs="Times New Roman"/>
+          <w:sz w:val="22"/>
+          <w:szCs w:val="22"/>
+          <w:highlight w:val="yellow"/>
+        </w:rPr>
+        <w:t>counterclaim</w:t>
+      </w:r>
+      <w:proofErr w:type="spellEnd"/>
+      <w:r>
+        <w:rPr>
+          <w:rFonts w:ascii="Times New Roman" w:hAnsi="Times New Roman" w:cs="Times New Roman"/>
+          <w:sz w:val="22"/>
+          <w:szCs w:val="22"/>
+          <w:highlight w:val="yellow"/>
+        </w:rPr>
+        <w:t xml:space="preserve"> </w:t>
+      </w:r>
+      <w:r>
+        <w:rPr>
+          <w:rFonts w:ascii="Times New Roman" w:hAnsi="Times New Roman" w:cs="Times New Roman"/>
+          <w:sz w:val="22"/>
+          <w:szCs w:val="22"/>
+          <w:highlight w:val="yellow"/>
+        </w:rPr>
+        <w:t>%}</w:t>
+      </w:r>
+      <w:proofErr w:type="gramEnd"/>
+    </w:p>
+    <w:p>
+      <w:pPr>
         <w:spacing w:after="0" w:line="276" w:lineRule="auto"/>
         <w:rPr>
           <w:rFonts w:ascii="Times New Roman" w:hAnsi="Times New Roman" w:cs="Times New Roman"/>
@@ -2722,14 +3190,45 @@
         </w:rPr>
         <w:t xml:space="preserve">{%p if </w:t>
       </w:r>
-      <w:r>
-        <w:rPr>
-          <w:rFonts w:ascii="Times New Roman" w:hAnsi="Times New Roman" w:cs="Times New Roman"/>
-          <w:sz w:val="22"/>
-          <w:szCs w:val="22"/>
-          <w:highlight w:val="yellow"/>
-        </w:rPr>
-        <w:t>complaint_type == “with_children”</w:t>
+      <w:proofErr w:type="spellStart"/>
+      <w:r>
+        <w:rPr>
+          <w:rFonts w:ascii="Times New Roman" w:hAnsi="Times New Roman" w:cs="Times New Roman"/>
+          <w:sz w:val="22"/>
+          <w:szCs w:val="22"/>
+          <w:highlight w:val="yellow"/>
+        </w:rPr>
+        <w:t>complaint_type</w:t>
+      </w:r>
+      <w:proofErr w:type="spellEnd"/>
+      <w:r>
+        <w:rPr>
+          <w:rFonts w:ascii="Times New Roman" w:hAnsi="Times New Roman" w:cs="Times New Roman"/>
+          <w:sz w:val="22"/>
+          <w:szCs w:val="22"/>
+          <w:highlight w:val="yellow"/>
+        </w:rPr>
+        <w:t xml:space="preserve"> == “</w:t>
+      </w:r>
+      <w:proofErr w:type="spellStart"/>
+      <w:r>
+        <w:rPr>
+          <w:rFonts w:ascii="Times New Roman" w:hAnsi="Times New Roman" w:cs="Times New Roman"/>
+          <w:sz w:val="22"/>
+          <w:szCs w:val="22"/>
+          <w:highlight w:val="yellow"/>
+        </w:rPr>
+        <w:t>with_children</w:t>
+      </w:r>
+      <w:proofErr w:type="spellEnd"/>
+      <w:r>
+        <w:rPr>
+          <w:rFonts w:ascii="Times New Roman" w:hAnsi="Times New Roman" w:cs="Times New Roman"/>
+          <w:sz w:val="22"/>
+          <w:szCs w:val="22"/>
+          <w:highlight w:val="yellow"/>
+        </w:rPr>
+        <w:t>”</w:t>
       </w:r>
       <w:r>
         <w:rPr>
@@ -2811,11 +3310,234 @@
           <w:sz w:val="22"/>
           <w:szCs w:val="22"/>
         </w:rPr>
+        <w:t xml:space="preserve"> </w:t>
+      </w:r>
+      <w:r>
+        <w:rPr>
+          <w:rFonts w:ascii="Times New Roman" w:hAnsi="Times New Roman" w:cs="Times New Roman"/>
+          <w:sz w:val="22"/>
+          <w:szCs w:val="22"/>
+        </w:rPr>
+        <w:t>Application for IV-D Services</w:t>
+      </w:r>
+    </w:p>
+    <w:p>
+      <w:pPr>
+        <w:spacing w:after="0" w:line="240" w:lineRule="auto"/>
+        <w:rPr>
+          <w:rFonts w:ascii="Times New Roman" w:hAnsi="Times New Roman" w:cs="Times New Roman"/>
+          <w:sz w:val="22"/>
+          <w:szCs w:val="22"/>
+        </w:rPr>
+      </w:pPr>
+      <w:r>
+        <w:rPr>
+          <w:rFonts w:ascii="Times New Roman" w:hAnsi="Times New Roman" w:cs="Times New Roman"/>
+          <w:sz w:val="22"/>
+          <w:szCs w:val="22"/>
+          <w:highlight w:val="yellow"/>
+        </w:rPr>
+        <w:t xml:space="preserve">{%p </w:t>
+      </w:r>
+      <w:proofErr w:type="gramStart"/>
+      <w:r>
+        <w:rPr>
+          <w:rFonts w:ascii="Times New Roman" w:hAnsi="Times New Roman" w:cs="Times New Roman"/>
+          <w:sz w:val="22"/>
+          <w:szCs w:val="22"/>
+          <w:highlight w:val="yellow"/>
+        </w:rPr>
+        <w:t>endif %}</w:t>
+      </w:r>
+      <w:proofErr w:type="gramEnd"/>
+    </w:p>
+    <w:p>
+      <w:pPr>
+        <w:spacing w:after="0" w:line="240" w:lineRule="auto"/>
+        <w:rPr>
+          <w:rFonts w:ascii="Times New Roman" w:hAnsi="Times New Roman" w:cs="Times New Roman"/>
+          <w:sz w:val="22"/>
+          <w:szCs w:val="22"/>
+        </w:rPr>
+      </w:pPr>
+      <w:r>
+        <w:rPr>
+          <w:rFonts w:ascii="Times New Roman" w:hAnsi="Times New Roman" w:cs="Times New Roman"/>
+          <w:sz w:val="22"/>
+          <w:szCs w:val="22"/>
+          <w:highlight w:val="yellow"/>
+        </w:rPr>
+        <w:t xml:space="preserve">{%p if </w:t>
+      </w:r>
+      <w:proofErr w:type="spellStart"/>
+      <w:r>
+        <w:rPr>
+          <w:rFonts w:ascii="Times New Roman" w:hAnsi="Times New Roman" w:cs="Times New Roman"/>
+          <w:sz w:val="22"/>
+          <w:szCs w:val="22"/>
+          <w:highlight w:val="yellow"/>
+        </w:rPr>
+        <w:t>complaint_type</w:t>
+      </w:r>
+      <w:proofErr w:type="spellEnd"/>
+      <w:r>
+        <w:rPr>
+          <w:rFonts w:ascii="Times New Roman" w:hAnsi="Times New Roman" w:cs="Times New Roman"/>
+          <w:sz w:val="22"/>
+          <w:szCs w:val="22"/>
+          <w:highlight w:val="yellow"/>
+        </w:rPr>
+        <w:t xml:space="preserve"> == “</w:t>
+      </w:r>
+      <w:proofErr w:type="spellStart"/>
+      <w:r>
+        <w:rPr>
+          <w:rFonts w:ascii="Times New Roman" w:hAnsi="Times New Roman" w:cs="Times New Roman"/>
+          <w:sz w:val="22"/>
+          <w:szCs w:val="22"/>
+          <w:highlight w:val="yellow"/>
+        </w:rPr>
+        <w:t>with_children</w:t>
+      </w:r>
+      <w:proofErr w:type="spellEnd"/>
+      <w:r>
+        <w:rPr>
+          <w:rFonts w:ascii="Times New Roman" w:hAnsi="Times New Roman" w:cs="Times New Roman"/>
+          <w:sz w:val="22"/>
+          <w:szCs w:val="22"/>
+          <w:highlight w:val="yellow"/>
+        </w:rPr>
+        <w:t>”</w:t>
+      </w:r>
+      <w:r>
+        <w:rPr>
+          <w:rFonts w:ascii="Times New Roman" w:hAnsi="Times New Roman" w:cs="Times New Roman"/>
+          <w:sz w:val="22"/>
+          <w:szCs w:val="22"/>
+          <w:highlight w:val="yellow"/>
+        </w:rPr>
+        <w:t xml:space="preserve"> or </w:t>
+      </w:r>
+      <w:proofErr w:type="spellStart"/>
+      <w:r>
+        <w:rPr>
+          <w:rFonts w:ascii="Times New Roman" w:hAnsi="Times New Roman" w:cs="Times New Roman"/>
+          <w:sz w:val="22"/>
+          <w:szCs w:val="22"/>
+          <w:highlight w:val="yellow"/>
+        </w:rPr>
+        <w:t>user_wants_post_divorce_support</w:t>
+      </w:r>
+      <w:proofErr w:type="spellEnd"/>
+      <w:r>
+        <w:rPr>
+          <w:rFonts w:ascii="Times New Roman" w:hAnsi="Times New Roman" w:cs="Times New Roman"/>
+          <w:sz w:val="22"/>
+          <w:szCs w:val="22"/>
+          <w:highlight w:val="yellow"/>
+        </w:rPr>
+        <w:t xml:space="preserve"> </w:t>
+      </w:r>
+      <w:r>
+        <w:rPr>
+          <w:rFonts w:ascii="Times New Roman" w:hAnsi="Times New Roman" w:cs="Times New Roman"/>
+          <w:sz w:val="22"/>
+          <w:szCs w:val="22"/>
+          <w:highlight w:val="yellow"/>
+        </w:rPr>
+        <w:t>%}</w:t>
+      </w:r>
+    </w:p>
+    <w:p>
+      <w:pPr>
+        <w:spacing w:after="0" w:line="276" w:lineRule="auto"/>
+        <w:rPr>
+          <w:rFonts w:ascii="Times New Roman" w:hAnsi="Times New Roman" w:cs="Times New Roman"/>
+          <w:sz w:val="22"/>
+          <w:szCs w:val="22"/>
+        </w:rPr>
+      </w:pPr>
+      <w:proofErr w:type="gramStart"/>
+      <w:r>
+        <w:rPr>
+          <w:rFonts w:ascii="Times New Roman" w:hAnsi="Times New Roman" w:cs="Times New Roman"/>
+          <w:sz w:val="22"/>
+          <w:szCs w:val="22"/>
+        </w:rPr>
+        <w:t>[ ]</w:t>
+      </w:r>
+      <w:proofErr w:type="gramEnd"/>
+      <w:r>
+        <w:rPr>
+          <w:rFonts w:ascii="Times New Roman" w:hAnsi="Times New Roman" w:cs="Times New Roman"/>
+          <w:sz w:val="22"/>
+          <w:szCs w:val="22"/>
+        </w:rPr>
         <w:t xml:space="preserve"> Verified Statement </w:t>
       </w:r>
     </w:p>
     <w:p>
       <w:pPr>
+        <w:spacing w:after="0" w:line="240" w:lineRule="auto"/>
+        <w:rPr>
+          <w:rFonts w:ascii="Times New Roman" w:hAnsi="Times New Roman" w:cs="Times New Roman"/>
+          <w:sz w:val="22"/>
+          <w:szCs w:val="22"/>
+        </w:rPr>
+      </w:pPr>
+      <w:r>
+        <w:rPr>
+          <w:rFonts w:ascii="Times New Roman" w:hAnsi="Times New Roman" w:cs="Times New Roman"/>
+          <w:sz w:val="22"/>
+          <w:szCs w:val="22"/>
+          <w:highlight w:val="yellow"/>
+        </w:rPr>
+        <w:t xml:space="preserve">{%p </w:t>
+      </w:r>
+      <w:proofErr w:type="gramStart"/>
+      <w:r>
+        <w:rPr>
+          <w:rFonts w:ascii="Times New Roman" w:hAnsi="Times New Roman" w:cs="Times New Roman"/>
+          <w:sz w:val="22"/>
+          <w:szCs w:val="22"/>
+          <w:highlight w:val="yellow"/>
+        </w:rPr>
+        <w:t>endif %}</w:t>
+      </w:r>
+      <w:proofErr w:type="gramEnd"/>
+    </w:p>
+    <w:p>
+      <w:pPr>
+        <w:spacing w:after="0" w:line="240" w:lineRule="auto"/>
+        <w:rPr>
+          <w:rFonts w:ascii="Times New Roman" w:hAnsi="Times New Roman" w:cs="Times New Roman"/>
+          <w:sz w:val="22"/>
+          <w:szCs w:val="22"/>
+        </w:rPr>
+      </w:pPr>
+      <w:r>
+        <w:rPr>
+          <w:rFonts w:ascii="Times New Roman" w:hAnsi="Times New Roman" w:cs="Times New Roman"/>
+          <w:sz w:val="22"/>
+          <w:szCs w:val="22"/>
+          <w:highlight w:val="yellow"/>
+        </w:rPr>
+        <w:t xml:space="preserve">{%p </w:t>
+      </w:r>
+      <w:proofErr w:type="gramStart"/>
+      <w:r>
+        <w:rPr>
+          <w:rFonts w:ascii="Times New Roman" w:hAnsi="Times New Roman" w:cs="Times New Roman"/>
+          <w:sz w:val="22"/>
+          <w:szCs w:val="22"/>
+          <w:highlight w:val="yellow"/>
+        </w:rPr>
+        <w:t>endif %}</w:t>
+      </w:r>
+      <w:proofErr w:type="gramEnd"/>
+    </w:p>
+    <w:p>
+      <w:pPr>
         <w:spacing w:after="0" w:line="276" w:lineRule="auto"/>
         <w:rPr>
           <w:rFonts w:ascii="Times New Roman" w:hAnsi="Times New Roman" w:cs="Times New Roman"/>
@@ -2839,15 +3561,297 @@
           <w:sz w:val="22"/>
           <w:szCs w:val="22"/>
         </w:rPr>
+        <w:t xml:space="preserve"> Domestic Relations Verified Financial Information Form</w:t>
+      </w:r>
+    </w:p>
+    <w:p>
+      <w:pPr>
+        <w:spacing w:after="0" w:line="240" w:lineRule="auto"/>
+        <w:rPr>
+          <w:rFonts w:ascii="Times New Roman" w:hAnsi="Times New Roman" w:cs="Times New Roman"/>
+          <w:sz w:val="22"/>
+          <w:szCs w:val="22"/>
+        </w:rPr>
+      </w:pPr>
+      <w:r>
+        <w:rPr>
+          <w:rFonts w:ascii="Times New Roman" w:hAnsi="Times New Roman" w:cs="Times New Roman"/>
+          <w:sz w:val="22"/>
+          <w:szCs w:val="22"/>
+          <w:highlight w:val="cyan"/>
+        </w:rPr>
+        <w:t>{%</w:t>
+      </w:r>
+      <w:r>
+        <w:rPr>
+          <w:rFonts w:ascii="Times New Roman" w:hAnsi="Times New Roman" w:cs="Times New Roman"/>
+          <w:sz w:val="22"/>
+          <w:szCs w:val="22"/>
+          <w:highlight w:val="cyan"/>
+        </w:rPr>
+        <w:t>p</w:t>
+      </w:r>
+      <w:r>
+        <w:rPr>
+          <w:rFonts w:ascii="Times New Roman" w:hAnsi="Times New Roman" w:cs="Times New Roman"/>
+          <w:sz w:val="22"/>
+          <w:szCs w:val="22"/>
+          <w:highlight w:val="cyan"/>
+        </w:rPr>
         <w:t xml:space="preserve"> </w:t>
       </w:r>
-      <w:r>
-        <w:rPr>
-          <w:rFonts w:ascii="Times New Roman" w:hAnsi="Times New Roman" w:cs="Times New Roman"/>
-          <w:sz w:val="22"/>
-          <w:szCs w:val="22"/>
-        </w:rPr>
-        <w:t>Application for IV-D Services</w:t>
+      <w:proofErr w:type="spellStart"/>
+      <w:r>
+        <w:rPr>
+          <w:rFonts w:ascii="Times New Roman" w:hAnsi="Times New Roman" w:cs="Times New Roman"/>
+          <w:sz w:val="22"/>
+          <w:szCs w:val="22"/>
+          <w:highlight w:val="cyan"/>
+        </w:rPr>
+        <w:t>el</w:t>
+      </w:r>
+      <w:r>
+        <w:rPr>
+          <w:rFonts w:ascii="Times New Roman" w:hAnsi="Times New Roman" w:cs="Times New Roman"/>
+          <w:sz w:val="22"/>
+          <w:szCs w:val="22"/>
+          <w:highlight w:val="cyan"/>
+        </w:rPr>
+        <w:t>if</w:t>
+      </w:r>
+      <w:proofErr w:type="spellEnd"/>
+      <w:r>
+        <w:rPr>
+          <w:rFonts w:ascii="Times New Roman" w:hAnsi="Times New Roman" w:cs="Times New Roman"/>
+          <w:sz w:val="22"/>
+          <w:szCs w:val="22"/>
+          <w:highlight w:val="cyan"/>
+        </w:rPr>
+        <w:t xml:space="preserve"> </w:t>
+      </w:r>
+      <w:proofErr w:type="spellStart"/>
+      <w:r>
+        <w:rPr>
+          <w:rFonts w:ascii="Times New Roman" w:hAnsi="Times New Roman" w:cs="Times New Roman"/>
+          <w:sz w:val="22"/>
+          <w:szCs w:val="22"/>
+          <w:highlight w:val="cyan"/>
+        </w:rPr>
+        <w:t>tool</w:t>
+      </w:r>
+      <w:r>
+        <w:rPr>
+          <w:rFonts w:ascii="Times New Roman" w:hAnsi="Times New Roman" w:cs="Times New Roman"/>
+          <w:sz w:val="22"/>
+          <w:szCs w:val="22"/>
+          <w:highlight w:val="cyan"/>
+        </w:rPr>
+        <w:t>_ID</w:t>
+      </w:r>
+      <w:proofErr w:type="spellEnd"/>
+      <w:r>
+        <w:rPr>
+          <w:rFonts w:ascii="Times New Roman" w:hAnsi="Times New Roman" w:cs="Times New Roman"/>
+          <w:sz w:val="22"/>
+          <w:szCs w:val="22"/>
+          <w:highlight w:val="cyan"/>
+        </w:rPr>
+        <w:t xml:space="preserve"> == </w:t>
+      </w:r>
+      <w:r>
+        <w:rPr>
+          <w:rFonts w:ascii="Times New Roman" w:hAnsi="Times New Roman" w:cs="Times New Roman"/>
+          <w:sz w:val="22"/>
+          <w:szCs w:val="22"/>
+          <w:highlight w:val="cyan"/>
+        </w:rPr>
+        <w:t>“</w:t>
+      </w:r>
+      <w:proofErr w:type="spellStart"/>
+      <w:r>
+        <w:rPr>
+          <w:rFonts w:ascii="Times New Roman" w:hAnsi="Times New Roman" w:cs="Times New Roman"/>
+          <w:sz w:val="22"/>
+          <w:szCs w:val="22"/>
+          <w:highlight w:val="cyan"/>
+        </w:rPr>
+        <w:t>divorce</w:t>
+      </w:r>
+      <w:r>
+        <w:rPr>
+          <w:rFonts w:ascii="Times New Roman" w:hAnsi="Times New Roman" w:cs="Times New Roman"/>
+          <w:sz w:val="22"/>
+          <w:szCs w:val="22"/>
+          <w:highlight w:val="cyan"/>
+        </w:rPr>
+        <w:t>_complaint</w:t>
+      </w:r>
+      <w:proofErr w:type="spellEnd"/>
+      <w:r>
+        <w:rPr>
+          <w:rFonts w:ascii="Times New Roman" w:hAnsi="Times New Roman" w:cs="Times New Roman"/>
+          <w:sz w:val="22"/>
+          <w:szCs w:val="22"/>
+          <w:highlight w:val="cyan"/>
+        </w:rPr>
+        <w:t>”</w:t>
+      </w:r>
+      <w:r>
+        <w:rPr>
+          <w:rFonts w:ascii="Times New Roman" w:hAnsi="Times New Roman" w:cs="Times New Roman"/>
+          <w:sz w:val="22"/>
+          <w:szCs w:val="22"/>
+          <w:highlight w:val="cyan"/>
+        </w:rPr>
+        <w:t xml:space="preserve"> %}</w:t>
+      </w:r>
+    </w:p>
+    <w:p>
+      <w:pPr>
+        <w:spacing w:after="0" w:line="276" w:lineRule="auto"/>
+        <w:rPr>
+          <w:rFonts w:ascii="Times New Roman" w:hAnsi="Times New Roman" w:cs="Times New Roman"/>
+          <w:sz w:val="22"/>
+          <w:szCs w:val="22"/>
+        </w:rPr>
+      </w:pPr>
+      <w:proofErr w:type="gramStart"/>
+      <w:r>
+        <w:rPr>
+          <w:rFonts w:ascii="Times New Roman" w:hAnsi="Times New Roman" w:cs="Times New Roman"/>
+          <w:sz w:val="22"/>
+          <w:szCs w:val="22"/>
+        </w:rPr>
+        <w:t>[ ]</w:t>
+      </w:r>
+      <w:proofErr w:type="gramEnd"/>
+      <w:r>
+        <w:rPr>
+          <w:rFonts w:ascii="Times New Roman" w:hAnsi="Times New Roman" w:cs="Times New Roman"/>
+          <w:sz w:val="22"/>
+          <w:szCs w:val="22"/>
+        </w:rPr>
+        <w:t xml:space="preserve"> </w:t>
+      </w:r>
+      <w:r>
+        <w:rPr>
+          <w:rFonts w:ascii="Times New Roman" w:hAnsi="Times New Roman" w:cs="Times New Roman"/>
+          <w:sz w:val="22"/>
+          <w:szCs w:val="22"/>
+        </w:rPr>
+        <w:t>Default Request and Entry</w:t>
+      </w:r>
+    </w:p>
+    <w:p>
+      <w:pPr>
+        <w:spacing w:after="0" w:line="276" w:lineRule="auto"/>
+        <w:rPr>
+          <w:rFonts w:ascii="Times New Roman" w:hAnsi="Times New Roman" w:cs="Times New Roman"/>
+          <w:sz w:val="22"/>
+          <w:szCs w:val="22"/>
+        </w:rPr>
+      </w:pPr>
+      <w:proofErr w:type="gramStart"/>
+      <w:r>
+        <w:rPr>
+          <w:rFonts w:ascii="Times New Roman" w:hAnsi="Times New Roman" w:cs="Times New Roman"/>
+          <w:sz w:val="22"/>
+          <w:szCs w:val="22"/>
+        </w:rPr>
+        <w:t>[ ]</w:t>
+      </w:r>
+      <w:proofErr w:type="gramEnd"/>
+      <w:r>
+        <w:rPr>
+          <w:rFonts w:ascii="Times New Roman" w:hAnsi="Times New Roman" w:cs="Times New Roman"/>
+          <w:sz w:val="22"/>
+          <w:szCs w:val="22"/>
+        </w:rPr>
+        <w:t xml:space="preserve"> Notice of Hearing</w:t>
+      </w:r>
+    </w:p>
+    <w:p>
+      <w:pPr>
+        <w:spacing w:after="0" w:line="276" w:lineRule="auto"/>
+        <w:rPr>
+          <w:rFonts w:ascii="Times New Roman" w:hAnsi="Times New Roman" w:cs="Times New Roman"/>
+          <w:sz w:val="22"/>
+          <w:szCs w:val="22"/>
+        </w:rPr>
+      </w:pPr>
+      <w:proofErr w:type="gramStart"/>
+      <w:r>
+        <w:rPr>
+          <w:rFonts w:ascii="Times New Roman" w:hAnsi="Times New Roman" w:cs="Times New Roman"/>
+          <w:sz w:val="22"/>
+          <w:szCs w:val="22"/>
+        </w:rPr>
+        <w:t>[ ]</w:t>
+      </w:r>
+      <w:proofErr w:type="gramEnd"/>
+      <w:r>
+        <w:rPr>
+          <w:rFonts w:ascii="Times New Roman" w:hAnsi="Times New Roman" w:cs="Times New Roman"/>
+          <w:sz w:val="22"/>
+          <w:szCs w:val="22"/>
+        </w:rPr>
+        <w:t xml:space="preserve"> Notice of Hearing and Motion for Entry of Consent Judgment of Divorce</w:t>
+      </w:r>
+    </w:p>
+    <w:p>
+      <w:pPr>
+        <w:spacing w:after="0" w:line="276" w:lineRule="auto"/>
+        <w:rPr>
+          <w:rFonts w:ascii="Times New Roman" w:hAnsi="Times New Roman" w:cs="Times New Roman"/>
+          <w:sz w:val="22"/>
+          <w:szCs w:val="22"/>
+        </w:rPr>
+      </w:pPr>
+      <w:proofErr w:type="gramStart"/>
+      <w:r>
+        <w:rPr>
+          <w:rFonts w:ascii="Times New Roman" w:hAnsi="Times New Roman" w:cs="Times New Roman"/>
+          <w:sz w:val="22"/>
+          <w:szCs w:val="22"/>
+        </w:rPr>
+        <w:t>[ ]</w:t>
+      </w:r>
+      <w:proofErr w:type="gramEnd"/>
+      <w:r>
+        <w:rPr>
+          <w:rFonts w:ascii="Times New Roman" w:hAnsi="Times New Roman" w:cs="Times New Roman"/>
+          <w:sz w:val="22"/>
+          <w:szCs w:val="22"/>
+        </w:rPr>
+        <w:t xml:space="preserve"> Notice of Hearing and Motion for Entry of Default Judgment of Divorce</w:t>
+      </w:r>
+    </w:p>
+    <w:p>
+      <w:pPr>
+        <w:spacing w:after="0" w:line="276" w:lineRule="auto"/>
+        <w:rPr>
+          <w:rFonts w:ascii="Times New Roman" w:hAnsi="Times New Roman" w:cs="Times New Roman"/>
+          <w:sz w:val="22"/>
+          <w:szCs w:val="22"/>
+        </w:rPr>
+      </w:pPr>
+      <w:proofErr w:type="gramStart"/>
+      <w:r>
+        <w:rPr>
+          <w:rFonts w:ascii="Times New Roman" w:hAnsi="Times New Roman" w:cs="Times New Roman"/>
+          <w:sz w:val="22"/>
+          <w:szCs w:val="22"/>
+        </w:rPr>
+        <w:t>[ ]</w:t>
+      </w:r>
+      <w:proofErr w:type="gramEnd"/>
+      <w:r>
+        <w:rPr>
+          <w:rFonts w:ascii="Times New Roman" w:hAnsi="Times New Roman" w:cs="Times New Roman"/>
+          <w:sz w:val="22"/>
+          <w:szCs w:val="22"/>
+        </w:rPr>
+        <w:t xml:space="preserve"> Proposed Judgment of Divorce</w:t>
       </w:r>
     </w:p>
     <w:p>
@@ -2866,6 +3870,93 @@
           <w:szCs w:val="22"/>
           <w:highlight w:val="yellow"/>
         </w:rPr>
+        <w:t xml:space="preserve">{%p if </w:t>
+      </w:r>
+      <w:proofErr w:type="spellStart"/>
+      <w:r>
+        <w:rPr>
+          <w:rFonts w:ascii="Times New Roman" w:hAnsi="Times New Roman" w:cs="Times New Roman"/>
+          <w:sz w:val="22"/>
+          <w:szCs w:val="22"/>
+          <w:highlight w:val="yellow"/>
+        </w:rPr>
+        <w:t>there_are_marital_</w:t>
+      </w:r>
+      <w:proofErr w:type="gramStart"/>
+      <w:r>
+        <w:rPr>
+          <w:rFonts w:ascii="Times New Roman" w:hAnsi="Times New Roman" w:cs="Times New Roman"/>
+          <w:sz w:val="22"/>
+          <w:szCs w:val="22"/>
+          <w:highlight w:val="yellow"/>
+        </w:rPr>
+        <w:t>children</w:t>
+      </w:r>
+      <w:proofErr w:type="spellEnd"/>
+      <w:r>
+        <w:rPr>
+          <w:rFonts w:ascii="Times New Roman" w:hAnsi="Times New Roman" w:cs="Times New Roman"/>
+          <w:sz w:val="22"/>
+          <w:szCs w:val="22"/>
+          <w:highlight w:val="yellow"/>
+        </w:rPr>
+        <w:t xml:space="preserve"> </w:t>
+      </w:r>
+      <w:r>
+        <w:rPr>
+          <w:rFonts w:ascii="Times New Roman" w:hAnsi="Times New Roman" w:cs="Times New Roman"/>
+          <w:sz w:val="22"/>
+          <w:szCs w:val="22"/>
+          <w:highlight w:val="yellow"/>
+        </w:rPr>
+        <w:t>%}</w:t>
+      </w:r>
+      <w:proofErr w:type="gramEnd"/>
+    </w:p>
+    <w:p>
+      <w:pPr>
+        <w:spacing w:after="0" w:line="276" w:lineRule="auto"/>
+        <w:rPr>
+          <w:rFonts w:ascii="Times New Roman" w:hAnsi="Times New Roman" w:cs="Times New Roman"/>
+          <w:sz w:val="22"/>
+          <w:szCs w:val="22"/>
+        </w:rPr>
+      </w:pPr>
+      <w:proofErr w:type="gramStart"/>
+      <w:r>
+        <w:rPr>
+          <w:rFonts w:ascii="Times New Roman" w:hAnsi="Times New Roman" w:cs="Times New Roman"/>
+          <w:sz w:val="22"/>
+          <w:szCs w:val="22"/>
+        </w:rPr>
+        <w:t>[ ]</w:t>
+      </w:r>
+      <w:proofErr w:type="gramEnd"/>
+      <w:r>
+        <w:rPr>
+          <w:rFonts w:ascii="Times New Roman" w:hAnsi="Times New Roman" w:cs="Times New Roman"/>
+          <w:sz w:val="22"/>
+          <w:szCs w:val="22"/>
+        </w:rPr>
+        <w:t xml:space="preserve"> Proposed Uniform Child Support Order</w:t>
+      </w:r>
+    </w:p>
+    <w:p>
+      <w:pPr>
+        <w:spacing w:after="0" w:line="240" w:lineRule="auto"/>
+        <w:rPr>
+          <w:rFonts w:ascii="Times New Roman" w:hAnsi="Times New Roman" w:cs="Times New Roman"/>
+          <w:sz w:val="22"/>
+          <w:szCs w:val="22"/>
+        </w:rPr>
+      </w:pPr>
+      <w:r>
+        <w:rPr>
+          <w:rFonts w:ascii="Times New Roman" w:hAnsi="Times New Roman" w:cs="Times New Roman"/>
+          <w:sz w:val="22"/>
+          <w:szCs w:val="22"/>
+          <w:highlight w:val="yellow"/>
+        </w:rPr>
         <w:t xml:space="preserve">{%p </w:t>
       </w:r>
       <w:proofErr w:type="gramStart"/>
@@ -2882,6 +3973,105 @@
     </w:p>
     <w:p>
       <w:pPr>
+        <w:spacing w:after="0" w:line="240" w:lineRule="auto"/>
+        <w:rPr>
+          <w:rFonts w:ascii="Times New Roman" w:hAnsi="Times New Roman" w:cs="Times New Roman"/>
+          <w:sz w:val="22"/>
+          <w:szCs w:val="22"/>
+        </w:rPr>
+      </w:pPr>
+      <w:r>
+        <w:rPr>
+          <w:rFonts w:ascii="Times New Roman" w:hAnsi="Times New Roman" w:cs="Times New Roman"/>
+          <w:sz w:val="22"/>
+          <w:szCs w:val="22"/>
+          <w:highlight w:val="yellow"/>
+        </w:rPr>
+        <w:t xml:space="preserve">{%p if </w:t>
+      </w:r>
+      <w:proofErr w:type="spellStart"/>
+      <w:r>
+        <w:rPr>
+          <w:rFonts w:ascii="Times New Roman" w:hAnsi="Times New Roman" w:cs="Times New Roman"/>
+          <w:sz w:val="22"/>
+          <w:szCs w:val="22"/>
+          <w:highlight w:val="yellow"/>
+        </w:rPr>
+        <w:t>user_wants_post_divorce_support</w:t>
+      </w:r>
+      <w:proofErr w:type="spellEnd"/>
+      <w:r>
+        <w:rPr>
+          <w:rFonts w:ascii="Times New Roman" w:hAnsi="Times New Roman" w:cs="Times New Roman"/>
+          <w:sz w:val="22"/>
+          <w:szCs w:val="22"/>
+          <w:highlight w:val="yellow"/>
+        </w:rPr>
+        <w:t xml:space="preserve"> or </w:t>
+      </w:r>
+      <w:proofErr w:type="spellStart"/>
+      <w:r>
+        <w:rPr>
+          <w:rFonts w:ascii="Times New Roman" w:hAnsi="Times New Roman" w:cs="Times New Roman"/>
+          <w:sz w:val="22"/>
+          <w:szCs w:val="22"/>
+          <w:highlight w:val="yellow"/>
+        </w:rPr>
+        <w:t>spousal_support_provisions</w:t>
+      </w:r>
+      <w:proofErr w:type="spellEnd"/>
+      <w:r>
+        <w:rPr>
+          <w:rFonts w:ascii="Times New Roman" w:hAnsi="Times New Roman" w:cs="Times New Roman"/>
+          <w:sz w:val="22"/>
+          <w:szCs w:val="22"/>
+          <w:highlight w:val="yellow"/>
+        </w:rPr>
+        <w:t xml:space="preserve"> == "</w:t>
+      </w:r>
+      <w:proofErr w:type="spellStart"/>
+      <w:r>
+        <w:rPr>
+          <w:rFonts w:ascii="Times New Roman" w:hAnsi="Times New Roman" w:cs="Times New Roman"/>
+          <w:sz w:val="22"/>
+          <w:szCs w:val="22"/>
+          <w:highlight w:val="yellow"/>
+        </w:rPr>
+        <w:t>user_agrees_to_pay_spousal_support</w:t>
+      </w:r>
+      <w:proofErr w:type="spellEnd"/>
+      <w:proofErr w:type="gramStart"/>
+      <w:r>
+        <w:rPr>
+          <w:rFonts w:ascii="Times New Roman" w:hAnsi="Times New Roman" w:cs="Times New Roman"/>
+          <w:sz w:val="22"/>
+          <w:szCs w:val="22"/>
+          <w:highlight w:val="yellow"/>
+        </w:rPr>
+        <w:t>"</w:t>
+      </w:r>
+      <w:r>
+        <w:rPr>
+          <w:rFonts w:ascii="Times New Roman" w:hAnsi="Times New Roman" w:cs="Times New Roman"/>
+          <w:sz w:val="22"/>
+          <w:szCs w:val="22"/>
+          <w:highlight w:val="yellow"/>
+        </w:rPr>
+        <w:t xml:space="preserve"> </w:t>
+      </w:r>
+      <w:r>
+        <w:rPr>
+          <w:rFonts w:ascii="Times New Roman" w:hAnsi="Times New Roman" w:cs="Times New Roman"/>
+          <w:sz w:val="22"/>
+          <w:szCs w:val="22"/>
+          <w:highlight w:val="yellow"/>
+        </w:rPr>
+        <w:t>%}</w:t>
+      </w:r>
+      <w:proofErr w:type="gramEnd"/>
+    </w:p>
+    <w:p>
+      <w:pPr>
         <w:spacing w:after="0" w:line="276" w:lineRule="auto"/>
         <w:rPr>
           <w:rFonts w:ascii="Times New Roman" w:hAnsi="Times New Roman" w:cs="Times New Roman"/>
@@ -2905,6 +4095,490 @@
           <w:sz w:val="22"/>
           <w:szCs w:val="22"/>
         </w:rPr>
+        <w:t xml:space="preserve"> Proposed Uniform Spousal Support Order</w:t>
+      </w:r>
+    </w:p>
+    <w:p>
+      <w:pPr>
+        <w:spacing w:after="0" w:line="240" w:lineRule="auto"/>
+        <w:rPr>
+          <w:rFonts w:ascii="Times New Roman" w:hAnsi="Times New Roman" w:cs="Times New Roman"/>
+          <w:sz w:val="22"/>
+          <w:szCs w:val="22"/>
+        </w:rPr>
+      </w:pPr>
+      <w:r>
+        <w:rPr>
+          <w:rFonts w:ascii="Times New Roman" w:hAnsi="Times New Roman" w:cs="Times New Roman"/>
+          <w:sz w:val="22"/>
+          <w:szCs w:val="22"/>
+          <w:highlight w:val="yellow"/>
+        </w:rPr>
+        <w:t xml:space="preserve">{%p </w:t>
+      </w:r>
+      <w:proofErr w:type="gramStart"/>
+      <w:r>
+        <w:rPr>
+          <w:rFonts w:ascii="Times New Roman" w:hAnsi="Times New Roman" w:cs="Times New Roman"/>
+          <w:sz w:val="22"/>
+          <w:szCs w:val="22"/>
+          <w:highlight w:val="yellow"/>
+        </w:rPr>
+        <w:t>endif %}</w:t>
+      </w:r>
+      <w:proofErr w:type="gramEnd"/>
+    </w:p>
+    <w:p>
+      <w:pPr>
+        <w:spacing w:after="0" w:line="276" w:lineRule="auto"/>
+        <w:rPr>
+          <w:rFonts w:ascii="Times New Roman" w:hAnsi="Times New Roman" w:cs="Times New Roman"/>
+          <w:sz w:val="22"/>
+          <w:szCs w:val="22"/>
+        </w:rPr>
+      </w:pPr>
+      <w:proofErr w:type="gramStart"/>
+      <w:r>
+        <w:rPr>
+          <w:rFonts w:ascii="Times New Roman" w:hAnsi="Times New Roman" w:cs="Times New Roman"/>
+          <w:sz w:val="22"/>
+          <w:szCs w:val="22"/>
+        </w:rPr>
+        <w:t>[ ]</w:t>
+      </w:r>
+      <w:proofErr w:type="gramEnd"/>
+      <w:r>
+        <w:rPr>
+          <w:rFonts w:ascii="Times New Roman" w:hAnsi="Times New Roman" w:cs="Times New Roman"/>
+          <w:sz w:val="22"/>
+          <w:szCs w:val="22"/>
+        </w:rPr>
+        <w:t xml:space="preserve"> Judgment of Divorce</w:t>
+      </w:r>
+    </w:p>
+    <w:p>
+      <w:pPr>
+        <w:spacing w:after="0" w:line="240" w:lineRule="auto"/>
+        <w:rPr>
+          <w:rFonts w:ascii="Times New Roman" w:hAnsi="Times New Roman" w:cs="Times New Roman"/>
+          <w:sz w:val="22"/>
+          <w:szCs w:val="22"/>
+        </w:rPr>
+      </w:pPr>
+      <w:r>
+        <w:rPr>
+          <w:rFonts w:ascii="Times New Roman" w:hAnsi="Times New Roman" w:cs="Times New Roman"/>
+          <w:sz w:val="22"/>
+          <w:szCs w:val="22"/>
+          <w:highlight w:val="yellow"/>
+        </w:rPr>
+        <w:t xml:space="preserve">{%p if </w:t>
+      </w:r>
+      <w:proofErr w:type="spellStart"/>
+      <w:r>
+        <w:rPr>
+          <w:rFonts w:ascii="Times New Roman" w:hAnsi="Times New Roman" w:cs="Times New Roman"/>
+          <w:sz w:val="22"/>
+          <w:szCs w:val="22"/>
+          <w:highlight w:val="yellow"/>
+        </w:rPr>
+        <w:t>there_are_marital_</w:t>
+      </w:r>
+      <w:proofErr w:type="gramStart"/>
+      <w:r>
+        <w:rPr>
+          <w:rFonts w:ascii="Times New Roman" w:hAnsi="Times New Roman" w:cs="Times New Roman"/>
+          <w:sz w:val="22"/>
+          <w:szCs w:val="22"/>
+          <w:highlight w:val="yellow"/>
+        </w:rPr>
+        <w:t>children</w:t>
+      </w:r>
+      <w:proofErr w:type="spellEnd"/>
+      <w:r>
+        <w:rPr>
+          <w:rFonts w:ascii="Times New Roman" w:hAnsi="Times New Roman" w:cs="Times New Roman"/>
+          <w:sz w:val="22"/>
+          <w:szCs w:val="22"/>
+          <w:highlight w:val="yellow"/>
+        </w:rPr>
+        <w:t xml:space="preserve"> </w:t>
+      </w:r>
+      <w:r>
+        <w:rPr>
+          <w:rFonts w:ascii="Times New Roman" w:hAnsi="Times New Roman" w:cs="Times New Roman"/>
+          <w:sz w:val="22"/>
+          <w:szCs w:val="22"/>
+          <w:highlight w:val="yellow"/>
+        </w:rPr>
+        <w:t>%}</w:t>
+      </w:r>
+      <w:proofErr w:type="gramEnd"/>
+    </w:p>
+    <w:p>
+      <w:pPr>
+        <w:spacing w:after="0" w:line="276" w:lineRule="auto"/>
+        <w:rPr>
+          <w:rFonts w:ascii="Times New Roman" w:hAnsi="Times New Roman" w:cs="Times New Roman"/>
+          <w:sz w:val="22"/>
+          <w:szCs w:val="22"/>
+        </w:rPr>
+      </w:pPr>
+      <w:proofErr w:type="gramStart"/>
+      <w:r>
+        <w:rPr>
+          <w:rFonts w:ascii="Times New Roman" w:hAnsi="Times New Roman" w:cs="Times New Roman"/>
+          <w:sz w:val="22"/>
+          <w:szCs w:val="22"/>
+        </w:rPr>
+        <w:t>[ ]</w:t>
+      </w:r>
+      <w:proofErr w:type="gramEnd"/>
+      <w:r>
+        <w:rPr>
+          <w:rFonts w:ascii="Times New Roman" w:hAnsi="Times New Roman" w:cs="Times New Roman"/>
+          <w:sz w:val="22"/>
+          <w:szCs w:val="22"/>
+        </w:rPr>
+        <w:t xml:space="preserve"> Uniform Child Support Order</w:t>
+      </w:r>
+    </w:p>
+    <w:p>
+      <w:pPr>
+        <w:spacing w:after="0" w:line="240" w:lineRule="auto"/>
+        <w:rPr>
+          <w:rFonts w:ascii="Times New Roman" w:hAnsi="Times New Roman" w:cs="Times New Roman"/>
+          <w:sz w:val="22"/>
+          <w:szCs w:val="22"/>
+        </w:rPr>
+      </w:pPr>
+      <w:r>
+        <w:rPr>
+          <w:rFonts w:ascii="Times New Roman" w:hAnsi="Times New Roman" w:cs="Times New Roman"/>
+          <w:sz w:val="22"/>
+          <w:szCs w:val="22"/>
+          <w:highlight w:val="yellow"/>
+        </w:rPr>
+        <w:t xml:space="preserve">{%p </w:t>
+      </w:r>
+      <w:proofErr w:type="gramStart"/>
+      <w:r>
+        <w:rPr>
+          <w:rFonts w:ascii="Times New Roman" w:hAnsi="Times New Roman" w:cs="Times New Roman"/>
+          <w:sz w:val="22"/>
+          <w:szCs w:val="22"/>
+          <w:highlight w:val="yellow"/>
+        </w:rPr>
+        <w:t>endif %}</w:t>
+      </w:r>
+      <w:proofErr w:type="gramEnd"/>
+    </w:p>
+    <w:p>
+      <w:pPr>
+        <w:spacing w:after="0" w:line="240" w:lineRule="auto"/>
+        <w:rPr>
+          <w:rFonts w:ascii="Times New Roman" w:hAnsi="Times New Roman" w:cs="Times New Roman"/>
+          <w:sz w:val="22"/>
+          <w:szCs w:val="22"/>
+        </w:rPr>
+      </w:pPr>
+      <w:r>
+        <w:rPr>
+          <w:rFonts w:ascii="Times New Roman" w:hAnsi="Times New Roman" w:cs="Times New Roman"/>
+          <w:sz w:val="22"/>
+          <w:szCs w:val="22"/>
+          <w:highlight w:val="yellow"/>
+        </w:rPr>
+        <w:t xml:space="preserve">{%p if </w:t>
+      </w:r>
+      <w:proofErr w:type="spellStart"/>
+      <w:r>
+        <w:rPr>
+          <w:rFonts w:ascii="Times New Roman" w:hAnsi="Times New Roman" w:cs="Times New Roman"/>
+          <w:sz w:val="22"/>
+          <w:szCs w:val="22"/>
+          <w:highlight w:val="yellow"/>
+        </w:rPr>
+        <w:t>user_wants_post_divorce_support</w:t>
+      </w:r>
+      <w:proofErr w:type="spellEnd"/>
+      <w:r>
+        <w:rPr>
+          <w:rFonts w:ascii="Times New Roman" w:hAnsi="Times New Roman" w:cs="Times New Roman"/>
+          <w:sz w:val="22"/>
+          <w:szCs w:val="22"/>
+          <w:highlight w:val="yellow"/>
+        </w:rPr>
+        <w:t xml:space="preserve"> or </w:t>
+      </w:r>
+      <w:proofErr w:type="spellStart"/>
+      <w:r>
+        <w:rPr>
+          <w:rFonts w:ascii="Times New Roman" w:hAnsi="Times New Roman" w:cs="Times New Roman"/>
+          <w:sz w:val="22"/>
+          <w:szCs w:val="22"/>
+          <w:highlight w:val="yellow"/>
+        </w:rPr>
+        <w:t>spousal_support_provisions</w:t>
+      </w:r>
+      <w:proofErr w:type="spellEnd"/>
+      <w:r>
+        <w:rPr>
+          <w:rFonts w:ascii="Times New Roman" w:hAnsi="Times New Roman" w:cs="Times New Roman"/>
+          <w:sz w:val="22"/>
+          <w:szCs w:val="22"/>
+          <w:highlight w:val="yellow"/>
+        </w:rPr>
+        <w:t xml:space="preserve"> == "</w:t>
+      </w:r>
+      <w:proofErr w:type="spellStart"/>
+      <w:r>
+        <w:rPr>
+          <w:rFonts w:ascii="Times New Roman" w:hAnsi="Times New Roman" w:cs="Times New Roman"/>
+          <w:sz w:val="22"/>
+          <w:szCs w:val="22"/>
+          <w:highlight w:val="yellow"/>
+        </w:rPr>
+        <w:t>user_agrees_to_pay_spousal_support</w:t>
+      </w:r>
+      <w:proofErr w:type="spellEnd"/>
+      <w:proofErr w:type="gramStart"/>
+      <w:r>
+        <w:rPr>
+          <w:rFonts w:ascii="Times New Roman" w:hAnsi="Times New Roman" w:cs="Times New Roman"/>
+          <w:sz w:val="22"/>
+          <w:szCs w:val="22"/>
+          <w:highlight w:val="yellow"/>
+        </w:rPr>
+        <w:t>"</w:t>
+      </w:r>
+      <w:r>
+        <w:rPr>
+          <w:rFonts w:ascii="Times New Roman" w:hAnsi="Times New Roman" w:cs="Times New Roman"/>
+          <w:sz w:val="22"/>
+          <w:szCs w:val="22"/>
+          <w:highlight w:val="yellow"/>
+        </w:rPr>
+        <w:t xml:space="preserve"> </w:t>
+      </w:r>
+      <w:r>
+        <w:rPr>
+          <w:rFonts w:ascii="Times New Roman" w:hAnsi="Times New Roman" w:cs="Times New Roman"/>
+          <w:sz w:val="22"/>
+          <w:szCs w:val="22"/>
+          <w:highlight w:val="yellow"/>
+        </w:rPr>
+        <w:t>%}</w:t>
+      </w:r>
+      <w:proofErr w:type="gramEnd"/>
+    </w:p>
+    <w:p>
+      <w:pPr>
+        <w:spacing w:after="0" w:line="276" w:lineRule="auto"/>
+        <w:rPr>
+          <w:rFonts w:ascii="Times New Roman" w:hAnsi="Times New Roman" w:cs="Times New Roman"/>
+          <w:sz w:val="22"/>
+          <w:szCs w:val="22"/>
+        </w:rPr>
+      </w:pPr>
+      <w:proofErr w:type="gramStart"/>
+      <w:r>
+        <w:rPr>
+          <w:rFonts w:ascii="Times New Roman" w:hAnsi="Times New Roman" w:cs="Times New Roman"/>
+          <w:sz w:val="22"/>
+          <w:szCs w:val="22"/>
+        </w:rPr>
+        <w:t>[ ]</w:t>
+      </w:r>
+      <w:proofErr w:type="gramEnd"/>
+      <w:r>
+        <w:rPr>
+          <w:rFonts w:ascii="Times New Roman" w:hAnsi="Times New Roman" w:cs="Times New Roman"/>
+          <w:sz w:val="22"/>
+          <w:szCs w:val="22"/>
+        </w:rPr>
+        <w:t xml:space="preserve"> Uniform Spousal Support Order</w:t>
+      </w:r>
+    </w:p>
+    <w:p>
+      <w:pPr>
+        <w:spacing w:after="0" w:line="240" w:lineRule="auto"/>
+        <w:rPr>
+          <w:rFonts w:ascii="Times New Roman" w:hAnsi="Times New Roman" w:cs="Times New Roman"/>
+          <w:sz w:val="22"/>
+          <w:szCs w:val="22"/>
+        </w:rPr>
+      </w:pPr>
+      <w:r>
+        <w:rPr>
+          <w:rFonts w:ascii="Times New Roman" w:hAnsi="Times New Roman" w:cs="Times New Roman"/>
+          <w:sz w:val="22"/>
+          <w:szCs w:val="22"/>
+          <w:highlight w:val="yellow"/>
+        </w:rPr>
+        <w:t xml:space="preserve">{%p </w:t>
+      </w:r>
+      <w:proofErr w:type="gramStart"/>
+      <w:r>
+        <w:rPr>
+          <w:rFonts w:ascii="Times New Roman" w:hAnsi="Times New Roman" w:cs="Times New Roman"/>
+          <w:sz w:val="22"/>
+          <w:szCs w:val="22"/>
+          <w:highlight w:val="yellow"/>
+        </w:rPr>
+        <w:t>endif %}</w:t>
+      </w:r>
+      <w:proofErr w:type="gramEnd"/>
+    </w:p>
+    <w:p>
+      <w:pPr>
+        <w:spacing w:after="0" w:line="240" w:lineRule="auto"/>
+        <w:rPr>
+          <w:rFonts w:ascii="Times New Roman" w:hAnsi="Times New Roman" w:cs="Times New Roman"/>
+          <w:sz w:val="22"/>
+          <w:szCs w:val="22"/>
+        </w:rPr>
+      </w:pPr>
+      <w:r>
+        <w:rPr>
+          <w:rFonts w:ascii="Times New Roman" w:hAnsi="Times New Roman" w:cs="Times New Roman"/>
+          <w:sz w:val="22"/>
+          <w:szCs w:val="22"/>
+          <w:highlight w:val="yellow"/>
+        </w:rPr>
+        <w:t xml:space="preserve">{%p </w:t>
+      </w:r>
+      <w:r>
+        <w:rPr>
+          <w:rFonts w:ascii="Times New Roman" w:hAnsi="Times New Roman" w:cs="Times New Roman"/>
+          <w:sz w:val="22"/>
+          <w:szCs w:val="22"/>
+          <w:highlight w:val="yellow"/>
+        </w:rPr>
+        <w:t>if foc_100_</w:t>
+      </w:r>
+      <w:proofErr w:type="gramStart"/>
+      <w:r>
+        <w:rPr>
+          <w:rFonts w:ascii="Times New Roman" w:hAnsi="Times New Roman" w:cs="Times New Roman"/>
+          <w:sz w:val="22"/>
+          <w:szCs w:val="22"/>
+          <w:highlight w:val="yellow"/>
+        </w:rPr>
+        <w:t>full.enabled</w:t>
+      </w:r>
+      <w:proofErr w:type="gramEnd"/>
+      <w:r>
+        <w:rPr>
+          <w:rFonts w:ascii="Times New Roman" w:hAnsi="Times New Roman" w:cs="Times New Roman"/>
+          <w:sz w:val="22"/>
+          <w:szCs w:val="22"/>
+          <w:highlight w:val="yellow"/>
+        </w:rPr>
+        <w:t xml:space="preserve"> </w:t>
+      </w:r>
+      <w:r>
+        <w:rPr>
+          <w:rFonts w:ascii="Times New Roman" w:hAnsi="Times New Roman" w:cs="Times New Roman"/>
+          <w:sz w:val="22"/>
+          <w:szCs w:val="22"/>
+          <w:highlight w:val="yellow"/>
+        </w:rPr>
+        <w:t>%</w:t>
+      </w:r>
+      <w:r>
+        <w:rPr>
+          <w:rFonts w:ascii="Times New Roman" w:hAnsi="Times New Roman" w:cs="Times New Roman"/>
+          <w:sz w:val="22"/>
+          <w:szCs w:val="22"/>
+          <w:highlight w:val="yellow"/>
+        </w:rPr>
+        <w:t>}</w:t>
+      </w:r>
+    </w:p>
+    <w:p>
+      <w:pPr>
+        <w:spacing w:after="0" w:line="276" w:lineRule="auto"/>
+        <w:rPr>
+          <w:rFonts w:ascii="Times New Roman" w:hAnsi="Times New Roman" w:cs="Times New Roman"/>
+          <w:sz w:val="22"/>
+          <w:szCs w:val="22"/>
+        </w:rPr>
+      </w:pPr>
+      <w:proofErr w:type="gramStart"/>
+      <w:r>
+        <w:rPr>
+          <w:rFonts w:ascii="Times New Roman" w:hAnsi="Times New Roman" w:cs="Times New Roman"/>
+          <w:sz w:val="22"/>
+          <w:szCs w:val="22"/>
+        </w:rPr>
+        <w:t>[ ]</w:t>
+      </w:r>
+      <w:proofErr w:type="gramEnd"/>
+      <w:r>
+        <w:rPr>
+          <w:rFonts w:ascii="Times New Roman" w:hAnsi="Times New Roman" w:cs="Times New Roman"/>
+          <w:sz w:val="22"/>
+          <w:szCs w:val="22"/>
+        </w:rPr>
+        <w:t xml:space="preserve"> Domestic Relations Judgment Information Form</w:t>
+      </w:r>
+    </w:p>
+    <w:p>
+      <w:pPr>
+        <w:spacing w:after="0" w:line="240" w:lineRule="auto"/>
+        <w:rPr>
+          <w:rFonts w:ascii="Times New Roman" w:hAnsi="Times New Roman" w:cs="Times New Roman"/>
+          <w:sz w:val="22"/>
+          <w:szCs w:val="22"/>
+        </w:rPr>
+      </w:pPr>
+      <w:r>
+        <w:rPr>
+          <w:rFonts w:ascii="Times New Roman" w:hAnsi="Times New Roman" w:cs="Times New Roman"/>
+          <w:sz w:val="22"/>
+          <w:szCs w:val="22"/>
+          <w:highlight w:val="yellow"/>
+        </w:rPr>
+        <w:t xml:space="preserve">{%p </w:t>
+      </w:r>
+      <w:proofErr w:type="gramStart"/>
+      <w:r>
+        <w:rPr>
+          <w:rFonts w:ascii="Times New Roman" w:hAnsi="Times New Roman" w:cs="Times New Roman"/>
+          <w:sz w:val="22"/>
+          <w:szCs w:val="22"/>
+          <w:highlight w:val="yellow"/>
+        </w:rPr>
+        <w:t>endif %}</w:t>
+      </w:r>
+      <w:proofErr w:type="gramEnd"/>
+    </w:p>
+    <w:p>
+      <w:pPr>
+        <w:spacing w:after="0" w:line="276" w:lineRule="auto"/>
+        <w:rPr>
+          <w:rFonts w:ascii="Times New Roman" w:hAnsi="Times New Roman" w:cs="Times New Roman"/>
+          <w:sz w:val="22"/>
+          <w:szCs w:val="22"/>
+        </w:rPr>
+      </w:pPr>
+      <w:proofErr w:type="gramStart"/>
+      <w:r>
+        <w:rPr>
+          <w:rFonts w:ascii="Times New Roman" w:hAnsi="Times New Roman" w:cs="Times New Roman"/>
+          <w:sz w:val="22"/>
+          <w:szCs w:val="22"/>
+        </w:rPr>
+        <w:t>[ ]</w:t>
+      </w:r>
+      <w:proofErr w:type="gramEnd"/>
+      <w:r>
+        <w:rPr>
+          <w:rFonts w:ascii="Times New Roman" w:hAnsi="Times New Roman" w:cs="Times New Roman"/>
+          <w:sz w:val="22"/>
+          <w:szCs w:val="22"/>
+        </w:rPr>
         <w:t xml:space="preserve"> Domestic Relations Verified Financial Information Form</w:t>
       </w:r>
     </w:p>
@@ -2924,8 +4598,9 @@
           <w:szCs w:val="22"/>
           <w:highlight w:val="cyan"/>
         </w:rPr>
-        <w:t>{%</w:t>
-      </w:r>
+        <w:t xml:space="preserve">{%p </w:t>
+      </w:r>
+      <w:proofErr w:type="spellStart"/>
       <w:r>
         <w:rPr>
           <w:rFonts w:ascii="Times New Roman" w:hAnsi="Times New Roman" w:cs="Times New Roman"/>
@@ -2933,7 +4608,7 @@
           <w:szCs w:val="22"/>
           <w:highlight w:val="cyan"/>
         </w:rPr>
-        <w:t>p</w:t>
+        <w:t>el</w:t>
       </w:r>
       <w:r>
         <w:rPr>
@@ -2942,8 +4617,19 @@
           <w:szCs w:val="22"/>
           <w:highlight w:val="cyan"/>
         </w:rPr>
+        <w:t>if</w:t>
+      </w:r>
+      <w:proofErr w:type="spellEnd"/>
+      <w:r>
+        <w:rPr>
+          <w:rFonts w:ascii="Times New Roman" w:hAnsi="Times New Roman" w:cs="Times New Roman"/>
+          <w:sz w:val="22"/>
+          <w:szCs w:val="22"/>
+          <w:highlight w:val="cyan"/>
+        </w:rPr>
         <w:t xml:space="preserve"> </w:t>
       </w:r>
+      <w:proofErr w:type="spellStart"/>
       <w:r>
         <w:rPr>
           <w:rFonts w:ascii="Times New Roman" w:hAnsi="Times New Roman" w:cs="Times New Roman"/>
@@ -2951,7 +4637,7 @@
           <w:szCs w:val="22"/>
           <w:highlight w:val="cyan"/>
         </w:rPr>
-        <w:t>el</w:t>
+        <w:t>tool</w:t>
       </w:r>
       <w:r>
         <w:rPr>
@@ -2960,8 +4646,9 @@
           <w:szCs w:val="22"/>
           <w:highlight w:val="cyan"/>
         </w:rPr>
-        <w:t>if tool</w:t>
-      </w:r>
+        <w:t>_ID</w:t>
+      </w:r>
+      <w:proofErr w:type="spellEnd"/>
       <w:r>
         <w:rPr>
           <w:rFonts w:ascii="Times New Roman" w:hAnsi="Times New Roman" w:cs="Times New Roman"/>
@@ -2969,7 +4656,7 @@
           <w:szCs w:val="22"/>
           <w:highlight w:val="cyan"/>
         </w:rPr>
-        <w:t>_ID</w:t>
+        <w:t xml:space="preserve"> == </w:t>
       </w:r>
       <w:r>
         <w:rPr>
@@ -2978,8 +4665,9 @@
           <w:szCs w:val="22"/>
           <w:highlight w:val="cyan"/>
         </w:rPr>
-        <w:t xml:space="preserve"> == </w:t>
-      </w:r>
+        <w:t>“</w:t>
+      </w:r>
+      <w:proofErr w:type="spellStart"/>
       <w:r>
         <w:rPr>
           <w:rFonts w:ascii="Times New Roman" w:hAnsi="Times New Roman" w:cs="Times New Roman"/>
@@ -2987,8 +4675,9 @@
           <w:szCs w:val="22"/>
           <w:highlight w:val="cyan"/>
         </w:rPr>
-        <w:t>“</w:t>
-      </w:r>
+        <w:t>JOD_only</w:t>
+      </w:r>
+      <w:proofErr w:type="spellEnd"/>
       <w:r>
         <w:rPr>
           <w:rFonts w:ascii="Times New Roman" w:hAnsi="Times New Roman" w:cs="Times New Roman"/>
@@ -2996,7 +4685,7 @@
           <w:szCs w:val="22"/>
           <w:highlight w:val="cyan"/>
         </w:rPr>
-        <w:t>divorce</w:t>
+        <w:t>”</w:t>
       </w:r>
       <w:r>
         <w:rPr>
@@ -3005,24 +4694,6 @@
           <w:szCs w:val="22"/>
           <w:highlight w:val="cyan"/>
         </w:rPr>
-        <w:t>_complaint</w:t>
-      </w:r>
-      <w:r>
-        <w:rPr>
-          <w:rFonts w:ascii="Times New Roman" w:hAnsi="Times New Roman" w:cs="Times New Roman"/>
-          <w:sz w:val="22"/>
-          <w:szCs w:val="22"/>
-          <w:highlight w:val="cyan"/>
-        </w:rPr>
-        <w:t>”</w:t>
-      </w:r>
-      <w:r>
-        <w:rPr>
-          <w:rFonts w:ascii="Times New Roman" w:hAnsi="Times New Roman" w:cs="Times New Roman"/>
-          <w:sz w:val="22"/>
-          <w:szCs w:val="22"/>
-          <w:highlight w:val="cyan"/>
-        </w:rPr>
         <w:t xml:space="preserve"> %}</w:t>
       </w:r>
     </w:p>
@@ -3051,6 +4722,139 @@
           <w:sz w:val="22"/>
           <w:szCs w:val="22"/>
         </w:rPr>
+        <w:t xml:space="preserve"> Notice of Hearing</w:t>
+      </w:r>
+    </w:p>
+    <w:p>
+      <w:pPr>
+        <w:spacing w:after="0" w:line="276" w:lineRule="auto"/>
+        <w:rPr>
+          <w:rFonts w:ascii="Times New Roman" w:hAnsi="Times New Roman" w:cs="Times New Roman"/>
+          <w:sz w:val="22"/>
+          <w:szCs w:val="22"/>
+        </w:rPr>
+      </w:pPr>
+      <w:proofErr w:type="gramStart"/>
+      <w:r>
+        <w:rPr>
+          <w:rFonts w:ascii="Times New Roman" w:hAnsi="Times New Roman" w:cs="Times New Roman"/>
+          <w:sz w:val="22"/>
+          <w:szCs w:val="22"/>
+        </w:rPr>
+        <w:t>[ ]</w:t>
+      </w:r>
+      <w:proofErr w:type="gramEnd"/>
+      <w:r>
+        <w:rPr>
+          <w:rFonts w:ascii="Times New Roman" w:hAnsi="Times New Roman" w:cs="Times New Roman"/>
+          <w:sz w:val="22"/>
+          <w:szCs w:val="22"/>
+        </w:rPr>
+        <w:t xml:space="preserve"> Notice of Hearing and Motion for Entry of Consent Judgment of Divorce</w:t>
+      </w:r>
+    </w:p>
+    <w:p>
+      <w:pPr>
+        <w:spacing w:after="0" w:line="276" w:lineRule="auto"/>
+        <w:rPr>
+          <w:rFonts w:ascii="Times New Roman" w:hAnsi="Times New Roman" w:cs="Times New Roman"/>
+          <w:sz w:val="22"/>
+          <w:szCs w:val="22"/>
+        </w:rPr>
+      </w:pPr>
+      <w:proofErr w:type="gramStart"/>
+      <w:r>
+        <w:rPr>
+          <w:rFonts w:ascii="Times New Roman" w:hAnsi="Times New Roman" w:cs="Times New Roman"/>
+          <w:sz w:val="22"/>
+          <w:szCs w:val="22"/>
+        </w:rPr>
+        <w:t>[ ]</w:t>
+      </w:r>
+      <w:proofErr w:type="gramEnd"/>
+      <w:r>
+        <w:rPr>
+          <w:rFonts w:ascii="Times New Roman" w:hAnsi="Times New Roman" w:cs="Times New Roman"/>
+          <w:sz w:val="22"/>
+          <w:szCs w:val="22"/>
+        </w:rPr>
+        <w:t xml:space="preserve"> Notice of Hearing and Motion for Entry of Default Judgment of Divorce</w:t>
+      </w:r>
+    </w:p>
+    <w:p>
+      <w:pPr>
+        <w:spacing w:after="0" w:line="276" w:lineRule="auto"/>
+        <w:rPr>
+          <w:rFonts w:ascii="Times New Roman" w:hAnsi="Times New Roman" w:cs="Times New Roman"/>
+          <w:sz w:val="22"/>
+          <w:szCs w:val="22"/>
+        </w:rPr>
+      </w:pPr>
+      <w:proofErr w:type="gramStart"/>
+      <w:r>
+        <w:rPr>
+          <w:rFonts w:ascii="Times New Roman" w:hAnsi="Times New Roman" w:cs="Times New Roman"/>
+          <w:sz w:val="22"/>
+          <w:szCs w:val="22"/>
+        </w:rPr>
+        <w:t>[ ]</w:t>
+      </w:r>
+      <w:proofErr w:type="gramEnd"/>
+      <w:r>
+        <w:rPr>
+          <w:rFonts w:ascii="Times New Roman" w:hAnsi="Times New Roman" w:cs="Times New Roman"/>
+          <w:sz w:val="22"/>
+          <w:szCs w:val="22"/>
+        </w:rPr>
+        <w:t xml:space="preserve"> Proposed Judgment of Divorce</w:t>
+      </w:r>
+    </w:p>
+    <w:p>
+      <w:pPr>
+        <w:spacing w:after="0" w:line="240" w:lineRule="auto"/>
+        <w:rPr>
+          <w:rFonts w:ascii="Times New Roman" w:hAnsi="Times New Roman" w:cs="Times New Roman"/>
+          <w:sz w:val="22"/>
+          <w:szCs w:val="22"/>
+        </w:rPr>
+      </w:pPr>
+      <w:r>
+        <w:rPr>
+          <w:rFonts w:ascii="Times New Roman" w:hAnsi="Times New Roman" w:cs="Times New Roman"/>
+          <w:sz w:val="22"/>
+          <w:szCs w:val="22"/>
+          <w:highlight w:val="yellow"/>
+        </w:rPr>
+        <w:t xml:space="preserve">{%p if </w:t>
+      </w:r>
+      <w:proofErr w:type="spellStart"/>
+      <w:r>
+        <w:rPr>
+          <w:rFonts w:ascii="Times New Roman" w:hAnsi="Times New Roman" w:cs="Times New Roman"/>
+          <w:sz w:val="22"/>
+          <w:szCs w:val="22"/>
+          <w:highlight w:val="yellow"/>
+        </w:rPr>
+        <w:t>there_are_marital_</w:t>
+      </w:r>
+      <w:proofErr w:type="gramStart"/>
+      <w:r>
+        <w:rPr>
+          <w:rFonts w:ascii="Times New Roman" w:hAnsi="Times New Roman" w:cs="Times New Roman"/>
+          <w:sz w:val="22"/>
+          <w:szCs w:val="22"/>
+          <w:highlight w:val="yellow"/>
+        </w:rPr>
+        <w:t>children</w:t>
+      </w:r>
+      <w:proofErr w:type="spellEnd"/>
+      <w:r>
+        <w:rPr>
+          <w:rFonts w:ascii="Times New Roman" w:hAnsi="Times New Roman" w:cs="Times New Roman"/>
+          <w:sz w:val="22"/>
+          <w:szCs w:val="22"/>
+          <w:highlight w:val="yellow"/>
+        </w:rPr>
         <w:t xml:space="preserve"> </w:t>
       </w:r>
       <w:r>
@@ -3058,9 +4862,11 @@
           <w:rFonts w:ascii="Times New Roman" w:hAnsi="Times New Roman" w:cs="Times New Roman"/>
           <w:sz w:val="22"/>
           <w:szCs w:val="22"/>
-        </w:rPr>
-        <w:t>Default Request and Entry</w:t>
-      </w:r>
+          <w:highlight w:val="yellow"/>
+        </w:rPr>
+        <w:t>%}</w:t>
+      </w:r>
+      <w:proofErr w:type="gramEnd"/>
     </w:p>
     <w:p>
       <w:pPr>
@@ -3087,91 +4893,7 @@
           <w:sz w:val="22"/>
           <w:szCs w:val="22"/>
         </w:rPr>
-        <w:t xml:space="preserve"> Notice of Hearing</w:t>
-      </w:r>
-    </w:p>
-    <w:p>
-      <w:pPr>
-        <w:spacing w:after="0" w:line="276" w:lineRule="auto"/>
-        <w:rPr>
-          <w:rFonts w:ascii="Times New Roman" w:hAnsi="Times New Roman" w:cs="Times New Roman"/>
-          <w:sz w:val="22"/>
-          <w:szCs w:val="22"/>
-        </w:rPr>
-      </w:pPr>
-      <w:proofErr w:type="gramStart"/>
-      <w:r>
-        <w:rPr>
-          <w:rFonts w:ascii="Times New Roman" w:hAnsi="Times New Roman" w:cs="Times New Roman"/>
-          <w:sz w:val="22"/>
-          <w:szCs w:val="22"/>
-        </w:rPr>
-        <w:t>[ ]</w:t>
-      </w:r>
-      <w:proofErr w:type="gramEnd"/>
-      <w:r>
-        <w:rPr>
-          <w:rFonts w:ascii="Times New Roman" w:hAnsi="Times New Roman" w:cs="Times New Roman"/>
-          <w:sz w:val="22"/>
-          <w:szCs w:val="22"/>
-        </w:rPr>
-        <w:t xml:space="preserve"> Notice of Hearing and Motion for Entry of Consent Judgment of Divorce</w:t>
-      </w:r>
-    </w:p>
-    <w:p>
-      <w:pPr>
-        <w:spacing w:after="0" w:line="276" w:lineRule="auto"/>
-        <w:rPr>
-          <w:rFonts w:ascii="Times New Roman" w:hAnsi="Times New Roman" w:cs="Times New Roman"/>
-          <w:sz w:val="22"/>
-          <w:szCs w:val="22"/>
-        </w:rPr>
-      </w:pPr>
-      <w:proofErr w:type="gramStart"/>
-      <w:r>
-        <w:rPr>
-          <w:rFonts w:ascii="Times New Roman" w:hAnsi="Times New Roman" w:cs="Times New Roman"/>
-          <w:sz w:val="22"/>
-          <w:szCs w:val="22"/>
-        </w:rPr>
-        <w:t>[ ]</w:t>
-      </w:r>
-      <w:proofErr w:type="gramEnd"/>
-      <w:r>
-        <w:rPr>
-          <w:rFonts w:ascii="Times New Roman" w:hAnsi="Times New Roman" w:cs="Times New Roman"/>
-          <w:sz w:val="22"/>
-          <w:szCs w:val="22"/>
-        </w:rPr>
-        <w:t xml:space="preserve"> Notice of Hearing and Motion for Entry of Default Judgment of Divorce</w:t>
-      </w:r>
-    </w:p>
-    <w:p>
-      <w:pPr>
-        <w:spacing w:after="0" w:line="276" w:lineRule="auto"/>
-        <w:rPr>
-          <w:rFonts w:ascii="Times New Roman" w:hAnsi="Times New Roman" w:cs="Times New Roman"/>
-          <w:sz w:val="22"/>
-          <w:szCs w:val="22"/>
-        </w:rPr>
-      </w:pPr>
-      <w:proofErr w:type="gramStart"/>
-      <w:r>
-        <w:rPr>
-          <w:rFonts w:ascii="Times New Roman" w:hAnsi="Times New Roman" w:cs="Times New Roman"/>
-          <w:sz w:val="22"/>
-          <w:szCs w:val="22"/>
-        </w:rPr>
-        <w:t>[ ]</w:t>
-      </w:r>
-      <w:proofErr w:type="gramEnd"/>
-      <w:r>
-        <w:rPr>
-          <w:rFonts w:ascii="Times New Roman" w:hAnsi="Times New Roman" w:cs="Times New Roman"/>
-          <w:sz w:val="22"/>
-          <w:szCs w:val="22"/>
-        </w:rPr>
-        <w:t xml:space="preserve"> Proposed Judgment of Divorce</w:t>
+        <w:t xml:space="preserve"> Proposed Uniform Child Support Order</w:t>
       </w:r>
     </w:p>
     <w:p>
@@ -3190,91 +4912,6 @@
           <w:szCs w:val="22"/>
           <w:highlight w:val="yellow"/>
         </w:rPr>
-        <w:t xml:space="preserve">{%p if </w:t>
-      </w:r>
-      <w:r>
-        <w:rPr>
-          <w:rFonts w:ascii="Times New Roman" w:hAnsi="Times New Roman" w:cs="Times New Roman"/>
-          <w:sz w:val="22"/>
-          <w:szCs w:val="22"/>
-          <w:highlight w:val="yellow"/>
-        </w:rPr>
-        <w:t>there_are_marital_</w:t>
-      </w:r>
-      <w:proofErr w:type="gramStart"/>
-      <w:r>
-        <w:rPr>
-          <w:rFonts w:ascii="Times New Roman" w:hAnsi="Times New Roman" w:cs="Times New Roman"/>
-          <w:sz w:val="22"/>
-          <w:szCs w:val="22"/>
-          <w:highlight w:val="yellow"/>
-        </w:rPr>
-        <w:t>children</w:t>
-      </w:r>
-      <w:r>
-        <w:rPr>
-          <w:rFonts w:ascii="Times New Roman" w:hAnsi="Times New Roman" w:cs="Times New Roman"/>
-          <w:sz w:val="22"/>
-          <w:szCs w:val="22"/>
-          <w:highlight w:val="yellow"/>
-        </w:rPr>
-        <w:t xml:space="preserve"> </w:t>
-      </w:r>
-      <w:r>
-        <w:rPr>
-          <w:rFonts w:ascii="Times New Roman" w:hAnsi="Times New Roman" w:cs="Times New Roman"/>
-          <w:sz w:val="22"/>
-          <w:szCs w:val="22"/>
-          <w:highlight w:val="yellow"/>
-        </w:rPr>
-        <w:t>%}</w:t>
-      </w:r>
-      <w:proofErr w:type="gramEnd"/>
-    </w:p>
-    <w:p>
-      <w:pPr>
-        <w:spacing w:after="0" w:line="276" w:lineRule="auto"/>
-        <w:rPr>
-          <w:rFonts w:ascii="Times New Roman" w:hAnsi="Times New Roman" w:cs="Times New Roman"/>
-          <w:sz w:val="22"/>
-          <w:szCs w:val="22"/>
-        </w:rPr>
-      </w:pPr>
-      <w:proofErr w:type="gramStart"/>
-      <w:r>
-        <w:rPr>
-          <w:rFonts w:ascii="Times New Roman" w:hAnsi="Times New Roman" w:cs="Times New Roman"/>
-          <w:sz w:val="22"/>
-          <w:szCs w:val="22"/>
-        </w:rPr>
-        <w:t>[ ]</w:t>
-      </w:r>
-      <w:proofErr w:type="gramEnd"/>
-      <w:r>
-        <w:rPr>
-          <w:rFonts w:ascii="Times New Roman" w:hAnsi="Times New Roman" w:cs="Times New Roman"/>
-          <w:sz w:val="22"/>
-          <w:szCs w:val="22"/>
-        </w:rPr>
-        <w:t xml:space="preserve"> Proposed Uniform Child Support Order</w:t>
-      </w:r>
-    </w:p>
-    <w:p>
-      <w:pPr>
-        <w:spacing w:after="0" w:line="240" w:lineRule="auto"/>
-        <w:rPr>
-          <w:rFonts w:ascii="Times New Roman" w:hAnsi="Times New Roman" w:cs="Times New Roman"/>
-          <w:sz w:val="22"/>
-          <w:szCs w:val="22"/>
-        </w:rPr>
-      </w:pPr>
-      <w:r>
-        <w:rPr>
-          <w:rFonts w:ascii="Times New Roman" w:hAnsi="Times New Roman" w:cs="Times New Roman"/>
-          <w:sz w:val="22"/>
-          <w:szCs w:val="22"/>
-          <w:highlight w:val="yellow"/>
-        </w:rPr>
         <w:t xml:space="preserve">{%p </w:t>
       </w:r>
       <w:proofErr w:type="gramStart"/>
@@ -3288,974 +4925,6 @@
         <w:t>endif %}</w:t>
       </w:r>
       <w:proofErr w:type="gramEnd"/>
-    </w:p>
-    <w:p>
-      <w:pPr>
-        <w:spacing w:after="0" w:line="240" w:lineRule="auto"/>
-        <w:rPr>
-          <w:rFonts w:ascii="Times New Roman" w:hAnsi="Times New Roman" w:cs="Times New Roman"/>
-          <w:sz w:val="22"/>
-          <w:szCs w:val="22"/>
-        </w:rPr>
-      </w:pPr>
-      <w:r>
-        <w:rPr>
-          <w:rFonts w:ascii="Times New Roman" w:hAnsi="Times New Roman" w:cs="Times New Roman"/>
-          <w:sz w:val="22"/>
-          <w:szCs w:val="22"/>
-          <w:highlight w:val="yellow"/>
-        </w:rPr>
-        <w:t xml:space="preserve">{%p if </w:t>
-      </w:r>
-      <w:r>
-        <w:rPr>
-          <w:rFonts w:ascii="Times New Roman" w:hAnsi="Times New Roman" w:cs="Times New Roman"/>
-          <w:sz w:val="22"/>
-          <w:szCs w:val="22"/>
-          <w:highlight w:val="yellow"/>
-        </w:rPr>
-        <w:t>user_wants_post_divorce_support or spousal_support_provisions == "user_agrees_to_pay_spousal_support</w:t>
-      </w:r>
-      <w:proofErr w:type="gramStart"/>
-      <w:r>
-        <w:rPr>
-          <w:rFonts w:ascii="Times New Roman" w:hAnsi="Times New Roman" w:cs="Times New Roman"/>
-          <w:sz w:val="22"/>
-          <w:szCs w:val="22"/>
-          <w:highlight w:val="yellow"/>
-        </w:rPr>
-        <w:t>"</w:t>
-      </w:r>
-      <w:r>
-        <w:rPr>
-          <w:rFonts w:ascii="Times New Roman" w:hAnsi="Times New Roman" w:cs="Times New Roman"/>
-          <w:sz w:val="22"/>
-          <w:szCs w:val="22"/>
-          <w:highlight w:val="yellow"/>
-        </w:rPr>
-        <w:t xml:space="preserve"> </w:t>
-      </w:r>
-      <w:r>
-        <w:rPr>
-          <w:rFonts w:ascii="Times New Roman" w:hAnsi="Times New Roman" w:cs="Times New Roman"/>
-          <w:sz w:val="22"/>
-          <w:szCs w:val="22"/>
-          <w:highlight w:val="yellow"/>
-        </w:rPr>
-        <w:t>%}</w:t>
-      </w:r>
-      <w:proofErr w:type="gramEnd"/>
-    </w:p>
-    <w:p>
-      <w:pPr>
-        <w:spacing w:after="0" w:line="276" w:lineRule="auto"/>
-        <w:rPr>
-          <w:rFonts w:ascii="Times New Roman" w:hAnsi="Times New Roman" w:cs="Times New Roman"/>
-          <w:sz w:val="22"/>
-          <w:szCs w:val="22"/>
-        </w:rPr>
-      </w:pPr>
-      <w:proofErr w:type="gramStart"/>
-      <w:r>
-        <w:rPr>
-          <w:rFonts w:ascii="Times New Roman" w:hAnsi="Times New Roman" w:cs="Times New Roman"/>
-          <w:sz w:val="22"/>
-          <w:szCs w:val="22"/>
-        </w:rPr>
-        <w:t>[ ]</w:t>
-      </w:r>
-      <w:proofErr w:type="gramEnd"/>
-      <w:r>
-        <w:rPr>
-          <w:rFonts w:ascii="Times New Roman" w:hAnsi="Times New Roman" w:cs="Times New Roman"/>
-          <w:sz w:val="22"/>
-          <w:szCs w:val="22"/>
-        </w:rPr>
-        <w:t xml:space="preserve"> Proposed Uniform Spousal Support Order</w:t>
-      </w:r>
-    </w:p>
-    <w:p>
-      <w:pPr>
-        <w:spacing w:after="0" w:line="240" w:lineRule="auto"/>
-        <w:rPr>
-          <w:rFonts w:ascii="Times New Roman" w:hAnsi="Times New Roman" w:cs="Times New Roman"/>
-          <w:sz w:val="22"/>
-          <w:szCs w:val="22"/>
-        </w:rPr>
-      </w:pPr>
-      <w:r>
-        <w:rPr>
-          <w:rFonts w:ascii="Times New Roman" w:hAnsi="Times New Roman" w:cs="Times New Roman"/>
-          <w:sz w:val="22"/>
-          <w:szCs w:val="22"/>
-          <w:highlight w:val="yellow"/>
-        </w:rPr>
-        <w:t xml:space="preserve">{%p </w:t>
-      </w:r>
-      <w:proofErr w:type="gramStart"/>
-      <w:r>
-        <w:rPr>
-          <w:rFonts w:ascii="Times New Roman" w:hAnsi="Times New Roman" w:cs="Times New Roman"/>
-          <w:sz w:val="22"/>
-          <w:szCs w:val="22"/>
-          <w:highlight w:val="yellow"/>
-        </w:rPr>
-        <w:t>endif %}</w:t>
-      </w:r>
-      <w:proofErr w:type="gramEnd"/>
-    </w:p>
-    <w:p>
-      <w:pPr>
-        <w:spacing w:after="0" w:line="276" w:lineRule="auto"/>
-        <w:rPr>
-          <w:rFonts w:ascii="Times New Roman" w:hAnsi="Times New Roman" w:cs="Times New Roman"/>
-          <w:sz w:val="22"/>
-          <w:szCs w:val="22"/>
-        </w:rPr>
-      </w:pPr>
-      <w:proofErr w:type="gramStart"/>
-      <w:r>
-        <w:rPr>
-          <w:rFonts w:ascii="Times New Roman" w:hAnsi="Times New Roman" w:cs="Times New Roman"/>
-          <w:sz w:val="22"/>
-          <w:szCs w:val="22"/>
-        </w:rPr>
-        <w:t>[ ]</w:t>
-      </w:r>
-      <w:proofErr w:type="gramEnd"/>
-      <w:r>
-        <w:rPr>
-          <w:rFonts w:ascii="Times New Roman" w:hAnsi="Times New Roman" w:cs="Times New Roman"/>
-          <w:sz w:val="22"/>
-          <w:szCs w:val="22"/>
-        </w:rPr>
-        <w:t xml:space="preserve"> Judgment of Divorce</w:t>
-      </w:r>
-    </w:p>
-    <w:p>
-      <w:pPr>
-        <w:spacing w:after="0" w:line="240" w:lineRule="auto"/>
-        <w:rPr>
-          <w:rFonts w:ascii="Times New Roman" w:hAnsi="Times New Roman" w:cs="Times New Roman"/>
-          <w:sz w:val="22"/>
-          <w:szCs w:val="22"/>
-        </w:rPr>
-      </w:pPr>
-      <w:r>
-        <w:rPr>
-          <w:rFonts w:ascii="Times New Roman" w:hAnsi="Times New Roman" w:cs="Times New Roman"/>
-          <w:sz w:val="22"/>
-          <w:szCs w:val="22"/>
-          <w:highlight w:val="yellow"/>
-        </w:rPr>
-        <w:t xml:space="preserve">{%p if </w:t>
-      </w:r>
-      <w:r>
-        <w:rPr>
-          <w:rFonts w:ascii="Times New Roman" w:hAnsi="Times New Roman" w:cs="Times New Roman"/>
-          <w:sz w:val="22"/>
-          <w:szCs w:val="22"/>
-          <w:highlight w:val="yellow"/>
-        </w:rPr>
-        <w:t>there_are_marital_</w:t>
-      </w:r>
-      <w:proofErr w:type="gramStart"/>
-      <w:r>
-        <w:rPr>
-          <w:rFonts w:ascii="Times New Roman" w:hAnsi="Times New Roman" w:cs="Times New Roman"/>
-          <w:sz w:val="22"/>
-          <w:szCs w:val="22"/>
-          <w:highlight w:val="yellow"/>
-        </w:rPr>
-        <w:t>children</w:t>
-      </w:r>
-      <w:r>
-        <w:rPr>
-          <w:rFonts w:ascii="Times New Roman" w:hAnsi="Times New Roman" w:cs="Times New Roman"/>
-          <w:sz w:val="22"/>
-          <w:szCs w:val="22"/>
-          <w:highlight w:val="yellow"/>
-        </w:rPr>
-        <w:t xml:space="preserve"> </w:t>
-      </w:r>
-      <w:r>
-        <w:rPr>
-          <w:rFonts w:ascii="Times New Roman" w:hAnsi="Times New Roman" w:cs="Times New Roman"/>
-          <w:sz w:val="22"/>
-          <w:szCs w:val="22"/>
-          <w:highlight w:val="yellow"/>
-        </w:rPr>
-        <w:t>%}</w:t>
-      </w:r>
-      <w:proofErr w:type="gramEnd"/>
-    </w:p>
-    <w:p>
-      <w:pPr>
-        <w:spacing w:after="0" w:line="276" w:lineRule="auto"/>
-        <w:rPr>
-          <w:rFonts w:ascii="Times New Roman" w:hAnsi="Times New Roman" w:cs="Times New Roman"/>
-          <w:sz w:val="22"/>
-          <w:szCs w:val="22"/>
-        </w:rPr>
-      </w:pPr>
-      <w:proofErr w:type="gramStart"/>
-      <w:r>
-        <w:rPr>
-          <w:rFonts w:ascii="Times New Roman" w:hAnsi="Times New Roman" w:cs="Times New Roman"/>
-          <w:sz w:val="22"/>
-          <w:szCs w:val="22"/>
-        </w:rPr>
-        <w:t>[ ]</w:t>
-      </w:r>
-      <w:proofErr w:type="gramEnd"/>
-      <w:r>
-        <w:rPr>
-          <w:rFonts w:ascii="Times New Roman" w:hAnsi="Times New Roman" w:cs="Times New Roman"/>
-          <w:sz w:val="22"/>
-          <w:szCs w:val="22"/>
-        </w:rPr>
-        <w:t xml:space="preserve"> Uniform Child Support Order</w:t>
-      </w:r>
-    </w:p>
-    <w:p>
-      <w:pPr>
-        <w:spacing w:after="0" w:line="240" w:lineRule="auto"/>
-        <w:rPr>
-          <w:rFonts w:ascii="Times New Roman" w:hAnsi="Times New Roman" w:cs="Times New Roman"/>
-          <w:sz w:val="22"/>
-          <w:szCs w:val="22"/>
-        </w:rPr>
-      </w:pPr>
-      <w:r>
-        <w:rPr>
-          <w:rFonts w:ascii="Times New Roman" w:hAnsi="Times New Roman" w:cs="Times New Roman"/>
-          <w:sz w:val="22"/>
-          <w:szCs w:val="22"/>
-          <w:highlight w:val="yellow"/>
-        </w:rPr>
-        <w:t xml:space="preserve">{%p </w:t>
-      </w:r>
-      <w:proofErr w:type="gramStart"/>
-      <w:r>
-        <w:rPr>
-          <w:rFonts w:ascii="Times New Roman" w:hAnsi="Times New Roman" w:cs="Times New Roman"/>
-          <w:sz w:val="22"/>
-          <w:szCs w:val="22"/>
-          <w:highlight w:val="yellow"/>
-        </w:rPr>
-        <w:t>endif %}</w:t>
-      </w:r>
-      <w:proofErr w:type="gramEnd"/>
-    </w:p>
-    <w:p>
-      <w:pPr>
-        <w:spacing w:after="0" w:line="240" w:lineRule="auto"/>
-        <w:rPr>
-          <w:rFonts w:ascii="Times New Roman" w:hAnsi="Times New Roman" w:cs="Times New Roman"/>
-          <w:sz w:val="22"/>
-          <w:szCs w:val="22"/>
-        </w:rPr>
-      </w:pPr>
-      <w:r>
-        <w:rPr>
-          <w:rFonts w:ascii="Times New Roman" w:hAnsi="Times New Roman" w:cs="Times New Roman"/>
-          <w:sz w:val="22"/>
-          <w:szCs w:val="22"/>
-          <w:highlight w:val="yellow"/>
-        </w:rPr>
-        <w:t xml:space="preserve">{%p if </w:t>
-      </w:r>
-      <w:r>
-        <w:rPr>
-          <w:rFonts w:ascii="Times New Roman" w:hAnsi="Times New Roman" w:cs="Times New Roman"/>
-          <w:sz w:val="22"/>
-          <w:szCs w:val="22"/>
-          <w:highlight w:val="yellow"/>
-        </w:rPr>
-        <w:t>user_wants_post_divorce_support or spousal_support_provisions == "user_agrees_to_pay_spousal_support</w:t>
-      </w:r>
-      <w:proofErr w:type="gramStart"/>
-      <w:r>
-        <w:rPr>
-          <w:rFonts w:ascii="Times New Roman" w:hAnsi="Times New Roman" w:cs="Times New Roman"/>
-          <w:sz w:val="22"/>
-          <w:szCs w:val="22"/>
-          <w:highlight w:val="yellow"/>
-        </w:rPr>
-        <w:t>"</w:t>
-      </w:r>
-      <w:r>
-        <w:rPr>
-          <w:rFonts w:ascii="Times New Roman" w:hAnsi="Times New Roman" w:cs="Times New Roman"/>
-          <w:sz w:val="22"/>
-          <w:szCs w:val="22"/>
-          <w:highlight w:val="yellow"/>
-        </w:rPr>
-        <w:t xml:space="preserve"> </w:t>
-      </w:r>
-      <w:r>
-        <w:rPr>
-          <w:rFonts w:ascii="Times New Roman" w:hAnsi="Times New Roman" w:cs="Times New Roman"/>
-          <w:sz w:val="22"/>
-          <w:szCs w:val="22"/>
-          <w:highlight w:val="yellow"/>
-        </w:rPr>
-        <w:t>%}</w:t>
-      </w:r>
-      <w:proofErr w:type="gramEnd"/>
-    </w:p>
-    <w:p>
-      <w:pPr>
-        <w:spacing w:after="0" w:line="276" w:lineRule="auto"/>
-        <w:rPr>
-          <w:rFonts w:ascii="Times New Roman" w:hAnsi="Times New Roman" w:cs="Times New Roman"/>
-          <w:sz w:val="22"/>
-          <w:szCs w:val="22"/>
-        </w:rPr>
-      </w:pPr>
-      <w:proofErr w:type="gramStart"/>
-      <w:r>
-        <w:rPr>
-          <w:rFonts w:ascii="Times New Roman" w:hAnsi="Times New Roman" w:cs="Times New Roman"/>
-          <w:sz w:val="22"/>
-          <w:szCs w:val="22"/>
-        </w:rPr>
-        <w:t>[ ]</w:t>
-      </w:r>
-      <w:proofErr w:type="gramEnd"/>
-      <w:r>
-        <w:rPr>
-          <w:rFonts w:ascii="Times New Roman" w:hAnsi="Times New Roman" w:cs="Times New Roman"/>
-          <w:sz w:val="22"/>
-          <w:szCs w:val="22"/>
-        </w:rPr>
-        <w:t xml:space="preserve"> Uniform Spousal Support Order</w:t>
-      </w:r>
-    </w:p>
-    <w:p>
-      <w:pPr>
-        <w:spacing w:after="0" w:line="240" w:lineRule="auto"/>
-        <w:rPr>
-          <w:rFonts w:ascii="Times New Roman" w:hAnsi="Times New Roman" w:cs="Times New Roman"/>
-          <w:sz w:val="22"/>
-          <w:szCs w:val="22"/>
-        </w:rPr>
-      </w:pPr>
-      <w:r>
-        <w:rPr>
-          <w:rFonts w:ascii="Times New Roman" w:hAnsi="Times New Roman" w:cs="Times New Roman"/>
-          <w:sz w:val="22"/>
-          <w:szCs w:val="22"/>
-          <w:highlight w:val="yellow"/>
-        </w:rPr>
-        <w:t xml:space="preserve">{%p </w:t>
-      </w:r>
-      <w:proofErr w:type="gramStart"/>
-      <w:r>
-        <w:rPr>
-          <w:rFonts w:ascii="Times New Roman" w:hAnsi="Times New Roman" w:cs="Times New Roman"/>
-          <w:sz w:val="22"/>
-          <w:szCs w:val="22"/>
-          <w:highlight w:val="yellow"/>
-        </w:rPr>
-        <w:t>endif %}</w:t>
-      </w:r>
-      <w:proofErr w:type="gramEnd"/>
-    </w:p>
-    <w:p>
-      <w:pPr>
-        <w:spacing w:after="0" w:line="240" w:lineRule="auto"/>
-        <w:rPr>
-          <w:rFonts w:ascii="Times New Roman" w:hAnsi="Times New Roman" w:cs="Times New Roman"/>
-          <w:sz w:val="22"/>
-          <w:szCs w:val="22"/>
-        </w:rPr>
-      </w:pPr>
-      <w:r>
-        <w:rPr>
-          <w:rFonts w:ascii="Times New Roman" w:hAnsi="Times New Roman" w:cs="Times New Roman"/>
-          <w:sz w:val="22"/>
-          <w:szCs w:val="22"/>
-          <w:highlight w:val="yellow"/>
-        </w:rPr>
-        <w:t xml:space="preserve">{%p </w:t>
-      </w:r>
-      <w:r>
-        <w:rPr>
-          <w:rFonts w:ascii="Times New Roman" w:hAnsi="Times New Roman" w:cs="Times New Roman"/>
-          <w:sz w:val="22"/>
-          <w:szCs w:val="22"/>
-          <w:highlight w:val="yellow"/>
-        </w:rPr>
-        <w:t>if foc_100_</w:t>
-      </w:r>
-      <w:proofErr w:type="gramStart"/>
-      <w:r>
-        <w:rPr>
-          <w:rFonts w:ascii="Times New Roman" w:hAnsi="Times New Roman" w:cs="Times New Roman"/>
-          <w:sz w:val="22"/>
-          <w:szCs w:val="22"/>
-          <w:highlight w:val="yellow"/>
-        </w:rPr>
-        <w:t>full.enabled</w:t>
-      </w:r>
-      <w:proofErr w:type="gramEnd"/>
-      <w:r>
-        <w:rPr>
-          <w:rFonts w:ascii="Times New Roman" w:hAnsi="Times New Roman" w:cs="Times New Roman"/>
-          <w:sz w:val="22"/>
-          <w:szCs w:val="22"/>
-          <w:highlight w:val="yellow"/>
-        </w:rPr>
-        <w:t xml:space="preserve"> </w:t>
-      </w:r>
-      <w:r>
-        <w:rPr>
-          <w:rFonts w:ascii="Times New Roman" w:hAnsi="Times New Roman" w:cs="Times New Roman"/>
-          <w:sz w:val="22"/>
-          <w:szCs w:val="22"/>
-          <w:highlight w:val="yellow"/>
-        </w:rPr>
-        <w:t>%</w:t>
-      </w:r>
-      <w:r>
-        <w:rPr>
-          <w:rFonts w:ascii="Times New Roman" w:hAnsi="Times New Roman" w:cs="Times New Roman"/>
-          <w:sz w:val="22"/>
-          <w:szCs w:val="22"/>
-          <w:highlight w:val="yellow"/>
-        </w:rPr>
-        <w:t>}</w:t>
-      </w:r>
-    </w:p>
-    <w:p>
-      <w:pPr>
-        <w:spacing w:after="0" w:line="276" w:lineRule="auto"/>
-        <w:rPr>
-          <w:rFonts w:ascii="Times New Roman" w:hAnsi="Times New Roman" w:cs="Times New Roman"/>
-          <w:sz w:val="22"/>
-          <w:szCs w:val="22"/>
-        </w:rPr>
-      </w:pPr>
-      <w:proofErr w:type="gramStart"/>
-      <w:r>
-        <w:rPr>
-          <w:rFonts w:ascii="Times New Roman" w:hAnsi="Times New Roman" w:cs="Times New Roman"/>
-          <w:sz w:val="22"/>
-          <w:szCs w:val="22"/>
-        </w:rPr>
-        <w:t>[ ]</w:t>
-      </w:r>
-      <w:proofErr w:type="gramEnd"/>
-      <w:r>
-        <w:rPr>
-          <w:rFonts w:ascii="Times New Roman" w:hAnsi="Times New Roman" w:cs="Times New Roman"/>
-          <w:sz w:val="22"/>
-          <w:szCs w:val="22"/>
-        </w:rPr>
-        <w:t xml:space="preserve"> Domestic Relations Judgment Information Form</w:t>
-      </w:r>
-    </w:p>
-    <w:p>
-      <w:pPr>
-        <w:spacing w:after="0" w:line="240" w:lineRule="auto"/>
-        <w:rPr>
-          <w:rFonts w:ascii="Times New Roman" w:hAnsi="Times New Roman" w:cs="Times New Roman"/>
-          <w:sz w:val="22"/>
-          <w:szCs w:val="22"/>
-        </w:rPr>
-      </w:pPr>
-      <w:r>
-        <w:rPr>
-          <w:rFonts w:ascii="Times New Roman" w:hAnsi="Times New Roman" w:cs="Times New Roman"/>
-          <w:sz w:val="22"/>
-          <w:szCs w:val="22"/>
-          <w:highlight w:val="yellow"/>
-        </w:rPr>
-        <w:t xml:space="preserve">{%p </w:t>
-      </w:r>
-      <w:proofErr w:type="gramStart"/>
-      <w:r>
-        <w:rPr>
-          <w:rFonts w:ascii="Times New Roman" w:hAnsi="Times New Roman" w:cs="Times New Roman"/>
-          <w:sz w:val="22"/>
-          <w:szCs w:val="22"/>
-          <w:highlight w:val="yellow"/>
-        </w:rPr>
-        <w:t>endif %}</w:t>
-      </w:r>
-      <w:proofErr w:type="gramEnd"/>
-    </w:p>
-    <w:p>
-      <w:pPr>
-        <w:spacing w:after="0" w:line="276" w:lineRule="auto"/>
-        <w:rPr>
-          <w:rFonts w:ascii="Times New Roman" w:hAnsi="Times New Roman" w:cs="Times New Roman"/>
-          <w:sz w:val="22"/>
-          <w:szCs w:val="22"/>
-        </w:rPr>
-      </w:pPr>
-      <w:proofErr w:type="gramStart"/>
-      <w:r>
-        <w:rPr>
-          <w:rFonts w:ascii="Times New Roman" w:hAnsi="Times New Roman" w:cs="Times New Roman"/>
-          <w:sz w:val="22"/>
-          <w:szCs w:val="22"/>
-        </w:rPr>
-        <w:t>[ ]</w:t>
-      </w:r>
-      <w:proofErr w:type="gramEnd"/>
-      <w:r>
-        <w:rPr>
-          <w:rFonts w:ascii="Times New Roman" w:hAnsi="Times New Roman" w:cs="Times New Roman"/>
-          <w:sz w:val="22"/>
-          <w:szCs w:val="22"/>
-        </w:rPr>
-        <w:t xml:space="preserve"> Domestic Relations Verified Financial Information Form</w:t>
-      </w:r>
-    </w:p>
-    <w:p>
-      <w:pPr>
-        <w:spacing w:after="0" w:line="240" w:lineRule="auto"/>
-        <w:rPr>
-          <w:rFonts w:ascii="Times New Roman" w:hAnsi="Times New Roman" w:cs="Times New Roman"/>
-          <w:sz w:val="22"/>
-          <w:szCs w:val="22"/>
-        </w:rPr>
-      </w:pPr>
-      <w:r>
-        <w:rPr>
-          <w:rFonts w:ascii="Times New Roman" w:hAnsi="Times New Roman" w:cs="Times New Roman"/>
-          <w:sz w:val="22"/>
-          <w:szCs w:val="22"/>
-          <w:highlight w:val="cyan"/>
-        </w:rPr>
-        <w:t xml:space="preserve">{%p </w:t>
-      </w:r>
-      <w:r>
-        <w:rPr>
-          <w:rFonts w:ascii="Times New Roman" w:hAnsi="Times New Roman" w:cs="Times New Roman"/>
-          <w:sz w:val="22"/>
-          <w:szCs w:val="22"/>
-          <w:highlight w:val="cyan"/>
-        </w:rPr>
-        <w:t>el</w:t>
-      </w:r>
-      <w:r>
-        <w:rPr>
-          <w:rFonts w:ascii="Times New Roman" w:hAnsi="Times New Roman" w:cs="Times New Roman"/>
-          <w:sz w:val="22"/>
-          <w:szCs w:val="22"/>
-          <w:highlight w:val="cyan"/>
-        </w:rPr>
-        <w:t>if tool</w:t>
-      </w:r>
-      <w:r>
-        <w:rPr>
-          <w:rFonts w:ascii="Times New Roman" w:hAnsi="Times New Roman" w:cs="Times New Roman"/>
-          <w:sz w:val="22"/>
-          <w:szCs w:val="22"/>
-          <w:highlight w:val="cyan"/>
-        </w:rPr>
-        <w:t>_ID</w:t>
-      </w:r>
-      <w:r>
-        <w:rPr>
-          <w:rFonts w:ascii="Times New Roman" w:hAnsi="Times New Roman" w:cs="Times New Roman"/>
-          <w:sz w:val="22"/>
-          <w:szCs w:val="22"/>
-          <w:highlight w:val="cyan"/>
-        </w:rPr>
-        <w:t xml:space="preserve"> == </w:t>
-      </w:r>
-      <w:r>
-        <w:rPr>
-          <w:rFonts w:ascii="Times New Roman" w:hAnsi="Times New Roman" w:cs="Times New Roman"/>
-          <w:sz w:val="22"/>
-          <w:szCs w:val="22"/>
-          <w:highlight w:val="cyan"/>
-        </w:rPr>
-        <w:t>“JOD_only”</w:t>
-      </w:r>
-      <w:r>
-        <w:rPr>
-          <w:rFonts w:ascii="Times New Roman" w:hAnsi="Times New Roman" w:cs="Times New Roman"/>
-          <w:sz w:val="22"/>
-          <w:szCs w:val="22"/>
-          <w:highlight w:val="cyan"/>
-        </w:rPr>
-        <w:t xml:space="preserve"> %}</w:t>
-      </w:r>
-    </w:p>
-    <w:p>
-      <w:pPr>
-        <w:spacing w:after="0" w:line="276" w:lineRule="auto"/>
-        <w:rPr>
-          <w:rFonts w:ascii="Times New Roman" w:hAnsi="Times New Roman" w:cs="Times New Roman"/>
-          <w:sz w:val="22"/>
-          <w:szCs w:val="22"/>
-        </w:rPr>
-      </w:pPr>
-      <w:proofErr w:type="gramStart"/>
-      <w:r>
-        <w:rPr>
-          <w:rFonts w:ascii="Times New Roman" w:hAnsi="Times New Roman" w:cs="Times New Roman"/>
-          <w:sz w:val="22"/>
-          <w:szCs w:val="22"/>
-        </w:rPr>
-        <w:t>[ ]</w:t>
-      </w:r>
-      <w:proofErr w:type="gramEnd"/>
-      <w:r>
-        <w:rPr>
-          <w:rFonts w:ascii="Times New Roman" w:hAnsi="Times New Roman" w:cs="Times New Roman"/>
-          <w:sz w:val="22"/>
-          <w:szCs w:val="22"/>
-        </w:rPr>
-        <w:t xml:space="preserve"> Notice of Hearing</w:t>
-      </w:r>
-    </w:p>
-    <w:p>
-      <w:pPr>
-        <w:spacing w:after="0" w:line="276" w:lineRule="auto"/>
-        <w:rPr>
-          <w:rFonts w:ascii="Times New Roman" w:hAnsi="Times New Roman" w:cs="Times New Roman"/>
-          <w:sz w:val="22"/>
-          <w:szCs w:val="22"/>
-        </w:rPr>
-      </w:pPr>
-      <w:proofErr w:type="gramStart"/>
-      <w:r>
-        <w:rPr>
-          <w:rFonts w:ascii="Times New Roman" w:hAnsi="Times New Roman" w:cs="Times New Roman"/>
-          <w:sz w:val="22"/>
-          <w:szCs w:val="22"/>
-        </w:rPr>
-        <w:t>[ ]</w:t>
-      </w:r>
-      <w:proofErr w:type="gramEnd"/>
-      <w:r>
-        <w:rPr>
-          <w:rFonts w:ascii="Times New Roman" w:hAnsi="Times New Roman" w:cs="Times New Roman"/>
-          <w:sz w:val="22"/>
-          <w:szCs w:val="22"/>
-        </w:rPr>
-        <w:t xml:space="preserve"> Notice of Hearing and Motion for Entry of Consent Judgment of Divorce</w:t>
-      </w:r>
-    </w:p>
-    <w:p>
-      <w:pPr>
-        <w:spacing w:after="0" w:line="276" w:lineRule="auto"/>
-        <w:rPr>
-          <w:rFonts w:ascii="Times New Roman" w:hAnsi="Times New Roman" w:cs="Times New Roman"/>
-          <w:sz w:val="22"/>
-          <w:szCs w:val="22"/>
-        </w:rPr>
-      </w:pPr>
-      <w:proofErr w:type="gramStart"/>
-      <w:r>
-        <w:rPr>
-          <w:rFonts w:ascii="Times New Roman" w:hAnsi="Times New Roman" w:cs="Times New Roman"/>
-          <w:sz w:val="22"/>
-          <w:szCs w:val="22"/>
-        </w:rPr>
-        <w:t>[ ]</w:t>
-      </w:r>
-      <w:proofErr w:type="gramEnd"/>
-      <w:r>
-        <w:rPr>
-          <w:rFonts w:ascii="Times New Roman" w:hAnsi="Times New Roman" w:cs="Times New Roman"/>
-          <w:sz w:val="22"/>
-          <w:szCs w:val="22"/>
-        </w:rPr>
-        <w:t xml:space="preserve"> Notice of Hearing and Motion for Entry of Default Judgment of Divorce</w:t>
-      </w:r>
-    </w:p>
-    <w:p>
-      <w:pPr>
-        <w:spacing w:after="0" w:line="276" w:lineRule="auto"/>
-        <w:rPr>
-          <w:rFonts w:ascii="Times New Roman" w:hAnsi="Times New Roman" w:cs="Times New Roman"/>
-          <w:sz w:val="22"/>
-          <w:szCs w:val="22"/>
-        </w:rPr>
-      </w:pPr>
-      <w:proofErr w:type="gramStart"/>
-      <w:r>
-        <w:rPr>
-          <w:rFonts w:ascii="Times New Roman" w:hAnsi="Times New Roman" w:cs="Times New Roman"/>
-          <w:sz w:val="22"/>
-          <w:szCs w:val="22"/>
-        </w:rPr>
-        <w:t>[ ]</w:t>
-      </w:r>
-      <w:proofErr w:type="gramEnd"/>
-      <w:r>
-        <w:rPr>
-          <w:rFonts w:ascii="Times New Roman" w:hAnsi="Times New Roman" w:cs="Times New Roman"/>
-          <w:sz w:val="22"/>
-          <w:szCs w:val="22"/>
-        </w:rPr>
-        <w:t xml:space="preserve"> Proposed Judgment of Divorce</w:t>
-      </w:r>
-    </w:p>
-    <w:p>
-      <w:pPr>
-        <w:spacing w:after="0" w:line="240" w:lineRule="auto"/>
-        <w:rPr>
-          <w:rFonts w:ascii="Times New Roman" w:hAnsi="Times New Roman" w:cs="Times New Roman"/>
-          <w:sz w:val="22"/>
-          <w:szCs w:val="22"/>
-        </w:rPr>
-      </w:pPr>
-      <w:r>
-        <w:rPr>
-          <w:rFonts w:ascii="Times New Roman" w:hAnsi="Times New Roman" w:cs="Times New Roman"/>
-          <w:sz w:val="22"/>
-          <w:szCs w:val="22"/>
-          <w:highlight w:val="yellow"/>
-        </w:rPr>
-        <w:t xml:space="preserve">{%p if </w:t>
-      </w:r>
-      <w:r>
-        <w:rPr>
-          <w:rFonts w:ascii="Times New Roman" w:hAnsi="Times New Roman" w:cs="Times New Roman"/>
-          <w:sz w:val="22"/>
-          <w:szCs w:val="22"/>
-          <w:highlight w:val="yellow"/>
-        </w:rPr>
-        <w:t>there_are_marital_</w:t>
-      </w:r>
-      <w:proofErr w:type="gramStart"/>
-      <w:r>
-        <w:rPr>
-          <w:rFonts w:ascii="Times New Roman" w:hAnsi="Times New Roman" w:cs="Times New Roman"/>
-          <w:sz w:val="22"/>
-          <w:szCs w:val="22"/>
-          <w:highlight w:val="yellow"/>
-        </w:rPr>
-        <w:t>children</w:t>
-      </w:r>
-      <w:r>
-        <w:rPr>
-          <w:rFonts w:ascii="Times New Roman" w:hAnsi="Times New Roman" w:cs="Times New Roman"/>
-          <w:sz w:val="22"/>
-          <w:szCs w:val="22"/>
-          <w:highlight w:val="yellow"/>
-        </w:rPr>
-        <w:t xml:space="preserve"> </w:t>
-      </w:r>
-      <w:r>
-        <w:rPr>
-          <w:rFonts w:ascii="Times New Roman" w:hAnsi="Times New Roman" w:cs="Times New Roman"/>
-          <w:sz w:val="22"/>
-          <w:szCs w:val="22"/>
-          <w:highlight w:val="yellow"/>
-        </w:rPr>
-        <w:t>%}</w:t>
-      </w:r>
-      <w:proofErr w:type="gramEnd"/>
-    </w:p>
-    <w:p>
-      <w:pPr>
-        <w:spacing w:after="0" w:line="276" w:lineRule="auto"/>
-        <w:rPr>
-          <w:rFonts w:ascii="Times New Roman" w:hAnsi="Times New Roman" w:cs="Times New Roman"/>
-          <w:sz w:val="22"/>
-          <w:szCs w:val="22"/>
-        </w:rPr>
-      </w:pPr>
-      <w:proofErr w:type="gramStart"/>
-      <w:r>
-        <w:rPr>
-          <w:rFonts w:ascii="Times New Roman" w:hAnsi="Times New Roman" w:cs="Times New Roman"/>
-          <w:sz w:val="22"/>
-          <w:szCs w:val="22"/>
-        </w:rPr>
-        <w:t>[ ]</w:t>
-      </w:r>
-      <w:proofErr w:type="gramEnd"/>
-      <w:r>
-        <w:rPr>
-          <w:rFonts w:ascii="Times New Roman" w:hAnsi="Times New Roman" w:cs="Times New Roman"/>
-          <w:sz w:val="22"/>
-          <w:szCs w:val="22"/>
-        </w:rPr>
-        <w:t xml:space="preserve"> Proposed Uniform Child Support Order</w:t>
-      </w:r>
-    </w:p>
-    <w:p>
-      <w:pPr>
-        <w:spacing w:after="0" w:line="240" w:lineRule="auto"/>
-        <w:rPr>
-          <w:rFonts w:ascii="Times New Roman" w:hAnsi="Times New Roman" w:cs="Times New Roman"/>
-          <w:sz w:val="22"/>
-          <w:szCs w:val="22"/>
-        </w:rPr>
-      </w:pPr>
-      <w:r>
-        <w:rPr>
-          <w:rFonts w:ascii="Times New Roman" w:hAnsi="Times New Roman" w:cs="Times New Roman"/>
-          <w:sz w:val="22"/>
-          <w:szCs w:val="22"/>
-          <w:highlight w:val="yellow"/>
-        </w:rPr>
-        <w:t xml:space="preserve">{%p </w:t>
-      </w:r>
-      <w:proofErr w:type="gramStart"/>
-      <w:r>
-        <w:rPr>
-          <w:rFonts w:ascii="Times New Roman" w:hAnsi="Times New Roman" w:cs="Times New Roman"/>
-          <w:sz w:val="22"/>
-          <w:szCs w:val="22"/>
-          <w:highlight w:val="yellow"/>
-        </w:rPr>
-        <w:t>endif %}</w:t>
-      </w:r>
-      <w:proofErr w:type="gramEnd"/>
-    </w:p>
-    <w:p>
-      <w:pPr>
-        <w:spacing w:after="0" w:line="240" w:lineRule="auto"/>
-        <w:rPr>
-          <w:rFonts w:ascii="Times New Roman" w:hAnsi="Times New Roman" w:cs="Times New Roman"/>
-          <w:sz w:val="22"/>
-          <w:szCs w:val="22"/>
-        </w:rPr>
-      </w:pPr>
-      <w:r>
-        <w:rPr>
-          <w:rFonts w:ascii="Times New Roman" w:hAnsi="Times New Roman" w:cs="Times New Roman"/>
-          <w:sz w:val="22"/>
-          <w:szCs w:val="22"/>
-          <w:highlight w:val="yellow"/>
-        </w:rPr>
-        <w:t xml:space="preserve">{%p if </w:t>
-      </w:r>
-      <w:r>
-        <w:rPr>
-          <w:rFonts w:ascii="Times New Roman" w:hAnsi="Times New Roman" w:cs="Times New Roman"/>
-          <w:sz w:val="22"/>
-          <w:szCs w:val="22"/>
-          <w:highlight w:val="yellow"/>
-        </w:rPr>
-        <w:t>user_wants_post_divorce_support or spousal_support_provisions == "user_agrees_to_pay_spousal_support</w:t>
-      </w:r>
-      <w:proofErr w:type="gramStart"/>
-      <w:r>
-        <w:rPr>
-          <w:rFonts w:ascii="Times New Roman" w:hAnsi="Times New Roman" w:cs="Times New Roman"/>
-          <w:sz w:val="22"/>
-          <w:szCs w:val="22"/>
-          <w:highlight w:val="yellow"/>
-        </w:rPr>
-        <w:t>"</w:t>
-      </w:r>
-      <w:r>
-        <w:rPr>
-          <w:rFonts w:ascii="Times New Roman" w:hAnsi="Times New Roman" w:cs="Times New Roman"/>
-          <w:sz w:val="22"/>
-          <w:szCs w:val="22"/>
-          <w:highlight w:val="yellow"/>
-        </w:rPr>
-        <w:t xml:space="preserve"> </w:t>
-      </w:r>
-      <w:r>
-        <w:rPr>
-          <w:rFonts w:ascii="Times New Roman" w:hAnsi="Times New Roman" w:cs="Times New Roman"/>
-          <w:sz w:val="22"/>
-          <w:szCs w:val="22"/>
-          <w:highlight w:val="yellow"/>
-        </w:rPr>
-        <w:t>%}</w:t>
-      </w:r>
-      <w:proofErr w:type="gramEnd"/>
-    </w:p>
-    <w:p>
-      <w:pPr>
-        <w:spacing w:after="0" w:line="276" w:lineRule="auto"/>
-        <w:rPr>
-          <w:rFonts w:ascii="Times New Roman" w:hAnsi="Times New Roman" w:cs="Times New Roman"/>
-          <w:sz w:val="22"/>
-          <w:szCs w:val="22"/>
-        </w:rPr>
-      </w:pPr>
-      <w:proofErr w:type="gramStart"/>
-      <w:r>
-        <w:rPr>
-          <w:rFonts w:ascii="Times New Roman" w:hAnsi="Times New Roman" w:cs="Times New Roman"/>
-          <w:sz w:val="22"/>
-          <w:szCs w:val="22"/>
-        </w:rPr>
-        <w:t>[ ]</w:t>
-      </w:r>
-      <w:proofErr w:type="gramEnd"/>
-      <w:r>
-        <w:rPr>
-          <w:rFonts w:ascii="Times New Roman" w:hAnsi="Times New Roman" w:cs="Times New Roman"/>
-          <w:sz w:val="22"/>
-          <w:szCs w:val="22"/>
-        </w:rPr>
-        <w:t xml:space="preserve"> Proposed Uniform Spousal Support Order</w:t>
-      </w:r>
-    </w:p>
-    <w:p>
-      <w:pPr>
-        <w:spacing w:after="0" w:line="240" w:lineRule="auto"/>
-        <w:rPr>
-          <w:rFonts w:ascii="Times New Roman" w:hAnsi="Times New Roman" w:cs="Times New Roman"/>
-          <w:sz w:val="22"/>
-          <w:szCs w:val="22"/>
-        </w:rPr>
-      </w:pPr>
-      <w:r>
-        <w:rPr>
-          <w:rFonts w:ascii="Times New Roman" w:hAnsi="Times New Roman" w:cs="Times New Roman"/>
-          <w:sz w:val="22"/>
-          <w:szCs w:val="22"/>
-          <w:highlight w:val="yellow"/>
-        </w:rPr>
-        <w:t xml:space="preserve">{%p </w:t>
-      </w:r>
-      <w:proofErr w:type="gramStart"/>
-      <w:r>
-        <w:rPr>
-          <w:rFonts w:ascii="Times New Roman" w:hAnsi="Times New Roman" w:cs="Times New Roman"/>
-          <w:sz w:val="22"/>
-          <w:szCs w:val="22"/>
-          <w:highlight w:val="yellow"/>
-        </w:rPr>
-        <w:t>endif %}</w:t>
-      </w:r>
-      <w:proofErr w:type="gramEnd"/>
-    </w:p>
-    <w:p>
-      <w:pPr>
-        <w:spacing w:after="0" w:line="276" w:lineRule="auto"/>
-        <w:rPr>
-          <w:rFonts w:ascii="Times New Roman" w:hAnsi="Times New Roman" w:cs="Times New Roman"/>
-          <w:sz w:val="22"/>
-          <w:szCs w:val="22"/>
-        </w:rPr>
-      </w:pPr>
-      <w:proofErr w:type="gramStart"/>
-      <w:r>
-        <w:rPr>
-          <w:rFonts w:ascii="Times New Roman" w:hAnsi="Times New Roman" w:cs="Times New Roman"/>
-          <w:sz w:val="22"/>
-          <w:szCs w:val="22"/>
-        </w:rPr>
-        <w:t>[ ]</w:t>
-      </w:r>
-      <w:proofErr w:type="gramEnd"/>
-      <w:r>
-        <w:rPr>
-          <w:rFonts w:ascii="Times New Roman" w:hAnsi="Times New Roman" w:cs="Times New Roman"/>
-          <w:sz w:val="22"/>
-          <w:szCs w:val="22"/>
-        </w:rPr>
-        <w:t xml:space="preserve"> Judgment of Divorce</w:t>
-      </w:r>
     </w:p>
     <w:p>
       <w:pPr>
@@ -4276,6 +4945,192 @@
         <w:lastRenderedPageBreak/>
         <w:t xml:space="preserve">{%p if </w:t>
       </w:r>
+      <w:proofErr w:type="spellStart"/>
+      <w:r>
+        <w:rPr>
+          <w:rFonts w:ascii="Times New Roman" w:hAnsi="Times New Roman" w:cs="Times New Roman"/>
+          <w:sz w:val="22"/>
+          <w:szCs w:val="22"/>
+          <w:highlight w:val="yellow"/>
+        </w:rPr>
+        <w:t>user_wants_post_divorce_support</w:t>
+      </w:r>
+      <w:proofErr w:type="spellEnd"/>
+      <w:r>
+        <w:rPr>
+          <w:rFonts w:ascii="Times New Roman" w:hAnsi="Times New Roman" w:cs="Times New Roman"/>
+          <w:sz w:val="22"/>
+          <w:szCs w:val="22"/>
+          <w:highlight w:val="yellow"/>
+        </w:rPr>
+        <w:t xml:space="preserve"> or </w:t>
+      </w:r>
+      <w:proofErr w:type="spellStart"/>
+      <w:r>
+        <w:rPr>
+          <w:rFonts w:ascii="Times New Roman" w:hAnsi="Times New Roman" w:cs="Times New Roman"/>
+          <w:sz w:val="22"/>
+          <w:szCs w:val="22"/>
+          <w:highlight w:val="yellow"/>
+        </w:rPr>
+        <w:t>spousal_support_provisions</w:t>
+      </w:r>
+      <w:proofErr w:type="spellEnd"/>
+      <w:r>
+        <w:rPr>
+          <w:rFonts w:ascii="Times New Roman" w:hAnsi="Times New Roman" w:cs="Times New Roman"/>
+          <w:sz w:val="22"/>
+          <w:szCs w:val="22"/>
+          <w:highlight w:val="yellow"/>
+        </w:rPr>
+        <w:t xml:space="preserve"> == "</w:t>
+      </w:r>
+      <w:proofErr w:type="spellStart"/>
+      <w:r>
+        <w:rPr>
+          <w:rFonts w:ascii="Times New Roman" w:hAnsi="Times New Roman" w:cs="Times New Roman"/>
+          <w:sz w:val="22"/>
+          <w:szCs w:val="22"/>
+          <w:highlight w:val="yellow"/>
+        </w:rPr>
+        <w:t>user_agrees_to_pay_spousal_support</w:t>
+      </w:r>
+      <w:proofErr w:type="spellEnd"/>
+      <w:proofErr w:type="gramStart"/>
+      <w:r>
+        <w:rPr>
+          <w:rFonts w:ascii="Times New Roman" w:hAnsi="Times New Roman" w:cs="Times New Roman"/>
+          <w:sz w:val="22"/>
+          <w:szCs w:val="22"/>
+          <w:highlight w:val="yellow"/>
+        </w:rPr>
+        <w:t>"</w:t>
+      </w:r>
+      <w:r>
+        <w:rPr>
+          <w:rFonts w:ascii="Times New Roman" w:hAnsi="Times New Roman" w:cs="Times New Roman"/>
+          <w:sz w:val="22"/>
+          <w:szCs w:val="22"/>
+          <w:highlight w:val="yellow"/>
+        </w:rPr>
+        <w:t xml:space="preserve"> </w:t>
+      </w:r>
+      <w:r>
+        <w:rPr>
+          <w:rFonts w:ascii="Times New Roman" w:hAnsi="Times New Roman" w:cs="Times New Roman"/>
+          <w:sz w:val="22"/>
+          <w:szCs w:val="22"/>
+          <w:highlight w:val="yellow"/>
+        </w:rPr>
+        <w:t>%}</w:t>
+      </w:r>
+      <w:proofErr w:type="gramEnd"/>
+    </w:p>
+    <w:p>
+      <w:pPr>
+        <w:spacing w:after="0" w:line="276" w:lineRule="auto"/>
+        <w:rPr>
+          <w:rFonts w:ascii="Times New Roman" w:hAnsi="Times New Roman" w:cs="Times New Roman"/>
+          <w:sz w:val="22"/>
+          <w:szCs w:val="22"/>
+        </w:rPr>
+      </w:pPr>
+      <w:proofErr w:type="gramStart"/>
+      <w:r>
+        <w:rPr>
+          <w:rFonts w:ascii="Times New Roman" w:hAnsi="Times New Roman" w:cs="Times New Roman"/>
+          <w:sz w:val="22"/>
+          <w:szCs w:val="22"/>
+        </w:rPr>
+        <w:t>[ ]</w:t>
+      </w:r>
+      <w:proofErr w:type="gramEnd"/>
+      <w:r>
+        <w:rPr>
+          <w:rFonts w:ascii="Times New Roman" w:hAnsi="Times New Roman" w:cs="Times New Roman"/>
+          <w:sz w:val="22"/>
+          <w:szCs w:val="22"/>
+        </w:rPr>
+        <w:t xml:space="preserve"> Proposed Uniform Spousal Support Order</w:t>
+      </w:r>
+    </w:p>
+    <w:p>
+      <w:pPr>
+        <w:spacing w:after="0" w:line="240" w:lineRule="auto"/>
+        <w:rPr>
+          <w:rFonts w:ascii="Times New Roman" w:hAnsi="Times New Roman" w:cs="Times New Roman"/>
+          <w:sz w:val="22"/>
+          <w:szCs w:val="22"/>
+        </w:rPr>
+      </w:pPr>
+      <w:r>
+        <w:rPr>
+          <w:rFonts w:ascii="Times New Roman" w:hAnsi="Times New Roman" w:cs="Times New Roman"/>
+          <w:sz w:val="22"/>
+          <w:szCs w:val="22"/>
+          <w:highlight w:val="yellow"/>
+        </w:rPr>
+        <w:t xml:space="preserve">{%p </w:t>
+      </w:r>
+      <w:proofErr w:type="gramStart"/>
+      <w:r>
+        <w:rPr>
+          <w:rFonts w:ascii="Times New Roman" w:hAnsi="Times New Roman" w:cs="Times New Roman"/>
+          <w:sz w:val="22"/>
+          <w:szCs w:val="22"/>
+          <w:highlight w:val="yellow"/>
+        </w:rPr>
+        <w:t>endif %}</w:t>
+      </w:r>
+      <w:proofErr w:type="gramEnd"/>
+    </w:p>
+    <w:p>
+      <w:pPr>
+        <w:spacing w:after="0" w:line="276" w:lineRule="auto"/>
+        <w:rPr>
+          <w:rFonts w:ascii="Times New Roman" w:hAnsi="Times New Roman" w:cs="Times New Roman"/>
+          <w:sz w:val="22"/>
+          <w:szCs w:val="22"/>
+        </w:rPr>
+      </w:pPr>
+      <w:proofErr w:type="gramStart"/>
+      <w:r>
+        <w:rPr>
+          <w:rFonts w:ascii="Times New Roman" w:hAnsi="Times New Roman" w:cs="Times New Roman"/>
+          <w:sz w:val="22"/>
+          <w:szCs w:val="22"/>
+        </w:rPr>
+        <w:t>[ ]</w:t>
+      </w:r>
+      <w:proofErr w:type="gramEnd"/>
+      <w:r>
+        <w:rPr>
+          <w:rFonts w:ascii="Times New Roman" w:hAnsi="Times New Roman" w:cs="Times New Roman"/>
+          <w:sz w:val="22"/>
+          <w:szCs w:val="22"/>
+        </w:rPr>
+        <w:t xml:space="preserve"> Judgment of Divorce</w:t>
+      </w:r>
+    </w:p>
+    <w:p>
+      <w:pPr>
+        <w:spacing w:after="0" w:line="240" w:lineRule="auto"/>
+        <w:rPr>
+          <w:rFonts w:ascii="Times New Roman" w:hAnsi="Times New Roman" w:cs="Times New Roman"/>
+          <w:sz w:val="22"/>
+          <w:szCs w:val="22"/>
+        </w:rPr>
+      </w:pPr>
+      <w:r>
+        <w:rPr>
+          <w:rFonts w:ascii="Times New Roman" w:hAnsi="Times New Roman" w:cs="Times New Roman"/>
+          <w:sz w:val="22"/>
+          <w:szCs w:val="22"/>
+          <w:highlight w:val="yellow"/>
+        </w:rPr>
+        <w:t xml:space="preserve">{%p if </w:t>
+      </w:r>
+      <w:proofErr w:type="spellStart"/>
       <w:r>
         <w:rPr>
           <w:rFonts w:ascii="Times New Roman" w:hAnsi="Times New Roman" w:cs="Times New Roman"/>
@@ -4295,6 +5150,7 @@
         </w:rPr>
         <w:t>children</w:t>
       </w:r>
+      <w:proofErr w:type="spellEnd"/>
       <w:r>
         <w:rPr>
           <w:rFonts w:ascii="Times New Roman" w:hAnsi="Times New Roman" w:cs="Times New Roman"/>
@@ -4391,15 +5247,57 @@
         </w:rPr>
         <w:t xml:space="preserve">{%p if </w:t>
       </w:r>
-      <w:r>
-        <w:rPr>
-          <w:rFonts w:ascii="Times New Roman" w:hAnsi="Times New Roman" w:cs="Times New Roman"/>
-          <w:sz w:val="22"/>
-          <w:szCs w:val="22"/>
-          <w:highlight w:val="yellow"/>
-        </w:rPr>
-        <w:t>user_wants_post_divorce_support or spousal_support_provisions == "user_agrees_to_pay_spousal_support</w:t>
-      </w:r>
+      <w:proofErr w:type="spellStart"/>
+      <w:r>
+        <w:rPr>
+          <w:rFonts w:ascii="Times New Roman" w:hAnsi="Times New Roman" w:cs="Times New Roman"/>
+          <w:sz w:val="22"/>
+          <w:szCs w:val="22"/>
+          <w:highlight w:val="yellow"/>
+        </w:rPr>
+        <w:t>user_wants_post_divorce_support</w:t>
+      </w:r>
+      <w:proofErr w:type="spellEnd"/>
+      <w:r>
+        <w:rPr>
+          <w:rFonts w:ascii="Times New Roman" w:hAnsi="Times New Roman" w:cs="Times New Roman"/>
+          <w:sz w:val="22"/>
+          <w:szCs w:val="22"/>
+          <w:highlight w:val="yellow"/>
+        </w:rPr>
+        <w:t xml:space="preserve"> or </w:t>
+      </w:r>
+      <w:proofErr w:type="spellStart"/>
+      <w:r>
+        <w:rPr>
+          <w:rFonts w:ascii="Times New Roman" w:hAnsi="Times New Roman" w:cs="Times New Roman"/>
+          <w:sz w:val="22"/>
+          <w:szCs w:val="22"/>
+          <w:highlight w:val="yellow"/>
+        </w:rPr>
+        <w:t>spousal_support_provisions</w:t>
+      </w:r>
+      <w:proofErr w:type="spellEnd"/>
+      <w:r>
+        <w:rPr>
+          <w:rFonts w:ascii="Times New Roman" w:hAnsi="Times New Roman" w:cs="Times New Roman"/>
+          <w:sz w:val="22"/>
+          <w:szCs w:val="22"/>
+          <w:highlight w:val="yellow"/>
+        </w:rPr>
+        <w:t xml:space="preserve"> == "</w:t>
+      </w:r>
+      <w:proofErr w:type="spellStart"/>
+      <w:r>
+        <w:rPr>
+          <w:rFonts w:ascii="Times New Roman" w:hAnsi="Times New Roman" w:cs="Times New Roman"/>
+          <w:sz w:val="22"/>
+          <w:szCs w:val="22"/>
+          <w:highlight w:val="yellow"/>
+        </w:rPr>
+        <w:t>user_agrees_to_pay_spousal_support</w:t>
+      </w:r>
+      <w:proofErr w:type="spellEnd"/>
       <w:proofErr w:type="gramStart"/>
       <w:r>
         <w:rPr>
@@ -4878,7 +5776,25 @@
           <w:sz w:val="20"/>
           <w:szCs w:val="20"/>
         </w:rPr>
-        <w:t xml:space="preserve">{% if user_ask_role == “plaintiff” </w:t>
+        <w:t xml:space="preserve">{% if </w:t>
+      </w:r>
+      <w:proofErr w:type="spellStart"/>
+      <w:r>
+        <w:rPr>
+          <w:rFonts w:ascii="Times New Roman" w:hAnsi="Times New Roman" w:cs="Times New Roman"/>
+          <w:sz w:val="20"/>
+          <w:szCs w:val="20"/>
+        </w:rPr>
+        <w:t>user_ask_role</w:t>
+      </w:r>
+      <w:proofErr w:type="spellEnd"/>
+      <w:r>
+        <w:rPr>
+          <w:rFonts w:ascii="Times New Roman" w:hAnsi="Times New Roman" w:cs="Times New Roman"/>
+          <w:sz w:val="20"/>
+          <w:szCs w:val="20"/>
+        </w:rPr>
+        <w:t xml:space="preserve"> == “plaintiff” </w:t>
       </w:r>
       <w:proofErr w:type="gramStart"/>
       <w:r>

</xml_diff>

<commit_message>
make more complicated version of CC logic
</commit_message>
<xml_diff>
--- a/docassemble/MLHDivorceAndCustody/data/templates/proof_of_service.docx
+++ b/docassemble/MLHDivorceAndCustody/data/templates/proof_of_service.docx
@@ -3241,7 +3241,16 @@
           <w:szCs w:val="22"/>
           <w:highlight w:val="yellow"/>
         </w:rPr>
-        <w:t>complaint_type</w:t>
+        <w:t>counterclaim</w:t>
+      </w:r>
+      <w:r>
+        <w:rPr>
+          <w:rFonts w:ascii="Times New Roman" w:hAnsi="Times New Roman" w:cs="Times New Roman"/>
+          <w:sz w:val="22"/>
+          <w:szCs w:val="22"/>
+          <w:highlight w:val="yellow"/>
+        </w:rPr>
+        <w:t>_type</w:t>
       </w:r>
       <w:proofErr w:type="spellEnd"/>
       <w:r>
@@ -3420,7 +3429,16 @@
           <w:szCs w:val="22"/>
           <w:highlight w:val="yellow"/>
         </w:rPr>
-        <w:t>complaint_type</w:t>
+        <w:t>counterclaim_</w:t>
+      </w:r>
+      <w:r>
+        <w:rPr>
+          <w:rFonts w:ascii="Times New Roman" w:hAnsi="Times New Roman" w:cs="Times New Roman"/>
+          <w:sz w:val="22"/>
+          <w:szCs w:val="22"/>
+          <w:highlight w:val="yellow"/>
+        </w:rPr>
+        <w:t>type</w:t>
       </w:r>
       <w:proofErr w:type="spellEnd"/>
       <w:r>

</xml_diff>